<commit_message>
Bab IV songkok: drop kerangka berpikir (moved to Bab II), renumber, link to framework
Co-Authored-By: Claude Opus 5.5 <noreply@anthropic.com>
Claude-Session: https://claude.ai/code/session_01Lq2itNFduhRUYgLXz2GTxG
</commit_message>
<xml_diff>
--- a/skripsi/BAB-IV-Pengumpulan-Data-Songkok.docx
+++ b/skripsi/BAB-IV-Pengumpulan-Data-Songkok.docx
@@ -54,7 +54,22 @@
           <w:b w:val="0"/>
           <w:i w:val="0"/>
         </w:rPr>
-        <w:t>. Data primer diperoleh melalui survei awal, observasi, wawancara, dan kuesioner validasi Key Performance Indicator (KPI) yang diisi oleh lima pakar internal perusahaan. Data sekunder berupa data operasional perusahaan periode Januari 2021–Desember 2025 yang terdiri atas enam dimensi data, yaitu master produk, rekap produksi dan permintaan bulanan, permintaan per produk, transaksi harian, persediaan, dan bahan baku. Data dalam bab ini disajikan sebagai data mentah. Pengolahan hasil kuesioner KPI, penetapan KPI final, kuesioner dan pengolahan Analytical Hierarchy Process (AHP), serta pengukuran kinerja diuraikan pada Bab V.</w:t>
+        <w:t>. Data primer diperoleh melalui survei awal, observasi, wawancara, dan kuesioner validasi Key Performance Indicator (KPI) yang diisi oleh lima pakar internal perusahaan. Data sekunder berupa data operasional perusahaan periode Januari 2021–Desember 2025 yang terdiri atas enam dimensi data, yaitu master produk, rekap produksi dan permintaan bulanan, permintaan per produk, transaksi harian, persediaan, dan bahan baku. Data dalam bab ini disajikan sebagai data mentah. Pengolahan hasil kuesioner KPI, penetapan KPI final, kuesioner dan pengolahan Analytical Hierarchy Process (AHP), serta pengukuran kinerja diuraikan pada Bab V. Tahapan tersebut mengikuti kerangka berpikir penelitian pada Bab II (Gambar 2.</w:t>
+      </w:r>
+      <w:r>
+        <w:rPr>
+          <w:b w:val="0"/>
+          <w:i w:val="0"/>
+          <w:highlight w:val="yellow"/>
+        </w:rPr>
+        <w:t>[…]</w:t>
+      </w:r>
+      <w:r>
+        <w:rPr>
+          <w:b w:val="0"/>
+          <w:i w:val="0"/>
+        </w:rPr>
+        <w:t>), yaitu adaptasi IPMS melalui pemetaan stakeholder, arsitektur KPI enam dimensi, pembobotan AHP, KPI properties dashboard, dan evaluasi kinerja dinamis berdasarkan siklus musiman.</w:t>
       </w:r>
     </w:p>
     <w:p>
@@ -67,111 +82,7 @@
           <w:b/>
           <w:i w:val="0"/>
         </w:rPr>
-        <w:t>4.1 Kerangka Berpikir</w:t>
-      </w:r>
-    </w:p>
-    <w:p>
-      <w:pPr>
-        <w:spacing w:line="360" w:lineRule="auto" w:after="120"/>
-        <w:ind w:firstLine="709"/>
-        <w:jc w:val="both"/>
-      </w:pPr>
-      <w:r>
-        <w:rPr>
-          <w:b w:val="0"/>
-          <w:i w:val="0"/>
-        </w:rPr>
-        <w:t>Penelitian ini mengembangkan model adaptasi Integrated Performance Measurement System (IPMS) untuk evaluasi kinerja dinamis pada UMKM songkok berbasis craft-based manufacturing. Permintaan songkok bersifat sangat musiman karena melonjak menjelang Ramadan dan Idulfitri, sedangkan proses produksinya bergantung pada keterampilan tangan pengrajin. Kondisi tersebut membutuhkan sistem pengukuran kinerja yang tidak hanya mencakup aspek keuangan, tetapi juga pasar, proses manufaktur, kualitas, kapabilitas tenaga kerja, dan kemampuan adaptasi.</w:t>
-      </w:r>
-    </w:p>
-    <w:p>
-      <w:pPr>
-        <w:spacing w:line="360" w:lineRule="auto" w:after="120"/>
-        <w:ind w:firstLine="709"/>
-        <w:jc w:val="both"/>
-      </w:pPr>
-      <w:r>
-        <w:rPr>
-          <w:b w:val="0"/>
-          <w:i w:val="0"/>
-        </w:rPr>
-        <w:t>Alur penelitian dimulai dari identifikasi kandidat KPI berdasarkan adaptasi IPMS, kemudian kandidat KPI divalidasi oleh pakar internal perusahaan melalui kuesioner KPI. KPI yang dinyatakan sesuai ditetapkan sebagai KPI final, lalu dibobot menggunakan AHP. Bobot KPI dan data operasional perusahaan selanjutnya digunakan untuk mengukur dan mengevaluasi kinerja. Kerangka berpikir penelitian disajikan pada Gambar 4.1.</w:t>
-      </w:r>
-    </w:p>
-    <w:p>
-      <w:pPr>
-        <w:spacing w:after="40"/>
-        <w:jc w:val="center"/>
-      </w:pPr>
-      <w:r>
-        <w:drawing>
-          <wp:inline xmlns:a="http://schemas.openxmlformats.org/drawingml/2006/main" xmlns:pic="http://schemas.openxmlformats.org/drawingml/2006/picture">
-            <wp:extent cx="5040000" cy="3990000"/>
-            <wp:docPr id="1" name="Picture 1"/>
-            <wp:cNvGraphicFramePr>
-              <a:graphicFrameLocks noChangeAspect="1"/>
-            </wp:cNvGraphicFramePr>
-            <a:graphic>
-              <a:graphicData uri="http://schemas.openxmlformats.org/drawingml/2006/picture">
-                <pic:pic>
-                  <pic:nvPicPr>
-                    <pic:cNvPr id="0" name="kerangka2.png"/>
-                    <pic:cNvPicPr/>
-                  </pic:nvPicPr>
-                  <pic:blipFill>
-                    <a:blip r:embed="rId9"/>
-                    <a:stretch>
-                      <a:fillRect/>
-                    </a:stretch>
-                  </pic:blipFill>
-                  <pic:spPr>
-                    <a:xfrm>
-                      <a:off x="0" y="0"/>
-                      <a:ext cx="5040000" cy="3990000"/>
-                    </a:xfrm>
-                    <a:prstGeom prst="rect"/>
-                  </pic:spPr>
-                </pic:pic>
-              </a:graphicData>
-            </a:graphic>
-          </wp:inline>
-        </w:drawing>
-      </w:r>
-    </w:p>
-    <w:p>
-      <w:pPr>
-        <w:spacing w:line="360" w:lineRule="auto" w:after="40"/>
-        <w:jc w:val="center"/>
-      </w:pPr>
-      <w:r>
-        <w:rPr>
-          <w:b/>
-          <w:i w:val="0"/>
-        </w:rPr>
-        <w:t>Gambar 4.1 Kerangka Berpikir Penelitian</w:t>
-      </w:r>
-    </w:p>
-    <w:p>
-      <w:pPr>
-        <w:spacing w:line="360" w:lineRule="auto" w:after="200"/>
-        <w:jc w:val="left"/>
-      </w:pPr>
-      <w:r>
-        <w:rPr>
-          <w:b w:val="0"/>
-          <w:i w:val="0"/>
-          <w:sz w:val="20"/>
-        </w:rPr>
-        <w:t xml:space="preserve">Sumber: Peneliti </w:t>
-      </w:r>
-      <w:r>
-        <w:rPr>
-          <w:b w:val="0"/>
-          <w:i w:val="0"/>
-          <w:sz w:val="20"/>
-          <w:highlight w:val="yellow"/>
-        </w:rPr>
-        <w:t>[sesuaikan dengan Gambar 3.1]</w:t>
+        <w:t>4.1 Gambaran Umum Perusahaan</w:t>
       </w:r>
     </w:p>
     <w:p>
@@ -184,20 +95,7 @@
           <w:b/>
           <w:i w:val="0"/>
         </w:rPr>
-        <w:t>4.2 Gambaran Umum Perusahaan</w:t>
-      </w:r>
-    </w:p>
-    <w:p>
-      <w:pPr>
-        <w:spacing w:line="360" w:lineRule="auto" w:after="120"/>
-        <w:jc w:val="left"/>
-      </w:pPr>
-      <w:r>
-        <w:rPr>
-          <w:b/>
-          <w:i w:val="0"/>
-        </w:rPr>
-        <w:t>4.2.1 Profil CV Putra Pondok Indah</w:t>
+        <w:t>4.1.1 Profil CV Putra Pondok Indah</w:t>
       </w:r>
     </w:p>
     <w:p>
@@ -232,7 +130,7 @@
           <w:b/>
           <w:i w:val="0"/>
         </w:rPr>
-        <w:t>4.2.2 Struktur Organisasi</w:t>
+        <w:t>4.1.2 Struktur Organisasi</w:t>
       </w:r>
     </w:p>
     <w:p>
@@ -246,7 +144,7 @@
           <w:b w:val="0"/>
           <w:i w:val="0"/>
         </w:rPr>
-        <w:t>Struktur organisasi CV Putra Pondok Indah disajikan pada Gambar 4.2.</w:t>
+        <w:t>Struktur organisasi CV Putra Pondok Indah disajikan pada Gambar 4.1.</w:t>
       </w:r>
     </w:p>
     <w:p>
@@ -273,7 +171,7 @@
           <w:b/>
           <w:i w:val="0"/>
         </w:rPr>
-        <w:t>Gambar 4.2 Struktur Organisasi CV Putra Pondok Indah</w:t>
+        <w:t>Gambar 4.1 Struktur Organisasi CV Putra Pondok Indah</w:t>
       </w:r>
     </w:p>
     <w:p>
@@ -300,7 +198,7 @@
           <w:b/>
           <w:i w:val="0"/>
         </w:rPr>
-        <w:t>4.2.3 Proses Produksi Songkok</w:t>
+        <w:t>4.1.3 Proses Produksi Songkok</w:t>
       </w:r>
     </w:p>
     <w:p>
@@ -314,7 +212,7 @@
           <w:b w:val="0"/>
           <w:i w:val="0"/>
         </w:rPr>
-        <w:t>Proses produksi songkok dimulai dari pemotongan kain beludru, penjahitan, pemasangan bos-bosan (lapisan dalam), pemasangan label, finishing, hingga pengemasan. Bahan baku utama terdiri atas kain beludru (yard), bos-bosan (kodi), dan label (lusin). Diagram alir proses produksi disajikan pada Gambar 4.3.</w:t>
+        <w:t>Proses produksi songkok dimulai dari pemotongan kain beludru, penjahitan, pemasangan bos-bosan (lapisan dalam), pemasangan label, finishing, hingga pengemasan. Bahan baku utama terdiri atas kain beludru (yard), bos-bosan (kodi), dan label (lusin). Diagram alir proses produksi disajikan pada Gambar 4.2.</w:t>
       </w:r>
     </w:p>
     <w:p>
@@ -341,7 +239,7 @@
           <w:b/>
           <w:i w:val="0"/>
         </w:rPr>
-        <w:t>Gambar 4.3 Diagram Alir Proses Produksi Songkok</w:t>
+        <w:t>Gambar 4.2 Diagram Alir Proses Produksi Songkok</w:t>
       </w:r>
     </w:p>
     <w:p>
@@ -368,7 +266,7 @@
           <w:b/>
           <w:i w:val="0"/>
         </w:rPr>
-        <w:t>4.3 Data Primer</w:t>
+        <w:t>4.2 Data Primer</w:t>
       </w:r>
     </w:p>
     <w:p>
@@ -1030,7 +928,7 @@
           <w:b/>
           <w:i w:val="0"/>
         </w:rPr>
-        <w:t>4.3.1 Hasil Survei Awal</w:t>
+        <w:t>4.2.1 Hasil Survei Awal</w:t>
       </w:r>
     </w:p>
     <w:p>
@@ -1472,7 +1370,7 @@
           <w:b/>
           <w:i w:val="0"/>
         </w:rPr>
-        <w:t>4.3.2 Hasil Observasi</w:t>
+        <w:t>4.2.2 Hasil Observasi</w:t>
       </w:r>
     </w:p>
     <w:p>
@@ -1841,7 +1739,7 @@
           <w:b/>
           <w:i w:val="0"/>
         </w:rPr>
-        <w:t>4.3.3 Hasil Wawancara</w:t>
+        <w:t>4.2.3 Hasil Wawancara</w:t>
       </w:r>
     </w:p>
     <w:p>
@@ -2150,7 +2048,7 @@
           <w:b/>
           <w:i w:val="0"/>
         </w:rPr>
-        <w:t>4.4 Kuesioner Validasi KPI</w:t>
+        <w:t>4.3 Kuesioner Validasi KPI</w:t>
       </w:r>
     </w:p>
     <w:p>
@@ -2163,7 +2061,7 @@
           <w:b/>
           <w:i w:val="0"/>
         </w:rPr>
-        <w:t>4.4.1 Identifikasi Kandidat KPI</w:t>
+        <w:t>4.3.1 Identifikasi Kandidat KPI</w:t>
       </w:r>
     </w:p>
     <w:p>
@@ -2177,7 +2075,7 @@
           <w:b w:val="0"/>
           <w:i w:val="0"/>
         </w:rPr>
-        <w:t>Kandidat KPI disusun dengan mengadaptasi kerangka IPMS ke dalam enam perspektif yang sesuai dengan karakteristik UMKM songkok berbasis craft-based manufacturing. Hasil identifikasi menghasilkan 20 kandidat KPI dengan kode F1–F3, C1–C3, P1–P4, Q1–Q3, H1–H4, dan A1–A3, sebagaimana disajikan pada Tabel 4.5.</w:t>
+        <w:t>Kandidat KPI disusun berdasarkan arsitektur KPI pada kerangka berpikir (Bab II), yaitu adaptasi IPMS ke dalam enam dimensi yang sesuai dengan karakteristik UMKM songkok berbasis craft-based manufacturing: keuangan, pasar dan konsumen, proses manufaktur internal, kualitas produk, SDM lokal, serta kapabilitas dinamis dan adaptabilitas. Penyusunannya mempertimbangkan kebutuhan dan tujuan stakeholder (stakeholder requirement dan stakeholder objective) yang diperoleh dari survei awal dan wawancara. Hasil identifikasi menghasilkan 20 kandidat KPI dengan kode F1–F3, C1–C3, P1–P4, Q1–Q3, H1–H4, dan A1–A3, sebagaimana disajikan pada Tabel 4.5.</w:t>
       </w:r>
     </w:p>
     <w:p>
@@ -3864,7 +3762,7 @@
           <w:b/>
           <w:i w:val="0"/>
         </w:rPr>
-        <w:t>4.4.2 Penyusunan Kuesioner KPI</w:t>
+        <w:t>4.3.2 Penyusunan Kuesioner KPI</w:t>
       </w:r>
     </w:p>
     <w:p>
@@ -4172,7 +4070,7 @@
           <w:b/>
           <w:i w:val="0"/>
         </w:rPr>
-        <w:t>4.4.3 Responden Pakar</w:t>
+        <w:t>4.3.3 Responden Pakar</w:t>
       </w:r>
     </w:p>
     <w:p>
@@ -4186,7 +4084,7 @@
           <w:b w:val="0"/>
           <w:i w:val="0"/>
         </w:rPr>
-        <w:t xml:space="preserve">Responden dipilih secara purposive, yaitu pihak internal yang memiliki pengalaman dan pemahaman terhadap operasional serta strategi perusahaan. Kuesioner diisi oleh lima pakar yang mewakili pemilik, bagian produksi, bagian gudang, bagian penjahitan, dan pengrajin senior pada </w:t>
+        <w:t xml:space="preserve">Responden dipilih secara purposive, yaitu pihak internal yang memiliki pengalaman dan pemahaman terhadap operasional serta strategi perusahaan. Sesuai dengan adaptasi IPMS pada kerangka berpikir, stakeholder dipetakan berdasarkan fungsi aktualnya dalam proses bisnis, bukan hanya jabatan formal. Kuesioner diisi oleh lima pakar yang mewakili pemilik, bagian produksi, bagian gudang, bagian penjahitan, dan pengrajin senior pada </w:t>
       </w:r>
       <w:r>
         <w:rPr>
@@ -4867,7 +4765,7 @@
           <w:b/>
           <w:i w:val="0"/>
         </w:rPr>
-        <w:t>4.4.4 Data Hasil Kuesioner KPI</w:t>
+        <w:t>4.3.4 Data Hasil Kuesioner KPI</w:t>
       </w:r>
     </w:p>
     <w:p>
@@ -11478,7 +11376,7 @@
           <w:b/>
           <w:i w:val="0"/>
         </w:rPr>
-        <w:t>4.5 Data Sekunder: Data Operasional Perusahaan</w:t>
+        <w:t>4.4 Data Sekunder: Data Operasional Perusahaan</w:t>
       </w:r>
     </w:p>
     <w:p>
@@ -12251,7 +12149,7 @@
           <w:b/>
           <w:i w:val="0"/>
         </w:rPr>
-        <w:t>4.5.1 Data Master Produk</w:t>
+        <w:t>4.4.1 Data Master Produk</w:t>
       </w:r>
     </w:p>
     <w:p>
@@ -15283,7 +15181,7 @@
           <w:b/>
           <w:i w:val="0"/>
         </w:rPr>
-        <w:t>4.5.2 Data Produksi dan Permintaan Bulanan</w:t>
+        <w:t>4.4.2 Data Produksi dan Permintaan Bulanan</w:t>
       </w:r>
     </w:p>
     <w:p>
@@ -18787,7 +18685,7 @@
           <w:b w:val="0"/>
           <w:i w:val="0"/>
         </w:rPr>
-        <w:t>Selama lima tahun, total produksi mencapai 47.595 kodi dan total permintaan 47.928 kodi. Permintaan tahunan meningkat dari 8.703 kodi pada 2021 menjadi 10.300 kodi pada 2025. Perbandingan produksi dan permintaan bulanan ditunjukkan pada Gambar 4.4.</w:t>
+        <w:t>Selama lima tahun, total produksi mencapai 47.595 kodi dan total permintaan 47.928 kodi. Permintaan tahunan meningkat dari 8.703 kodi pada 2021 menjadi 10.300 kodi pada 2025. Perbandingan produksi dan permintaan bulanan ditunjukkan pada Gambar 4.3. Pola ini menjadi dasar pengelompokan periode ke dalam siklus musiman pra-puncak, puncak, dan pasca-puncak pada evaluasi kinerja dinamis di Bab V.</w:t>
       </w:r>
     </w:p>
     <w:p>
@@ -18799,7 +18697,7 @@
         <w:drawing>
           <wp:inline xmlns:a="http://schemas.openxmlformats.org/drawingml/2006/main" xmlns:pic="http://schemas.openxmlformats.org/drawingml/2006/picture">
             <wp:extent cx="5400000" cy="2475000"/>
-            <wp:docPr id="2" name="Picture 2"/>
+            <wp:docPr id="1" name="Picture 1"/>
             <wp:cNvGraphicFramePr>
               <a:graphicFrameLocks noChangeAspect="1"/>
             </wp:cNvGraphicFramePr>
@@ -18811,7 +18709,7 @@
                     <pic:cNvPicPr/>
                   </pic:nvPicPr>
                   <pic:blipFill>
-                    <a:blip r:embed="rId10"/>
+                    <a:blip r:embed="rId9"/>
                     <a:stretch>
                       <a:fillRect/>
                     </a:stretch>
@@ -18840,7 +18738,7 @@
           <w:b/>
           <w:i w:val="0"/>
         </w:rPr>
-        <w:t>Gambar 4.4 Grafik Produksi dan Permintaan Bulanan 2021–2025</w:t>
+        <w:t>Gambar 4.3 Grafik Produksi dan Permintaan Bulanan 2021–2025</w:t>
       </w:r>
     </w:p>
     <w:p>
@@ -18867,7 +18765,7 @@
           <w:b/>
           <w:i w:val="0"/>
         </w:rPr>
-        <w:t>4.5.3 Data Permintaan per Produk</w:t>
+        <w:t>4.4.3 Data Permintaan per Produk</w:t>
       </w:r>
     </w:p>
     <w:p>
@@ -22634,7 +22532,7 @@
           <w:b/>
           <w:i w:val="0"/>
         </w:rPr>
-        <w:t>4.5.4 Data Transaksi Harian</w:t>
+        <w:t>4.4.4 Data Transaksi Harian</w:t>
       </w:r>
     </w:p>
     <w:p>
@@ -23605,7 +23503,7 @@
           <w:b/>
           <w:i w:val="0"/>
         </w:rPr>
-        <w:t>4.5.5 Data Persediaan</w:t>
+        <w:t>4.4.5 Data Persediaan</w:t>
       </w:r>
     </w:p>
     <w:p>
@@ -24310,7 +24208,7 @@
           <w:b/>
           <w:i w:val="0"/>
         </w:rPr>
-        <w:t>4.5.6 Data Bahan Baku</w:t>
+        <w:t>4.4.6 Data Bahan Baku</w:t>
       </w:r>
     </w:p>
     <w:p>
@@ -26354,7 +26252,7 @@
           <w:b/>
           <w:i w:val="0"/>
         </w:rPr>
-        <w:t>4.6 Parameter Pendukung</w:t>
+        <w:t>4.5 Parameter Pendukung</w:t>
       </w:r>
     </w:p>
     <w:p>
@@ -26840,7 +26738,7 @@
           <w:b/>
           <w:i w:val="0"/>
         </w:rPr>
-        <w:t>4.7 Rekapitulasi Data yang Diperoleh</w:t>
+        <w:t>4.6 Rekapitulasi Data yang Diperoleh</w:t>
       </w:r>
     </w:p>
     <w:p>
@@ -27038,7 +26936,7 @@
                 <w:i w:val="0"/>
                 <w:sz w:val="20"/>
               </w:rPr>
-              <w:t>Dasar penetapan dan pembahasan KPI</w:t>
+              <w:t>Stakeholder requirement dan objective; pembahasan KPI</w:t>
             </w:r>
           </w:p>
         </w:tc>
@@ -27116,7 +27014,7 @@
                 <w:i w:val="0"/>
                 <w:sz w:val="20"/>
               </w:rPr>
-              <w:t>Penetapan KPI final</w:t>
+              <w:t>Penetapan KPI final dan penyusunan kuesioner AHP</w:t>
             </w:r>
           </w:p>
         </w:tc>
@@ -27194,7 +27092,7 @@
                 <w:i w:val="0"/>
                 <w:sz w:val="20"/>
               </w:rPr>
-              <w:t>Perhitungan nilai KPI pasar, proses, dan adaptabilitas (mis. C1, A1, A3)</w:t>
+              <w:t>Nilai KPI (mis. C1, A1, A3), siklus musiman, KPI properties dashboard</w:t>
             </w:r>
           </w:p>
         </w:tc>

</xml_diff>

<commit_message>
Bab IV songkok: add explanations with literature citations
Co-Authored-By: Claude Opus 5.5 <noreply@anthropic.com>
Claude-Session: https://claude.ai/code/session_01Lq2itNFduhRUYgLXz2GTxG
</commit_message>
<xml_diff>
--- a/skripsi/BAB-IV-Pengumpulan-Data-Songkok.docx
+++ b/skripsi/BAB-IV-Pengumpulan-Data-Songkok.docx
@@ -54,7 +54,7 @@
           <w:b w:val="0"/>
           <w:i w:val="0"/>
         </w:rPr>
-        <w:t>. Data primer diperoleh melalui survei awal, observasi, wawancara, dan kuesioner validasi Key Performance Indicator (KPI) yang diisi oleh lima pakar internal perusahaan. Data sekunder berupa data operasional perusahaan periode Januari 2021–Desember 2025 yang terdiri atas enam dimensi data, yaitu master produk, rekap produksi dan permintaan bulanan, permintaan per produk, transaksi harian, persediaan, dan bahan baku. Data dalam bab ini disajikan sebagai data mentah. Pengolahan hasil kuesioner KPI, penetapan KPI final, kuesioner dan pengolahan Analytical Hierarchy Process (AHP), serta pengukuran kinerja diuraikan pada Bab V. Tahapan tersebut mengikuti kerangka berpikir penelitian pada Bab II (Gambar 2.</w:t>
+        <w:t>. Data primer adalah data yang diperoleh langsung dari sumbernya oleh peneliti, sedangkan data sekunder adalah data yang diperoleh secara tidak langsung, misalnya melalui dokumen (Sugiyono, 2019). Data primer diperoleh melalui survei awal, observasi, wawancara, dan kuesioner validasi Key Performance Indicator (KPI) yang diisi oleh lima pakar internal perusahaan. Data sekunder berupa data operasional perusahaan periode Januari 2021–Desember 2025 yang terdiri atas enam dimensi data, yaitu master produk, rekap produksi dan permintaan bulanan, permintaan per produk, transaksi harian, persediaan, dan bahan baku. Data dalam bab ini disajikan sebagai data mentah. Pengolahan hasil kuesioner KPI, penetapan KPI final, kuesioner dan pengolahan Analytical Hierarchy Process (AHP), serta pengukuran kinerja diuraikan pada Bab V. Tahapan tersebut mengikuti kerangka berpikir penelitian pada Bab II (Gambar 2.</w:t>
       </w:r>
       <w:r>
         <w:rPr>
@@ -280,7 +280,7 @@
           <w:b w:val="0"/>
           <w:i w:val="0"/>
         </w:rPr>
-        <w:t>Ringkasan teknik pengumpulan data disajikan pada Tabel 4.1.</w:t>
+        <w:t>Teknik pengumpulan data yang digunakan adalah observasi, wawancara, kuesioner, dan dokumentasi. Penggunaan beberapa teknik sekaligus terhadap sumber yang sama dimaksudkan untuk saling melengkapi dan menguji kredibilitas data (Sugiyono, 2019). Ringkasan teknik pengumpulan data disajikan pada Tabel 4.1.</w:t>
       </w:r>
     </w:p>
     <w:p>
@@ -942,7 +942,7 @@
           <w:b w:val="0"/>
           <w:i w:val="0"/>
         </w:rPr>
-        <w:t>Survei awal dilakukan untuk mengidentifikasi permasalahan perusahaan sebelum instrumen penelitian disusun. Temuan survei awal disajikan pada Tabel 4.2.</w:t>
+        <w:t>Survei awal dilakukan untuk mengidentifikasi permasalahan perusahaan sebelum instrumen penelitian disusun. Hasilnya dipadukan dengan data operasional 2021–2025 sehingga permasalahan tidak hanya didasarkan pada keterangan lisan. Temuan survei awal disajikan pada Tabel 4.2.</w:t>
       </w:r>
     </w:p>
     <w:p>
@@ -1363,6 +1363,20 @@
     <w:p>
       <w:pPr>
         <w:spacing w:line="360" w:lineRule="auto" w:after="120"/>
+        <w:ind w:firstLine="709"/>
+        <w:jc w:val="both"/>
+      </w:pPr>
+      <w:r>
+        <w:rPr>
+          <w:b w:val="0"/>
+          <w:i w:val="0"/>
+        </w:rPr>
+        <w:t>Temuan pertama dan kedua menunjukkan pola musiman, yaitu pola permintaan yang berulang pada periode tertentu setiap tahun (Hyndman &amp; Athanasopoulos, 2021). Ketika kapasitas produksi tidak disesuaikan dengan pola tersebut, perusahaan menghadapi kekurangan barang pada musim puncak dan kelebihan persediaan di luar musim puncak (Heizer, Render, &amp; Munson, 2020). Temuan keempat sejalan dengan karakteristik UMKM yang umumnya belum memiliki sistem pengukuran kinerja formal karena struktur organisasi yang informal dan keterbatasan sumber daya (Garengo, Biazzo, &amp; Bititci, 2005).</w:t>
+      </w:r>
+    </w:p>
+    <w:p>
+      <w:pPr>
+        <w:spacing w:line="360" w:lineRule="auto" w:after="120"/>
         <w:jc w:val="left"/>
       </w:pPr>
       <w:r>
@@ -1384,7 +1398,7 @@
           <w:b w:val="0"/>
           <w:i w:val="0"/>
         </w:rPr>
-        <w:t>Observasi dilakukan langsung di area produksi dan gudang untuk mengamati proses produksi, pencatatan persediaan, dan alur pemenuhan pesanan. Hasilnya disajikan pada Tabel 4.3.</w:t>
+        <w:t>Observasi adalah teknik pengumpulan data dengan mengamati langsung objek penelitian untuk memperoleh gambaran nyata mengenai proses kerja (Sugiyono, 2019). Observasi dilakukan langsung di area produksi dan gudang untuk mengamati proses produksi, pencatatan persediaan, dan alur pemenuhan pesanan. Hasilnya disajikan pada Tabel 4.3.</w:t>
       </w:r>
     </w:p>
     <w:p>
@@ -1753,7 +1767,7 @@
           <w:b w:val="0"/>
           <w:i w:val="0"/>
         </w:rPr>
-        <w:t>Wawancara dilakukan untuk memperoleh informasi mengenai kondisi operasional, kebijakan produksi, dan cara perusahaan menilai kinerjanya. Informan dan pokok hasil wawancara disajikan pada Tabel 4.4.</w:t>
+        <w:t>Wawancara digunakan untuk menggali informasi yang lebih mendalam dari informan. Wawancara dilakukan secara semi-terstruktur, yaitu menggunakan pedoman pertanyaan tetapi tetap memberi keleluasaan kepada informan untuk mengemukakan pendapatnya (Sugiyono, 2019). Wawancara dilakukan untuk memperoleh informasi mengenai kondisi operasional, kebijakan produksi, dan cara perusahaan menilai kinerjanya. Informan dan pokok hasil wawancara disajikan pada Tabel 4.4.</w:t>
       </w:r>
     </w:p>
     <w:p>
@@ -2075,6 +2089,34 @@
           <w:b w:val="0"/>
           <w:i w:val="0"/>
         </w:rPr>
+        <w:t>Sistem pengukuran kinerja adalah sekumpulan ukuran yang digunakan untuk mengukur efisiensi dan efektivitas tindakan dalam organisasi (Neely, Gregory, &amp; Platts, 1995). Key Performance Indicator (KPI) merupakan ukuran yang berfokus pada aspek kinerja yang paling menentukan keberhasilan organisasi saat ini dan pada masa mendatang (Parmenter, 2015). Penelitian ini menggunakan Integrated Performance Measurement System (IPMS) sebagai dasar penyusunan KPI. IPMS dirancang agar ukuran kinerja terintegrasi pada setiap tingkat organisasi dan diturunkan dari kebutuhan stakeholder (stakeholder requirement), sehingga ukuran kinerja selaras dengan tujuan perusahaan (Bititci, Carrie, &amp; McDevitt, 1997; Suwignjo, Bititci, &amp; Carrie, 2000).</w:t>
+      </w:r>
+    </w:p>
+    <w:p>
+      <w:pPr>
+        <w:spacing w:line="360" w:lineRule="auto" w:after="120"/>
+        <w:ind w:firstLine="709"/>
+        <w:jc w:val="both"/>
+      </w:pPr>
+      <w:r>
+        <w:rPr>
+          <w:b w:val="0"/>
+          <w:i w:val="0"/>
+        </w:rPr>
+        <w:t>IPMS diadaptasi agar sesuai dengan karakteristik UMKM songkok berbasis craft-based manufacturing, yaitu struktur informal, pengambilan keputusan yang berpusat pada pemilik, ketergantungan pada keterampilan tangan pengrajin, dan keterbatasan data (Garengo et al., 2005). Dimensi kapabilitas dinamis dan adaptabilitas ditambahkan karena perusahaan harus menyesuaikan sumber dayanya dengan perubahan lingkungan, dalam hal ini lonjakan permintaan musiman (Teece, Pisano, &amp; Shuen, 1997).</w:t>
+      </w:r>
+    </w:p>
+    <w:p>
+      <w:pPr>
+        <w:spacing w:line="360" w:lineRule="auto" w:after="120"/>
+        <w:ind w:firstLine="709"/>
+        <w:jc w:val="both"/>
+      </w:pPr>
+      <w:r>
+        <w:rPr>
+          <w:b w:val="0"/>
+          <w:i w:val="0"/>
+        </w:rPr>
         <w:t>Kandidat KPI disusun berdasarkan arsitektur KPI pada kerangka berpikir (Bab II), yaitu adaptasi IPMS ke dalam enam dimensi yang sesuai dengan karakteristik UMKM songkok berbasis craft-based manufacturing: keuangan, pasar dan konsumen, proses manufaktur internal, kualitas produk, SDM lokal, serta kapabilitas dinamis dan adaptabilitas. Penyusunannya mempertimbangkan kebutuhan dan tujuan stakeholder (stakeholder requirement dan stakeholder objective) yang diperoleh dari survei awal dan wawancara. Hasil identifikasi menghasilkan 20 kandidat KPI dengan kode F1–F3, C1–C3, P1–P4, Q1–Q3, H1–H4, dan A1–A3, sebagaimana disajikan pada Tabel 4.5.</w:t>
       </w:r>
     </w:p>
@@ -3711,16 +3753,7 @@
           <w:i w:val="0"/>
           <w:sz w:val="20"/>
         </w:rPr>
-        <w:t xml:space="preserve">Sumber: Adaptasi IPMS, dikembangkan peneliti </w:t>
-      </w:r>
-      <w:r>
-        <w:rPr>
-          <w:b w:val="0"/>
-          <w:i w:val="0"/>
-          <w:sz w:val="20"/>
-          <w:highlight w:val="yellow"/>
-        </w:rPr>
-        <w:t>[cantumkan rujukan Bab II]</w:t>
+        <w:t>Sumber: Adaptasi dari Bititci et al. (1997) dan Parmenter (2015), dikembangkan peneliti</w:t>
       </w:r>
     </w:p>
     <w:p>
@@ -3776,7 +3809,7 @@
           <w:b w:val="0"/>
           <w:i w:val="0"/>
         </w:rPr>
-        <w:t>Kuesioner KPI berfungsi untuk memvalidasi dan memfinalisasi kandidat KPI berdasarkan penilaian pakar (expert judgement). Kuesioner terdiri atas tiga bagian, yaitu (A) identitas pakar, meliputi kategori pakar, jenis kelamin, umur, jabatan, dan pengalaman kerja; (B) petunjuk pengisian; serta (C) penilaian 20 kandidat KPI yang dikelompokkan ke dalam enam perspektif. Setiap KPI dilengkapi deskripsi operasional dan formula pengukuran sebagai bahan pertimbangan pakar dalam menilai keterukuran KPI dan ketersediaan datanya di perusahaan. Penilaian menggunakan skala kesesuaian lima poin pada Tabel 4.6.</w:t>
+        <w:t>Kuesioner KPI berfungsi untuk memvalidasi dan memfinalisasi kandidat KPI berdasarkan penilaian pakar (expert judgement). Kuesioner terdiri atas tiga bagian, yaitu (A) identitas pakar, meliputi kategori pakar, jenis kelamin, umur, jabatan, dan pengalaman kerja; (B) petunjuk pengisian; serta (C) penilaian 20 kandidat KPI yang dikelompokkan ke dalam enam perspektif. Setiap KPI dilengkapi deskripsi operasional dan formula pengukuran sebagai bahan pertimbangan pakar dalam menilai keterukuran KPI dan ketersediaan datanya di perusahaan. Validasi oleh pakar digunakan karena pakar dinilai mampu menentukan apakah suatu butir benar-benar relevan dengan konsep yang diukur (Lawshe, 1975). Penilaian menggunakan skala Likert lima poin (Likert, 1932) yang disesuaikan menjadi skala kesesuaian, sebagaimana disajikan pada Tabel 4.6.</w:t>
       </w:r>
     </w:p>
     <w:p>
@@ -4084,7 +4117,7 @@
           <w:b w:val="0"/>
           <w:i w:val="0"/>
         </w:rPr>
-        <w:t xml:space="preserve">Responden dipilih secara purposive, yaitu pihak internal yang memiliki pengalaman dan pemahaman terhadap operasional serta strategi perusahaan. Sesuai dengan adaptasi IPMS pada kerangka berpikir, stakeholder dipetakan berdasarkan fungsi aktualnya dalam proses bisnis, bukan hanya jabatan formal. Kuesioner diisi oleh lima pakar yang mewakili pemilik, bagian produksi, bagian gudang, bagian penjahitan, dan pengrajin senior pada </w:t>
+        <w:t xml:space="preserve">Responden dipilih dengan teknik purposive sampling, yaitu penentuan sumber data dengan pertimbangan tertentu (Sugiyono, 2019). Pertimbangan yang digunakan adalah pihak internal yang memiliki pengalaman dan pemahaman terhadap operasional serta strategi perusahaan. Sesuai dengan adaptasi IPMS pada kerangka berpikir, stakeholder dipetakan berdasarkan fungsi aktualnya dalam proses bisnis, bukan hanya jabatan formal, karena IPMS menurunkan ukuran kinerja dari kebutuhan setiap stakeholder (Bititci et al., 1997). Kuesioner diisi oleh lima pakar yang mewakili pemilik, bagian produksi, bagian gudang, bagian penjahitan, dan pengrajin senior pada </w:t>
       </w:r>
       <w:r>
         <w:rPr>
@@ -11363,7 +11396,7 @@
           <w:b w:val="0"/>
           <w:i w:val="0"/>
         </w:rPr>
-        <w:t>Dari 100 penilaian (20 KPI × 5 pakar), sebanyak 68 penilaian bernilai 5 (Sangat Sesuai) dan 32 penilaian bernilai 4 (Sesuai); tidak ada KPI yang dinilai 1–3. Pengolahan data ini untuk menetapkan KPI final diuraikan pada Bab V.</w:t>
+        <w:t>Dari 100 penilaian (20 KPI × 5 pakar), sebanyak 68 penilaian bernilai 5 (Sangat Sesuai) dan 32 penilaian bernilai 4 (Sesuai); tidak ada KPI yang dinilai 1–3. Pengolahan data ini untuk menetapkan KPI final diuraikan pada Bab V. KPI final selanjutnya disusun dalam struktur hierarki untuk dibobot dengan Analytical Hierarchy Process (AHP), yaitu metode pengambilan keputusan melalui perbandingan berpasangan antarkriteria (Saaty, 1980, 2008).</w:t>
       </w:r>
     </w:p>
     <w:p>
@@ -11390,7 +11423,7 @@
           <w:b w:val="0"/>
           <w:i w:val="0"/>
         </w:rPr>
-        <w:t xml:space="preserve">Data sekunder diperoleh dari catatan produksi, penjualan, persediaan, dan pembelian bahan baku CV Putra Pondok Indah periode Januari 2021–Desember 2025 (60 bulan). Data dihimpun ke dalam enam dimensi dengan total 40.704 baris, sebagaimana diringkas pada Tabel 4.10. </w:t>
+        <w:t xml:space="preserve">Data sekunder diperoleh dari catatan produksi, penjualan, persediaan, dan pembelian bahan baku CV Putra Pondok Indah periode Januari 2021–Desember 2025 (60 bulan). Data operasional ini merupakan data runtun waktu (time series), yaitu data yang dicatat secara berurutan pada interval waktu yang tetap (Hyndman &amp; Athanasopoulos, 2021). Data dihimpun ke dalam enam dimensi dengan total 40.704 baris, sebagaimana diringkas pada Tabel 4.10. </w:t>
       </w:r>
       <w:r>
         <w:rPr>
@@ -23517,7 +23550,7 @@
           <w:b w:val="0"/>
           <w:i w:val="0"/>
         </w:rPr>
-        <w:t xml:space="preserve">Data persediaan mencatat stok awal, penerimaan dari produksi, barang keluar, dan stok akhir setiap produk per bulan (1.440 baris). Rekap tahunan seluruh produk disajikan pada Tabel 4.17, sedangkan data lengkap per produk dicantumkan pada </w:t>
+        <w:t xml:space="preserve">Persediaan adalah barang yang disimpan untuk memenuhi permintaan pada masa mendatang, termasuk bahan baku, barang dalam proses, dan barang jadi (Heizer et al., 2020). Data persediaan mencatat stok awal, penerimaan dari produksi, barang keluar, dan stok akhir setiap produk per bulan (1.440 baris). Rekap tahunan seluruh produk disajikan pada Tabel 4.17, sedangkan data lengkap per produk dicantumkan pada </w:t>
       </w:r>
       <w:r>
         <w:rPr>
@@ -24195,7 +24228,7 @@
           <w:i w:val="0"/>
           <w:highlight w:val="yellow"/>
         </w:rPr>
-        <w:t>[Catatan: terdapat 109 catatan stok akhir bernilai negatif, terutama pada musim puncak. Jelaskan apakah nilai negatif ini berarti pesanan tertunda (backorder) atau permintaan yang tidak terpenuhi (lost sales).]</w:t>
+        <w:t>[Catatan: terdapat 109 catatan stok akhir bernilai negatif, terutama pada musim puncak. Jelaskan apakah nilai negatif ini berarti pesanan tertunda (backorder) atau permintaan yang tidak terpenuhi (lost sales); kedua kondisi tersebut diperlakukan berbeda dalam pengendalian persediaan (Silver, Pyke, &amp; Thomas, 2017).]</w:t>
       </w:r>
     </w:p>
     <w:p>
@@ -24222,7 +24255,7 @@
           <w:b w:val="0"/>
           <w:i w:val="0"/>
         </w:rPr>
-        <w:t>Bahan baku utama songkok terdiri atas kain beludru, bos-bosan, dan label. Data pembelian dan pemakaian bahan baku per tahun disajikan pada Tabel 4.18, sedangkan data pemasok disajikan pada Tabel 4.19.</w:t>
+        <w:t>Bahan baku utama songkok terdiri atas kain beludru, bos-bosan, dan label. Data pembelian dan pemakaian bahan baku per tahun disajikan pada Tabel 4.18, sedangkan data pemasok disajikan pada Tabel 4.19. Lead time pemasok, yaitu waktu antara pemesanan dan penerimaan bahan, dicatat karena memengaruhi kapan perusahaan harus memesan kembali bahan baku (Heizer et al., 2020).</w:t>
       </w:r>
     </w:p>
     <w:p>
@@ -26266,7 +26299,7 @@
           <w:b w:val="0"/>
           <w:i w:val="0"/>
         </w:rPr>
-        <w:t>Parameter yang digunakan dalam pengolahan data disajikan pada Tabel 4.20.</w:t>
+        <w:t>Parameter pendukung adalah nilai tetap yang diperlukan untuk menghitung KPI, misalnya kapasitas normal dan maksimum untuk KPI fleksibilitas kapasitas (P3 dan A3) serta jumlah tenaga kerja untuk KPI produktivitas (P1 dan H3). Parameter yang digunakan dalam pengolahan data disajikan pada Tabel 4.20.</w:t>
       </w:r>
     </w:p>
     <w:p>
@@ -27358,6 +27391,425 @@
           <w:i w:val="0"/>
         </w:rPr>
         <w:t>Data hasil kuesioner KPI selanjutnya diolah pada Bab V untuk menetapkan KPI final. KPI final tersebut menjadi dasar penyusunan kuesioner AHP untuk memperoleh bobot setiap KPI, kemudian bobot dan data operasional pada bab ini digunakan untuk mengukur dan mengevaluasi kinerja CV Putra Pondok Indah.</w:t>
+      </w:r>
+    </w:p>
+    <w:p>
+      <w:pPr>
+        <w:spacing w:line="360" w:lineRule="auto" w:after="120"/>
+        <w:jc w:val="left"/>
+      </w:pPr>
+      <w:r>
+        <w:rPr>
+          <w:b/>
+          <w:i w:val="0"/>
+        </w:rPr>
+        <w:t>Rujukan yang Dikutip dalam Bab IV</w:t>
+      </w:r>
+    </w:p>
+    <w:p>
+      <w:pPr>
+        <w:spacing w:line="360" w:lineRule="auto" w:after="120"/>
+        <w:jc w:val="both"/>
+      </w:pPr>
+      <w:r>
+        <w:rPr>
+          <w:b w:val="0"/>
+          <w:i w:val="0"/>
+          <w:highlight w:val="yellow"/>
+        </w:rPr>
+        <w:t>[Pindahkan daftar ini ke Daftar Pustaka skripsi dan sesuaikan edisi/tahun dengan buku yang Anda miliki.]</w:t>
+      </w:r>
+    </w:p>
+    <w:p>
+      <w:pPr>
+        <w:spacing w:line="360" w:lineRule="auto" w:after="120"/>
+        <w:ind w:left="709" w:hanging="709"/>
+        <w:jc w:val="left"/>
+      </w:pPr>
+      <w:r>
+        <w:rPr>
+          <w:b w:val="0"/>
+          <w:i w:val="0"/>
+        </w:rPr>
+        <w:t xml:space="preserve">Bititci, U. S., Carrie, A. S., &amp; McDevitt, L. (1997). Integrated performance measurement systems: A development guide. </w:t>
+      </w:r>
+      <w:r>
+        <w:rPr>
+          <w:b w:val="0"/>
+          <w:i/>
+        </w:rPr>
+        <w:t>International Journal of Operations &amp; Production Management, 17</w:t>
+      </w:r>
+      <w:r>
+        <w:rPr>
+          <w:b w:val="0"/>
+          <w:i w:val="0"/>
+        </w:rPr>
+        <w:t>(5), 522–534.</w:t>
+      </w:r>
+    </w:p>
+    <w:p>
+      <w:pPr>
+        <w:spacing w:line="360" w:lineRule="auto" w:after="120"/>
+        <w:ind w:left="709" w:hanging="709"/>
+        <w:jc w:val="left"/>
+      </w:pPr>
+      <w:r>
+        <w:rPr>
+          <w:b w:val="0"/>
+          <w:i w:val="0"/>
+        </w:rPr>
+        <w:t xml:space="preserve">Garengo, P., Biazzo, S., &amp; Bititci, U. S. (2005). Performance measurement systems in SMEs: A review for a research agenda. </w:t>
+      </w:r>
+      <w:r>
+        <w:rPr>
+          <w:b w:val="0"/>
+          <w:i/>
+        </w:rPr>
+        <w:t>International Journal of Management Reviews, 7</w:t>
+      </w:r>
+      <w:r>
+        <w:rPr>
+          <w:b w:val="0"/>
+          <w:i w:val="0"/>
+        </w:rPr>
+        <w:t>(1), 25–47.</w:t>
+      </w:r>
+    </w:p>
+    <w:p>
+      <w:pPr>
+        <w:spacing w:line="360" w:lineRule="auto" w:after="120"/>
+        <w:ind w:left="709" w:hanging="709"/>
+        <w:jc w:val="left"/>
+      </w:pPr>
+      <w:r>
+        <w:rPr>
+          <w:b w:val="0"/>
+          <w:i w:val="0"/>
+        </w:rPr>
+        <w:t xml:space="preserve">Heizer, J., Render, B., &amp; Munson, C. (2020). </w:t>
+      </w:r>
+      <w:r>
+        <w:rPr>
+          <w:b w:val="0"/>
+          <w:i/>
+        </w:rPr>
+        <w:t>Operations management: Sustainability and supply chain management</w:t>
+      </w:r>
+      <w:r>
+        <w:rPr>
+          <w:b w:val="0"/>
+          <w:i w:val="0"/>
+        </w:rPr>
+        <w:t xml:space="preserve"> (13th ed.). Pearson.</w:t>
+      </w:r>
+    </w:p>
+    <w:p>
+      <w:pPr>
+        <w:spacing w:line="360" w:lineRule="auto" w:after="120"/>
+        <w:ind w:left="709" w:hanging="709"/>
+        <w:jc w:val="left"/>
+      </w:pPr>
+      <w:r>
+        <w:rPr>
+          <w:b w:val="0"/>
+          <w:i w:val="0"/>
+        </w:rPr>
+        <w:t xml:space="preserve">Hyndman, R. J., &amp; Athanasopoulos, G. (2021). </w:t>
+      </w:r>
+      <w:r>
+        <w:rPr>
+          <w:b w:val="0"/>
+          <w:i/>
+        </w:rPr>
+        <w:t>Forecasting: Principles and practice</w:t>
+      </w:r>
+      <w:r>
+        <w:rPr>
+          <w:b w:val="0"/>
+          <w:i w:val="0"/>
+        </w:rPr>
+        <w:t xml:space="preserve"> (3rd ed.). OTexts.</w:t>
+      </w:r>
+    </w:p>
+    <w:p>
+      <w:pPr>
+        <w:spacing w:line="360" w:lineRule="auto" w:after="120"/>
+        <w:ind w:left="709" w:hanging="709"/>
+        <w:jc w:val="left"/>
+      </w:pPr>
+      <w:r>
+        <w:rPr>
+          <w:b w:val="0"/>
+          <w:i w:val="0"/>
+        </w:rPr>
+        <w:t xml:space="preserve">Lawshe, C. H. (1975). A quantitative approach to content validity. </w:t>
+      </w:r>
+      <w:r>
+        <w:rPr>
+          <w:b w:val="0"/>
+          <w:i/>
+        </w:rPr>
+        <w:t>Personnel Psychology, 28</w:t>
+      </w:r>
+      <w:r>
+        <w:rPr>
+          <w:b w:val="0"/>
+          <w:i w:val="0"/>
+        </w:rPr>
+        <w:t>(4), 563–575.</w:t>
+      </w:r>
+    </w:p>
+    <w:p>
+      <w:pPr>
+        <w:spacing w:line="360" w:lineRule="auto" w:after="120"/>
+        <w:ind w:left="709" w:hanging="709"/>
+        <w:jc w:val="left"/>
+      </w:pPr>
+      <w:r>
+        <w:rPr>
+          <w:b w:val="0"/>
+          <w:i w:val="0"/>
+        </w:rPr>
+        <w:t xml:space="preserve">Likert, R. (1932). A technique for the measurement of attitudes. </w:t>
+      </w:r>
+      <w:r>
+        <w:rPr>
+          <w:b w:val="0"/>
+          <w:i/>
+        </w:rPr>
+        <w:t>Archives of Psychology, 22</w:t>
+      </w:r>
+      <w:r>
+        <w:rPr>
+          <w:b w:val="0"/>
+          <w:i w:val="0"/>
+        </w:rPr>
+        <w:t>(140), 1–55.</w:t>
+      </w:r>
+    </w:p>
+    <w:p>
+      <w:pPr>
+        <w:spacing w:line="360" w:lineRule="auto" w:after="120"/>
+        <w:ind w:left="709" w:hanging="709"/>
+        <w:jc w:val="left"/>
+      </w:pPr>
+      <w:r>
+        <w:rPr>
+          <w:b w:val="0"/>
+          <w:i w:val="0"/>
+        </w:rPr>
+        <w:t xml:space="preserve">Neely, A., Gregory, M., &amp; Platts, K. (1995). Performance measurement system design: A literature review and research agenda. </w:t>
+      </w:r>
+      <w:r>
+        <w:rPr>
+          <w:b w:val="0"/>
+          <w:i/>
+        </w:rPr>
+        <w:t>International Journal of Operations &amp; Production Management, 15</w:t>
+      </w:r>
+      <w:r>
+        <w:rPr>
+          <w:b w:val="0"/>
+          <w:i w:val="0"/>
+        </w:rPr>
+        <w:t>(4), 80–116.</w:t>
+      </w:r>
+    </w:p>
+    <w:p>
+      <w:pPr>
+        <w:spacing w:line="360" w:lineRule="auto" w:after="120"/>
+        <w:ind w:left="709" w:hanging="709"/>
+        <w:jc w:val="left"/>
+      </w:pPr>
+      <w:r>
+        <w:rPr>
+          <w:b w:val="0"/>
+          <w:i w:val="0"/>
+        </w:rPr>
+        <w:t xml:space="preserve">Parmenter, D. (2015). </w:t>
+      </w:r>
+      <w:r>
+        <w:rPr>
+          <w:b w:val="0"/>
+          <w:i/>
+        </w:rPr>
+        <w:t>Key performance indicators: Developing, implementing, and using winning KPIs</w:t>
+      </w:r>
+      <w:r>
+        <w:rPr>
+          <w:b w:val="0"/>
+          <w:i w:val="0"/>
+        </w:rPr>
+        <w:t xml:space="preserve"> (3rd ed.). Wiley.</w:t>
+      </w:r>
+    </w:p>
+    <w:p>
+      <w:pPr>
+        <w:spacing w:line="360" w:lineRule="auto" w:after="120"/>
+        <w:ind w:left="709" w:hanging="709"/>
+        <w:jc w:val="left"/>
+      </w:pPr>
+      <w:r>
+        <w:rPr>
+          <w:b w:val="0"/>
+          <w:i w:val="0"/>
+        </w:rPr>
+        <w:t xml:space="preserve">Saaty, T. L. (1980). </w:t>
+      </w:r>
+      <w:r>
+        <w:rPr>
+          <w:b w:val="0"/>
+          <w:i/>
+        </w:rPr>
+        <w:t>The analytic hierarchy process</w:t>
+      </w:r>
+      <w:r>
+        <w:rPr>
+          <w:b w:val="0"/>
+          <w:i w:val="0"/>
+        </w:rPr>
+        <w:t>. McGraw-Hill.</w:t>
+      </w:r>
+    </w:p>
+    <w:p>
+      <w:pPr>
+        <w:spacing w:line="360" w:lineRule="auto" w:after="120"/>
+        <w:ind w:left="709" w:hanging="709"/>
+        <w:jc w:val="left"/>
+      </w:pPr>
+      <w:r>
+        <w:rPr>
+          <w:b w:val="0"/>
+          <w:i w:val="0"/>
+        </w:rPr>
+        <w:t xml:space="preserve">Saaty, T. L. (2008). Decision making with the analytic hierarchy process. </w:t>
+      </w:r>
+      <w:r>
+        <w:rPr>
+          <w:b w:val="0"/>
+          <w:i/>
+        </w:rPr>
+        <w:t>International Journal of Services Sciences, 1</w:t>
+      </w:r>
+      <w:r>
+        <w:rPr>
+          <w:b w:val="0"/>
+          <w:i w:val="0"/>
+        </w:rPr>
+        <w:t>(1), 83–98.</w:t>
+      </w:r>
+    </w:p>
+    <w:p>
+      <w:pPr>
+        <w:spacing w:line="360" w:lineRule="auto" w:after="120"/>
+        <w:ind w:left="709" w:hanging="709"/>
+        <w:jc w:val="left"/>
+      </w:pPr>
+      <w:r>
+        <w:rPr>
+          <w:b w:val="0"/>
+          <w:i w:val="0"/>
+        </w:rPr>
+        <w:t xml:space="preserve">Silver, E. A., Pyke, D. F., &amp; Thomas, D. J. (2017). </w:t>
+      </w:r>
+      <w:r>
+        <w:rPr>
+          <w:b w:val="0"/>
+          <w:i/>
+        </w:rPr>
+        <w:t>Inventory and production management in supply chains</w:t>
+      </w:r>
+      <w:r>
+        <w:rPr>
+          <w:b w:val="0"/>
+          <w:i w:val="0"/>
+        </w:rPr>
+        <w:t xml:space="preserve"> (4th ed.). CRC Press.</w:t>
+      </w:r>
+    </w:p>
+    <w:p>
+      <w:pPr>
+        <w:spacing w:line="360" w:lineRule="auto" w:after="120"/>
+        <w:ind w:left="709" w:hanging="709"/>
+        <w:jc w:val="left"/>
+      </w:pPr>
+      <w:r>
+        <w:rPr>
+          <w:b w:val="0"/>
+          <w:i w:val="0"/>
+        </w:rPr>
+        <w:t xml:space="preserve">Sugiyono. (2019). </w:t>
+      </w:r>
+      <w:r>
+        <w:rPr>
+          <w:b w:val="0"/>
+          <w:i/>
+        </w:rPr>
+        <w:t>Metode penelitian kuantitatif, kualitatif, dan R&amp;D</w:t>
+      </w:r>
+      <w:r>
+        <w:rPr>
+          <w:b w:val="0"/>
+          <w:i w:val="0"/>
+        </w:rPr>
+        <w:t>. Alfabeta.</w:t>
+      </w:r>
+    </w:p>
+    <w:p>
+      <w:pPr>
+        <w:spacing w:line="360" w:lineRule="auto" w:after="120"/>
+        <w:ind w:left="709" w:hanging="709"/>
+        <w:jc w:val="left"/>
+      </w:pPr>
+      <w:r>
+        <w:rPr>
+          <w:b w:val="0"/>
+          <w:i w:val="0"/>
+        </w:rPr>
+        <w:t xml:space="preserve">Suwignjo, P., Bititci, U. S., &amp; Carrie, A. S. (2000). Quantitative models for performance measurement system. </w:t>
+      </w:r>
+      <w:r>
+        <w:rPr>
+          <w:b w:val="0"/>
+          <w:i/>
+        </w:rPr>
+        <w:t>International Journal of Production Economics, 64</w:t>
+      </w:r>
+      <w:r>
+        <w:rPr>
+          <w:b w:val="0"/>
+          <w:i w:val="0"/>
+        </w:rPr>
+        <w:t>(1–3), 231–241.</w:t>
+      </w:r>
+    </w:p>
+    <w:p>
+      <w:pPr>
+        <w:spacing w:line="360" w:lineRule="auto" w:after="120"/>
+        <w:ind w:left="709" w:hanging="709"/>
+        <w:jc w:val="left"/>
+      </w:pPr>
+      <w:r>
+        <w:rPr>
+          <w:b w:val="0"/>
+          <w:i w:val="0"/>
+        </w:rPr>
+        <w:t xml:space="preserve">Teece, D. J., Pisano, G., &amp; Shuen, A. (1997). Dynamic capabilities and strategic management. </w:t>
+      </w:r>
+      <w:r>
+        <w:rPr>
+          <w:b w:val="0"/>
+          <w:i/>
+        </w:rPr>
+        <w:t>Strategic Management Journal, 18</w:t>
+      </w:r>
+      <w:r>
+        <w:rPr>
+          <w:b w:val="0"/>
+          <w:i w:val="0"/>
+        </w:rPr>
+        <w:t>(7), 509–533.</w:t>
       </w:r>
     </w:p>
     <w:sectPr>

</xml_diff>

<commit_message>
Bab IV songkok: add sixth validator (finishing & packaging)
Co-Authored-By: Claude Opus 5.5 <noreply@anthropic.com>
Claude-Session: https://claude.ai/code/session_01Lq2itNFduhRUYgLXz2GTxG
</commit_message>
<xml_diff>
--- a/skripsi/BAB-IV-Pengumpulan-Data-Songkok.docx
+++ b/skripsi/BAB-IV-Pengumpulan-Data-Songkok.docx
@@ -54,7 +54,7 @@
           <w:b w:val="0"/>
           <w:i w:val="0"/>
         </w:rPr>
-        <w:t>. Data primer adalah data yang diperoleh langsung dari sumbernya oleh peneliti, sedangkan data sekunder adalah data yang diperoleh secara tidak langsung, misalnya melalui dokumen (Sugiyono, 2019). Data primer diperoleh melalui survei awal, observasi, wawancara, dan kuesioner validasi Key Performance Indicator (KPI) yang diisi oleh lima pakar internal perusahaan. Data sekunder berupa data operasional perusahaan periode Januari 2021–Desember 2025 yang terdiri atas enam dimensi data, yaitu master produk, rekap produksi dan permintaan bulanan, permintaan per produk, transaksi harian, persediaan, dan bahan baku. Data dalam bab ini disajikan sebagai data mentah. Pengolahan hasil kuesioner KPI, penetapan KPI final, kuesioner dan pengolahan Analytical Hierarchy Process (AHP), serta pengukuran kinerja diuraikan pada Bab V. Tahapan tersebut mengikuti kerangka berpikir penelitian pada Bab II (Gambar 2.</w:t>
+        <w:t>. Data primer adalah data yang diperoleh langsung dari sumbernya oleh peneliti, sedangkan data sekunder adalah data yang diperoleh secara tidak langsung, misalnya melalui dokumen (Sugiyono, 2019). Data primer diperoleh melalui survei awal, observasi, wawancara, dan kuesioner validasi Key Performance Indicator (KPI) yang diisi oleh enam pakar internal perusahaan. Data sekunder berupa data operasional perusahaan periode Januari 2021–Desember 2025 yang terdiri atas enam dimensi data, yaitu master produk, rekap produksi dan permintaan bulanan, permintaan per produk, transaksi harian, persediaan, dan bahan baku. Data dalam bab ini disajikan sebagai data mentah. Pengolahan hasil kuesioner KPI, penetapan KPI final, kuesioner dan pengolahan Analytical Hierarchy Process (AHP), serta pengukuran kinerja diuraikan pada Bab V. Tahapan tersebut mengikuti kerangka berpikir penelitian pada Bab II (Gambar 2.</w:t>
       </w:r>
       <w:r>
         <w:rPr>
@@ -761,7 +761,7 @@
                 <w:i w:val="0"/>
                 <w:sz w:val="20"/>
               </w:rPr>
-              <w:t>5 pakar internal (E1–E5)</w:t>
+              <w:t>6 pakar internal (E1–E6)</w:t>
             </w:r>
           </w:p>
         </w:tc>
@@ -4117,7 +4117,7 @@
           <w:b w:val="0"/>
           <w:i w:val="0"/>
         </w:rPr>
-        <w:t xml:space="preserve">Responden dipilih dengan teknik purposive sampling, yaitu penentuan sumber data dengan pertimbangan tertentu (Sugiyono, 2019). Pertimbangan yang digunakan adalah pihak internal yang memiliki pengalaman dan pemahaman terhadap operasional serta strategi perusahaan. Sesuai dengan adaptasi IPMS pada kerangka berpikir, stakeholder dipetakan berdasarkan fungsi aktualnya dalam proses bisnis, bukan hanya jabatan formal, karena IPMS menurunkan ukuran kinerja dari kebutuhan setiap stakeholder (Bititci et al., 1997). Kuesioner diisi oleh lima pakar yang mewakili pemilik, bagian produksi, bagian gudang, bagian penjahitan, dan pengrajin senior pada </w:t>
+        <w:t xml:space="preserve">Responden dipilih dengan teknik purposive sampling, yaitu penentuan sumber data dengan pertimbangan tertentu (Sugiyono, 2019). Pertimbangan yang digunakan adalah pihak internal yang memiliki pengalaman dan pemahaman terhadap operasional serta strategi perusahaan. Sesuai dengan adaptasi IPMS pada kerangka berpikir, stakeholder dipetakan berdasarkan fungsi aktualnya dalam proses bisnis, bukan hanya jabatan formal, karena IPMS menurunkan ukuran kinerja dari kebutuhan setiap stakeholder (Bititci et al., 1997). Kuesioner diisi oleh enam pakar, masing-masing mewakili satu fungsi, yaitu pemilik, bagian produksi, bagian gudang, bagian penjahitan, pengrajin senior, serta bagian finishing dan packaging, pada </w:t>
       </w:r>
       <w:r>
         <w:rPr>
@@ -4132,7 +4132,7 @@
           <w:b w:val="0"/>
           <w:i w:val="0"/>
         </w:rPr>
-        <w:t>. Identitas pakar disajikan pada Tabel 4.7; nama pakar tidak dicantumkan dan diganti dengan kode E1–E5.</w:t>
+        <w:t>. Identitas pakar disajikan pada Tabel 4.7; nama pakar tidak dicantumkan dan diganti dengan kode E1–E6.</w:t>
       </w:r>
     </w:p>
     <w:p>
@@ -4735,6 +4735,105 @@
                 <w:sz w:val="20"/>
               </w:rPr>
               <w:t>35</w:t>
+            </w:r>
+          </w:p>
+        </w:tc>
+        <w:tc>
+          <w:tcPr>
+            <w:tcW w:type="dxa" w:w="1474"/>
+          </w:tcPr>
+          <w:p>
+            <w:pPr>
+              <w:spacing w:after="0"/>
+              <w:jc w:val="center"/>
+            </w:pPr>
+            <w:r/>
+            <w:r>
+              <w:rPr>
+                <w:b w:val="0"/>
+                <w:i w:val="0"/>
+                <w:sz w:val="20"/>
+              </w:rPr>
+              <w:t>10</w:t>
+            </w:r>
+          </w:p>
+        </w:tc>
+      </w:tr>
+      <w:tr>
+        <w:tc>
+          <w:tcPr>
+            <w:tcW w:type="dxa" w:w="794"/>
+          </w:tcPr>
+          <w:p>
+            <w:pPr>
+              <w:spacing w:after="0"/>
+            </w:pPr>
+            <w:r/>
+            <w:r>
+              <w:rPr>
+                <w:b w:val="0"/>
+                <w:i w:val="0"/>
+                <w:sz w:val="20"/>
+              </w:rPr>
+              <w:t>E6</w:t>
+            </w:r>
+          </w:p>
+        </w:tc>
+        <w:tc>
+          <w:tcPr>
+            <w:tcW w:type="dxa" w:w="3402"/>
+          </w:tcPr>
+          <w:p>
+            <w:pPr>
+              <w:spacing w:after="0"/>
+            </w:pPr>
+            <w:r/>
+            <w:r>
+              <w:rPr>
+                <w:b w:val="0"/>
+                <w:i w:val="0"/>
+                <w:sz w:val="20"/>
+              </w:rPr>
+              <w:t>Bagian akhir (finishing &amp; packaging)</w:t>
+            </w:r>
+          </w:p>
+        </w:tc>
+        <w:tc>
+          <w:tcPr>
+            <w:tcW w:type="dxa" w:w="1361"/>
+          </w:tcPr>
+          <w:p>
+            <w:pPr>
+              <w:spacing w:after="0"/>
+            </w:pPr>
+            <w:r/>
+            <w:r>
+              <w:rPr>
+                <w:b w:val="0"/>
+                <w:i w:val="0"/>
+                <w:sz w:val="20"/>
+              </w:rPr>
+              <w:t>Laki-laki</w:t>
+            </w:r>
+          </w:p>
+        </w:tc>
+        <w:tc>
+          <w:tcPr>
+            <w:tcW w:type="dxa" w:w="1247"/>
+          </w:tcPr>
+          <w:p>
+            <w:pPr>
+              <w:spacing w:after="0"/>
+              <w:jc w:val="center"/>
+            </w:pPr>
+            <w:r/>
+            <w:r>
+              <w:rPr>
+                <w:b w:val="0"/>
+                <w:i w:val="0"/>
+                <w:sz w:val="20"/>
+              </w:rPr>
+              <w:t>39</w:t>
             </w:r>
           </w:p>
         </w:tc>
@@ -4812,7 +4911,7 @@
           <w:b w:val="0"/>
           <w:i w:val="0"/>
         </w:rPr>
-        <w:t>Kelima kuesioner kembali dalam keadaan lengkap dan setiap KPI memperoleh tepat satu jawaban dari setiap pakar. Skor penilaian setiap pakar disajikan pada Tabel 4.8.</w:t>
+        <w:t>Keenam kuesioner kembali dalam keadaan lengkap dan setiap KPI memperoleh tepat satu jawaban dari setiap pakar. Skor penilaian setiap pakar disajikan pada Tabel 4.8.</w:t>
       </w:r>
     </w:p>
     <w:p>
@@ -4836,14 +4935,15 @@
         <w:tblLook w:firstColumn="1" w:firstRow="1" w:lastColumn="0" w:lastRow="0" w:noHBand="0" w:noVBand="1" w:val="04A0"/>
       </w:tblPr>
       <w:tblGrid>
-        <w:gridCol w:w="1034"/>
-        <w:gridCol w:w="1034"/>
-        <w:gridCol w:w="1034"/>
-        <w:gridCol w:w="1034"/>
-        <w:gridCol w:w="1034"/>
-        <w:gridCol w:w="1034"/>
-        <w:gridCol w:w="1034"/>
-        <w:gridCol w:w="1034"/>
+        <w:gridCol w:w="919"/>
+        <w:gridCol w:w="919"/>
+        <w:gridCol w:w="919"/>
+        <w:gridCol w:w="919"/>
+        <w:gridCol w:w="919"/>
+        <w:gridCol w:w="919"/>
+        <w:gridCol w:w="919"/>
+        <w:gridCol w:w="919"/>
+        <w:gridCol w:w="919"/>
       </w:tblGrid>
       <w:tr>
         <w:tc>
@@ -4868,7 +4968,7 @@
         </w:tc>
         <w:tc>
           <w:tcPr>
-            <w:tcW w:type="dxa" w:w="2948"/>
+            <w:tcW w:type="dxa" w:w="2608"/>
           </w:tcPr>
           <w:p>
             <w:pPr>
@@ -4888,7 +4988,7 @@
         </w:tc>
         <w:tc>
           <w:tcPr>
-            <w:tcW w:type="dxa" w:w="680"/>
+            <w:tcW w:type="dxa" w:w="624"/>
           </w:tcPr>
           <w:p>
             <w:pPr>
@@ -4908,7 +5008,7 @@
         </w:tc>
         <w:tc>
           <w:tcPr>
-            <w:tcW w:type="dxa" w:w="680"/>
+            <w:tcW w:type="dxa" w:w="624"/>
           </w:tcPr>
           <w:p>
             <w:pPr>
@@ -4928,7 +5028,7 @@
         </w:tc>
         <w:tc>
           <w:tcPr>
-            <w:tcW w:type="dxa" w:w="680"/>
+            <w:tcW w:type="dxa" w:w="624"/>
           </w:tcPr>
           <w:p>
             <w:pPr>
@@ -4948,7 +5048,7 @@
         </w:tc>
         <w:tc>
           <w:tcPr>
-            <w:tcW w:type="dxa" w:w="680"/>
+            <w:tcW w:type="dxa" w:w="624"/>
           </w:tcPr>
           <w:p>
             <w:pPr>
@@ -4968,7 +5068,7 @@
         </w:tc>
         <w:tc>
           <w:tcPr>
-            <w:tcW w:type="dxa" w:w="680"/>
+            <w:tcW w:type="dxa" w:w="624"/>
           </w:tcPr>
           <w:p>
             <w:pPr>
@@ -4988,7 +5088,27 @@
         </w:tc>
         <w:tc>
           <w:tcPr>
-            <w:tcW w:type="dxa" w:w="907"/>
+            <w:tcW w:type="dxa" w:w="624"/>
+          </w:tcPr>
+          <w:p>
+            <w:pPr>
+              <w:spacing w:after="0"/>
+              <w:jc w:val="center"/>
+            </w:pPr>
+            <w:r/>
+            <w:r>
+              <w:rPr>
+                <w:b/>
+                <w:i w:val="0"/>
+                <w:sz w:val="20"/>
+              </w:rPr>
+              <w:t>E6</w:t>
+            </w:r>
+          </w:p>
+        </w:tc>
+        <w:tc>
+          <w:tcPr>
+            <w:tcW w:type="dxa" w:w="850"/>
           </w:tcPr>
           <w:p>
             <w:pPr>
@@ -5029,7 +5149,7 @@
         </w:tc>
         <w:tc>
           <w:tcPr>
-            <w:tcW w:type="dxa" w:w="2948"/>
+            <w:tcW w:type="dxa" w:w="2608"/>
           </w:tcPr>
           <w:p>
             <w:pPr>
@@ -5050,7 +5170,7 @@
         </w:tc>
         <w:tc>
           <w:tcPr>
-            <w:tcW w:type="dxa" w:w="680"/>
+            <w:tcW w:type="dxa" w:w="624"/>
           </w:tcPr>
           <w:p>
             <w:pPr>
@@ -5070,7 +5190,7 @@
         </w:tc>
         <w:tc>
           <w:tcPr>
-            <w:tcW w:type="dxa" w:w="680"/>
+            <w:tcW w:type="dxa" w:w="624"/>
           </w:tcPr>
           <w:p>
             <w:pPr>
@@ -5090,7 +5210,7 @@
         </w:tc>
         <w:tc>
           <w:tcPr>
-            <w:tcW w:type="dxa" w:w="680"/>
+            <w:tcW w:type="dxa" w:w="624"/>
           </w:tcPr>
           <w:p>
             <w:pPr>
@@ -5110,7 +5230,7 @@
         </w:tc>
         <w:tc>
           <w:tcPr>
-            <w:tcW w:type="dxa" w:w="680"/>
+            <w:tcW w:type="dxa" w:w="624"/>
           </w:tcPr>
           <w:p>
             <w:pPr>
@@ -5130,7 +5250,7 @@
         </w:tc>
         <w:tc>
           <w:tcPr>
-            <w:tcW w:type="dxa" w:w="680"/>
+            <w:tcW w:type="dxa" w:w="624"/>
           </w:tcPr>
           <w:p>
             <w:pPr>
@@ -5150,21 +5270,41 @@
         </w:tc>
         <w:tc>
           <w:tcPr>
-            <w:tcW w:type="dxa" w:w="907"/>
-          </w:tcPr>
-          <w:p>
-            <w:pPr>
-              <w:spacing w:after="0"/>
-              <w:jc w:val="center"/>
-            </w:pPr>
-            <w:r/>
-            <w:r>
-              <w:rPr>
-                <w:b w:val="0"/>
-                <w:i w:val="0"/>
-                <w:sz w:val="20"/>
-              </w:rPr>
-              <w:t>25</w:t>
+            <w:tcW w:type="dxa" w:w="624"/>
+          </w:tcPr>
+          <w:p>
+            <w:pPr>
+              <w:spacing w:after="0"/>
+              <w:jc w:val="center"/>
+            </w:pPr>
+            <w:r/>
+            <w:r>
+              <w:rPr>
+                <w:b w:val="0"/>
+                <w:i w:val="0"/>
+                <w:sz w:val="20"/>
+              </w:rPr>
+              <w:t>4</w:t>
+            </w:r>
+          </w:p>
+        </w:tc>
+        <w:tc>
+          <w:tcPr>
+            <w:tcW w:type="dxa" w:w="850"/>
+          </w:tcPr>
+          <w:p>
+            <w:pPr>
+              <w:spacing w:after="0"/>
+              <w:jc w:val="center"/>
+            </w:pPr>
+            <w:r/>
+            <w:r>
+              <w:rPr>
+                <w:b w:val="0"/>
+                <w:i w:val="0"/>
+                <w:sz w:val="20"/>
+              </w:rPr>
+              <w:t>29</w:t>
             </w:r>
           </w:p>
         </w:tc>
@@ -5191,7 +5331,7 @@
         </w:tc>
         <w:tc>
           <w:tcPr>
-            <w:tcW w:type="dxa" w:w="2948"/>
+            <w:tcW w:type="dxa" w:w="2608"/>
           </w:tcPr>
           <w:p>
             <w:pPr>
@@ -5210,7 +5350,7 @@
         </w:tc>
         <w:tc>
           <w:tcPr>
-            <w:tcW w:type="dxa" w:w="680"/>
+            <w:tcW w:type="dxa" w:w="624"/>
           </w:tcPr>
           <w:p>
             <w:pPr>
@@ -5230,7 +5370,7 @@
         </w:tc>
         <w:tc>
           <w:tcPr>
-            <w:tcW w:type="dxa" w:w="680"/>
+            <w:tcW w:type="dxa" w:w="624"/>
           </w:tcPr>
           <w:p>
             <w:pPr>
@@ -5250,7 +5390,7 @@
         </w:tc>
         <w:tc>
           <w:tcPr>
-            <w:tcW w:type="dxa" w:w="680"/>
+            <w:tcW w:type="dxa" w:w="624"/>
           </w:tcPr>
           <w:p>
             <w:pPr>
@@ -5270,7 +5410,7 @@
         </w:tc>
         <w:tc>
           <w:tcPr>
-            <w:tcW w:type="dxa" w:w="680"/>
+            <w:tcW w:type="dxa" w:w="624"/>
           </w:tcPr>
           <w:p>
             <w:pPr>
@@ -5290,7 +5430,7 @@
         </w:tc>
         <w:tc>
           <w:tcPr>
-            <w:tcW w:type="dxa" w:w="680"/>
+            <w:tcW w:type="dxa" w:w="624"/>
           </w:tcPr>
           <w:p>
             <w:pPr>
@@ -5310,21 +5450,41 @@
         </w:tc>
         <w:tc>
           <w:tcPr>
-            <w:tcW w:type="dxa" w:w="907"/>
-          </w:tcPr>
-          <w:p>
-            <w:pPr>
-              <w:spacing w:after="0"/>
-              <w:jc w:val="center"/>
-            </w:pPr>
-            <w:r/>
-            <w:r>
-              <w:rPr>
-                <w:b w:val="0"/>
-                <w:i w:val="0"/>
-                <w:sz w:val="20"/>
-              </w:rPr>
-              <w:t>23</w:t>
+            <w:tcW w:type="dxa" w:w="624"/>
+          </w:tcPr>
+          <w:p>
+            <w:pPr>
+              <w:spacing w:after="0"/>
+              <w:jc w:val="center"/>
+            </w:pPr>
+            <w:r/>
+            <w:r>
+              <w:rPr>
+                <w:b w:val="0"/>
+                <w:i w:val="0"/>
+                <w:sz w:val="20"/>
+              </w:rPr>
+              <w:t>4</w:t>
+            </w:r>
+          </w:p>
+        </w:tc>
+        <w:tc>
+          <w:tcPr>
+            <w:tcW w:type="dxa" w:w="850"/>
+          </w:tcPr>
+          <w:p>
+            <w:pPr>
+              <w:spacing w:after="0"/>
+              <w:jc w:val="center"/>
+            </w:pPr>
+            <w:r/>
+            <w:r>
+              <w:rPr>
+                <w:b w:val="0"/>
+                <w:i w:val="0"/>
+                <w:sz w:val="20"/>
+              </w:rPr>
+              <w:t>27</w:t>
             </w:r>
           </w:p>
         </w:tc>
@@ -5351,7 +5511,7 @@
         </w:tc>
         <w:tc>
           <w:tcPr>
-            <w:tcW w:type="dxa" w:w="2948"/>
+            <w:tcW w:type="dxa" w:w="2608"/>
           </w:tcPr>
           <w:p>
             <w:pPr>
@@ -5370,7 +5530,7 @@
         </w:tc>
         <w:tc>
           <w:tcPr>
-            <w:tcW w:type="dxa" w:w="680"/>
+            <w:tcW w:type="dxa" w:w="624"/>
           </w:tcPr>
           <w:p>
             <w:pPr>
@@ -5390,7 +5550,7 @@
         </w:tc>
         <w:tc>
           <w:tcPr>
-            <w:tcW w:type="dxa" w:w="680"/>
+            <w:tcW w:type="dxa" w:w="624"/>
           </w:tcPr>
           <w:p>
             <w:pPr>
@@ -5410,7 +5570,7 @@
         </w:tc>
         <w:tc>
           <w:tcPr>
-            <w:tcW w:type="dxa" w:w="680"/>
+            <w:tcW w:type="dxa" w:w="624"/>
           </w:tcPr>
           <w:p>
             <w:pPr>
@@ -5430,7 +5590,7 @@
         </w:tc>
         <w:tc>
           <w:tcPr>
-            <w:tcW w:type="dxa" w:w="680"/>
+            <w:tcW w:type="dxa" w:w="624"/>
           </w:tcPr>
           <w:p>
             <w:pPr>
@@ -5450,7 +5610,7 @@
         </w:tc>
         <w:tc>
           <w:tcPr>
-            <w:tcW w:type="dxa" w:w="680"/>
+            <w:tcW w:type="dxa" w:w="624"/>
           </w:tcPr>
           <w:p>
             <w:pPr>
@@ -5470,21 +5630,41 @@
         </w:tc>
         <w:tc>
           <w:tcPr>
-            <w:tcW w:type="dxa" w:w="907"/>
-          </w:tcPr>
-          <w:p>
-            <w:pPr>
-              <w:spacing w:after="0"/>
-              <w:jc w:val="center"/>
-            </w:pPr>
-            <w:r/>
-            <w:r>
-              <w:rPr>
-                <w:b w:val="0"/>
-                <w:i w:val="0"/>
-                <w:sz w:val="20"/>
-              </w:rPr>
-              <w:t>24</w:t>
+            <w:tcW w:type="dxa" w:w="624"/>
+          </w:tcPr>
+          <w:p>
+            <w:pPr>
+              <w:spacing w:after="0"/>
+              <w:jc w:val="center"/>
+            </w:pPr>
+            <w:r/>
+            <w:r>
+              <w:rPr>
+                <w:b w:val="0"/>
+                <w:i w:val="0"/>
+                <w:sz w:val="20"/>
+              </w:rPr>
+              <w:t>5</w:t>
+            </w:r>
+          </w:p>
+        </w:tc>
+        <w:tc>
+          <w:tcPr>
+            <w:tcW w:type="dxa" w:w="850"/>
+          </w:tcPr>
+          <w:p>
+            <w:pPr>
+              <w:spacing w:after="0"/>
+              <w:jc w:val="center"/>
+            </w:pPr>
+            <w:r/>
+            <w:r>
+              <w:rPr>
+                <w:b w:val="0"/>
+                <w:i w:val="0"/>
+                <w:sz w:val="20"/>
+              </w:rPr>
+              <w:t>29</w:t>
             </w:r>
           </w:p>
         </w:tc>
@@ -5511,7 +5691,7 @@
         </w:tc>
         <w:tc>
           <w:tcPr>
-            <w:tcW w:type="dxa" w:w="2948"/>
+            <w:tcW w:type="dxa" w:w="2608"/>
           </w:tcPr>
           <w:p>
             <w:pPr>
@@ -5530,7 +5710,7 @@
         </w:tc>
         <w:tc>
           <w:tcPr>
-            <w:tcW w:type="dxa" w:w="680"/>
+            <w:tcW w:type="dxa" w:w="624"/>
           </w:tcPr>
           <w:p>
             <w:pPr>
@@ -5550,7 +5730,7 @@
         </w:tc>
         <w:tc>
           <w:tcPr>
-            <w:tcW w:type="dxa" w:w="680"/>
+            <w:tcW w:type="dxa" w:w="624"/>
           </w:tcPr>
           <w:p>
             <w:pPr>
@@ -5570,7 +5750,7 @@
         </w:tc>
         <w:tc>
           <w:tcPr>
-            <w:tcW w:type="dxa" w:w="680"/>
+            <w:tcW w:type="dxa" w:w="624"/>
           </w:tcPr>
           <w:p>
             <w:pPr>
@@ -5590,7 +5770,7 @@
         </w:tc>
         <w:tc>
           <w:tcPr>
-            <w:tcW w:type="dxa" w:w="680"/>
+            <w:tcW w:type="dxa" w:w="624"/>
           </w:tcPr>
           <w:p>
             <w:pPr>
@@ -5610,7 +5790,7 @@
         </w:tc>
         <w:tc>
           <w:tcPr>
-            <w:tcW w:type="dxa" w:w="680"/>
+            <w:tcW w:type="dxa" w:w="624"/>
           </w:tcPr>
           <w:p>
             <w:pPr>
@@ -5630,21 +5810,41 @@
         </w:tc>
         <w:tc>
           <w:tcPr>
-            <w:tcW w:type="dxa" w:w="907"/>
-          </w:tcPr>
-          <w:p>
-            <w:pPr>
-              <w:spacing w:after="0"/>
-              <w:jc w:val="center"/>
-            </w:pPr>
-            <w:r/>
-            <w:r>
-              <w:rPr>
-                <w:b w:val="0"/>
-                <w:i w:val="0"/>
-                <w:sz w:val="20"/>
-              </w:rPr>
-              <w:t>25</w:t>
+            <w:tcW w:type="dxa" w:w="624"/>
+          </w:tcPr>
+          <w:p>
+            <w:pPr>
+              <w:spacing w:after="0"/>
+              <w:jc w:val="center"/>
+            </w:pPr>
+            <w:r/>
+            <w:r>
+              <w:rPr>
+                <w:b w:val="0"/>
+                <w:i w:val="0"/>
+                <w:sz w:val="20"/>
+              </w:rPr>
+              <w:t>4</w:t>
+            </w:r>
+          </w:p>
+        </w:tc>
+        <w:tc>
+          <w:tcPr>
+            <w:tcW w:type="dxa" w:w="850"/>
+          </w:tcPr>
+          <w:p>
+            <w:pPr>
+              <w:spacing w:after="0"/>
+              <w:jc w:val="center"/>
+            </w:pPr>
+            <w:r/>
+            <w:r>
+              <w:rPr>
+                <w:b w:val="0"/>
+                <w:i w:val="0"/>
+                <w:sz w:val="20"/>
+              </w:rPr>
+              <w:t>29</w:t>
             </w:r>
           </w:p>
         </w:tc>
@@ -5671,7 +5871,7 @@
         </w:tc>
         <w:tc>
           <w:tcPr>
-            <w:tcW w:type="dxa" w:w="2948"/>
+            <w:tcW w:type="dxa" w:w="2608"/>
           </w:tcPr>
           <w:p>
             <w:pPr>
@@ -5690,7 +5890,7 @@
         </w:tc>
         <w:tc>
           <w:tcPr>
-            <w:tcW w:type="dxa" w:w="680"/>
+            <w:tcW w:type="dxa" w:w="624"/>
           </w:tcPr>
           <w:p>
             <w:pPr>
@@ -5710,7 +5910,7 @@
         </w:tc>
         <w:tc>
           <w:tcPr>
-            <w:tcW w:type="dxa" w:w="680"/>
+            <w:tcW w:type="dxa" w:w="624"/>
           </w:tcPr>
           <w:p>
             <w:pPr>
@@ -5730,7 +5930,7 @@
         </w:tc>
         <w:tc>
           <w:tcPr>
-            <w:tcW w:type="dxa" w:w="680"/>
+            <w:tcW w:type="dxa" w:w="624"/>
           </w:tcPr>
           <w:p>
             <w:pPr>
@@ -5750,7 +5950,7 @@
         </w:tc>
         <w:tc>
           <w:tcPr>
-            <w:tcW w:type="dxa" w:w="680"/>
+            <w:tcW w:type="dxa" w:w="624"/>
           </w:tcPr>
           <w:p>
             <w:pPr>
@@ -5770,7 +5970,7 @@
         </w:tc>
         <w:tc>
           <w:tcPr>
-            <w:tcW w:type="dxa" w:w="680"/>
+            <w:tcW w:type="dxa" w:w="624"/>
           </w:tcPr>
           <w:p>
             <w:pPr>
@@ -5790,21 +5990,41 @@
         </w:tc>
         <w:tc>
           <w:tcPr>
-            <w:tcW w:type="dxa" w:w="907"/>
-          </w:tcPr>
-          <w:p>
-            <w:pPr>
-              <w:spacing w:after="0"/>
-              <w:jc w:val="center"/>
-            </w:pPr>
-            <w:r/>
-            <w:r>
-              <w:rPr>
-                <w:b w:val="0"/>
-                <w:i w:val="0"/>
-                <w:sz w:val="20"/>
-              </w:rPr>
-              <w:t>23</w:t>
+            <w:tcW w:type="dxa" w:w="624"/>
+          </w:tcPr>
+          <w:p>
+            <w:pPr>
+              <w:spacing w:after="0"/>
+              <w:jc w:val="center"/>
+            </w:pPr>
+            <w:r/>
+            <w:r>
+              <w:rPr>
+                <w:b w:val="0"/>
+                <w:i w:val="0"/>
+                <w:sz w:val="20"/>
+              </w:rPr>
+              <w:t>5</w:t>
+            </w:r>
+          </w:p>
+        </w:tc>
+        <w:tc>
+          <w:tcPr>
+            <w:tcW w:type="dxa" w:w="850"/>
+          </w:tcPr>
+          <w:p>
+            <w:pPr>
+              <w:spacing w:after="0"/>
+              <w:jc w:val="center"/>
+            </w:pPr>
+            <w:r/>
+            <w:r>
+              <w:rPr>
+                <w:b w:val="0"/>
+                <w:i w:val="0"/>
+                <w:sz w:val="20"/>
+              </w:rPr>
+              <w:t>28</w:t>
             </w:r>
           </w:p>
         </w:tc>
@@ -5831,7 +6051,7 @@
         </w:tc>
         <w:tc>
           <w:tcPr>
-            <w:tcW w:type="dxa" w:w="2948"/>
+            <w:tcW w:type="dxa" w:w="2608"/>
           </w:tcPr>
           <w:p>
             <w:pPr>
@@ -5850,7 +6070,7 @@
         </w:tc>
         <w:tc>
           <w:tcPr>
-            <w:tcW w:type="dxa" w:w="680"/>
+            <w:tcW w:type="dxa" w:w="624"/>
           </w:tcPr>
           <w:p>
             <w:pPr>
@@ -5870,7 +6090,7 @@
         </w:tc>
         <w:tc>
           <w:tcPr>
-            <w:tcW w:type="dxa" w:w="680"/>
+            <w:tcW w:type="dxa" w:w="624"/>
           </w:tcPr>
           <w:p>
             <w:pPr>
@@ -5890,7 +6110,7 @@
         </w:tc>
         <w:tc>
           <w:tcPr>
-            <w:tcW w:type="dxa" w:w="680"/>
+            <w:tcW w:type="dxa" w:w="624"/>
           </w:tcPr>
           <w:p>
             <w:pPr>
@@ -5910,7 +6130,7 @@
         </w:tc>
         <w:tc>
           <w:tcPr>
-            <w:tcW w:type="dxa" w:w="680"/>
+            <w:tcW w:type="dxa" w:w="624"/>
           </w:tcPr>
           <w:p>
             <w:pPr>
@@ -5930,7 +6150,7 @@
         </w:tc>
         <w:tc>
           <w:tcPr>
-            <w:tcW w:type="dxa" w:w="680"/>
+            <w:tcW w:type="dxa" w:w="624"/>
           </w:tcPr>
           <w:p>
             <w:pPr>
@@ -5950,21 +6170,41 @@
         </w:tc>
         <w:tc>
           <w:tcPr>
-            <w:tcW w:type="dxa" w:w="907"/>
-          </w:tcPr>
-          <w:p>
-            <w:pPr>
-              <w:spacing w:after="0"/>
-              <w:jc w:val="center"/>
-            </w:pPr>
-            <w:r/>
-            <w:r>
-              <w:rPr>
-                <w:b w:val="0"/>
-                <w:i w:val="0"/>
-                <w:sz w:val="20"/>
-              </w:rPr>
-              <w:t>21</w:t>
+            <w:tcW w:type="dxa" w:w="624"/>
+          </w:tcPr>
+          <w:p>
+            <w:pPr>
+              <w:spacing w:after="0"/>
+              <w:jc w:val="center"/>
+            </w:pPr>
+            <w:r/>
+            <w:r>
+              <w:rPr>
+                <w:b w:val="0"/>
+                <w:i w:val="0"/>
+                <w:sz w:val="20"/>
+              </w:rPr>
+              <w:t>4</w:t>
+            </w:r>
+          </w:p>
+        </w:tc>
+        <w:tc>
+          <w:tcPr>
+            <w:tcW w:type="dxa" w:w="850"/>
+          </w:tcPr>
+          <w:p>
+            <w:pPr>
+              <w:spacing w:after="0"/>
+              <w:jc w:val="center"/>
+            </w:pPr>
+            <w:r/>
+            <w:r>
+              <w:rPr>
+                <w:b w:val="0"/>
+                <w:i w:val="0"/>
+                <w:sz w:val="20"/>
+              </w:rPr>
+              <w:t>25</w:t>
             </w:r>
           </w:p>
         </w:tc>
@@ -5991,7 +6231,7 @@
         </w:tc>
         <w:tc>
           <w:tcPr>
-            <w:tcW w:type="dxa" w:w="2948"/>
+            <w:tcW w:type="dxa" w:w="2608"/>
           </w:tcPr>
           <w:p>
             <w:pPr>
@@ -6010,7 +6250,7 @@
         </w:tc>
         <w:tc>
           <w:tcPr>
-            <w:tcW w:type="dxa" w:w="680"/>
+            <w:tcW w:type="dxa" w:w="624"/>
           </w:tcPr>
           <w:p>
             <w:pPr>
@@ -6030,7 +6270,7 @@
         </w:tc>
         <w:tc>
           <w:tcPr>
-            <w:tcW w:type="dxa" w:w="680"/>
+            <w:tcW w:type="dxa" w:w="624"/>
           </w:tcPr>
           <w:p>
             <w:pPr>
@@ -6050,7 +6290,7 @@
         </w:tc>
         <w:tc>
           <w:tcPr>
-            <w:tcW w:type="dxa" w:w="680"/>
+            <w:tcW w:type="dxa" w:w="624"/>
           </w:tcPr>
           <w:p>
             <w:pPr>
@@ -6070,7 +6310,7 @@
         </w:tc>
         <w:tc>
           <w:tcPr>
-            <w:tcW w:type="dxa" w:w="680"/>
+            <w:tcW w:type="dxa" w:w="624"/>
           </w:tcPr>
           <w:p>
             <w:pPr>
@@ -6090,7 +6330,7 @@
         </w:tc>
         <w:tc>
           <w:tcPr>
-            <w:tcW w:type="dxa" w:w="680"/>
+            <w:tcW w:type="dxa" w:w="624"/>
           </w:tcPr>
           <w:p>
             <w:pPr>
@@ -6110,21 +6350,41 @@
         </w:tc>
         <w:tc>
           <w:tcPr>
-            <w:tcW w:type="dxa" w:w="907"/>
-          </w:tcPr>
-          <w:p>
-            <w:pPr>
-              <w:spacing w:after="0"/>
-              <w:jc w:val="center"/>
-            </w:pPr>
-            <w:r/>
-            <w:r>
-              <w:rPr>
-                <w:b w:val="0"/>
-                <w:i w:val="0"/>
-                <w:sz w:val="20"/>
-              </w:rPr>
-              <w:t>24</w:t>
+            <w:tcW w:type="dxa" w:w="624"/>
+          </w:tcPr>
+          <w:p>
+            <w:pPr>
+              <w:spacing w:after="0"/>
+              <w:jc w:val="center"/>
+            </w:pPr>
+            <w:r/>
+            <w:r>
+              <w:rPr>
+                <w:b w:val="0"/>
+                <w:i w:val="0"/>
+                <w:sz w:val="20"/>
+              </w:rPr>
+              <w:t>4</w:t>
+            </w:r>
+          </w:p>
+        </w:tc>
+        <w:tc>
+          <w:tcPr>
+            <w:tcW w:type="dxa" w:w="850"/>
+          </w:tcPr>
+          <w:p>
+            <w:pPr>
+              <w:spacing w:after="0"/>
+              <w:jc w:val="center"/>
+            </w:pPr>
+            <w:r/>
+            <w:r>
+              <w:rPr>
+                <w:b w:val="0"/>
+                <w:i w:val="0"/>
+                <w:sz w:val="20"/>
+              </w:rPr>
+              <w:t>28</w:t>
             </w:r>
           </w:p>
         </w:tc>
@@ -6151,7 +6411,7 @@
         </w:tc>
         <w:tc>
           <w:tcPr>
-            <w:tcW w:type="dxa" w:w="2948"/>
+            <w:tcW w:type="dxa" w:w="2608"/>
           </w:tcPr>
           <w:p>
             <w:pPr>
@@ -6170,7 +6430,7 @@
         </w:tc>
         <w:tc>
           <w:tcPr>
-            <w:tcW w:type="dxa" w:w="680"/>
+            <w:tcW w:type="dxa" w:w="624"/>
           </w:tcPr>
           <w:p>
             <w:pPr>
@@ -6190,7 +6450,7 @@
         </w:tc>
         <w:tc>
           <w:tcPr>
-            <w:tcW w:type="dxa" w:w="680"/>
+            <w:tcW w:type="dxa" w:w="624"/>
           </w:tcPr>
           <w:p>
             <w:pPr>
@@ -6210,7 +6470,7 @@
         </w:tc>
         <w:tc>
           <w:tcPr>
-            <w:tcW w:type="dxa" w:w="680"/>
+            <w:tcW w:type="dxa" w:w="624"/>
           </w:tcPr>
           <w:p>
             <w:pPr>
@@ -6230,7 +6490,7 @@
         </w:tc>
         <w:tc>
           <w:tcPr>
-            <w:tcW w:type="dxa" w:w="680"/>
+            <w:tcW w:type="dxa" w:w="624"/>
           </w:tcPr>
           <w:p>
             <w:pPr>
@@ -6250,7 +6510,7 @@
         </w:tc>
         <w:tc>
           <w:tcPr>
-            <w:tcW w:type="dxa" w:w="680"/>
+            <w:tcW w:type="dxa" w:w="624"/>
           </w:tcPr>
           <w:p>
             <w:pPr>
@@ -6270,21 +6530,41 @@
         </w:tc>
         <w:tc>
           <w:tcPr>
-            <w:tcW w:type="dxa" w:w="907"/>
-          </w:tcPr>
-          <w:p>
-            <w:pPr>
-              <w:spacing w:after="0"/>
-              <w:jc w:val="center"/>
-            </w:pPr>
-            <w:r/>
-            <w:r>
-              <w:rPr>
-                <w:b w:val="0"/>
-                <w:i w:val="0"/>
-                <w:sz w:val="20"/>
-              </w:rPr>
-              <w:t>22</w:t>
+            <w:tcW w:type="dxa" w:w="624"/>
+          </w:tcPr>
+          <w:p>
+            <w:pPr>
+              <w:spacing w:after="0"/>
+              <w:jc w:val="center"/>
+            </w:pPr>
+            <w:r/>
+            <w:r>
+              <w:rPr>
+                <w:b w:val="0"/>
+                <w:i w:val="0"/>
+                <w:sz w:val="20"/>
+              </w:rPr>
+              <w:t>4</w:t>
+            </w:r>
+          </w:p>
+        </w:tc>
+        <w:tc>
+          <w:tcPr>
+            <w:tcW w:type="dxa" w:w="850"/>
+          </w:tcPr>
+          <w:p>
+            <w:pPr>
+              <w:spacing w:after="0"/>
+              <w:jc w:val="center"/>
+            </w:pPr>
+            <w:r/>
+            <w:r>
+              <w:rPr>
+                <w:b w:val="0"/>
+                <w:i w:val="0"/>
+                <w:sz w:val="20"/>
+              </w:rPr>
+              <w:t>26</w:t>
             </w:r>
           </w:p>
         </w:tc>
@@ -6311,7 +6591,7 @@
         </w:tc>
         <w:tc>
           <w:tcPr>
-            <w:tcW w:type="dxa" w:w="2948"/>
+            <w:tcW w:type="dxa" w:w="2608"/>
           </w:tcPr>
           <w:p>
             <w:pPr>
@@ -6330,7 +6610,7 @@
         </w:tc>
         <w:tc>
           <w:tcPr>
-            <w:tcW w:type="dxa" w:w="680"/>
+            <w:tcW w:type="dxa" w:w="624"/>
           </w:tcPr>
           <w:p>
             <w:pPr>
@@ -6350,7 +6630,7 @@
         </w:tc>
         <w:tc>
           <w:tcPr>
-            <w:tcW w:type="dxa" w:w="680"/>
+            <w:tcW w:type="dxa" w:w="624"/>
           </w:tcPr>
           <w:p>
             <w:pPr>
@@ -6370,7 +6650,7 @@
         </w:tc>
         <w:tc>
           <w:tcPr>
-            <w:tcW w:type="dxa" w:w="680"/>
+            <w:tcW w:type="dxa" w:w="624"/>
           </w:tcPr>
           <w:p>
             <w:pPr>
@@ -6390,7 +6670,7 @@
         </w:tc>
         <w:tc>
           <w:tcPr>
-            <w:tcW w:type="dxa" w:w="680"/>
+            <w:tcW w:type="dxa" w:w="624"/>
           </w:tcPr>
           <w:p>
             <w:pPr>
@@ -6410,7 +6690,7 @@
         </w:tc>
         <w:tc>
           <w:tcPr>
-            <w:tcW w:type="dxa" w:w="680"/>
+            <w:tcW w:type="dxa" w:w="624"/>
           </w:tcPr>
           <w:p>
             <w:pPr>
@@ -6430,21 +6710,41 @@
         </w:tc>
         <w:tc>
           <w:tcPr>
-            <w:tcW w:type="dxa" w:w="907"/>
-          </w:tcPr>
-          <w:p>
-            <w:pPr>
-              <w:spacing w:after="0"/>
-              <w:jc w:val="center"/>
-            </w:pPr>
-            <w:r/>
-            <w:r>
-              <w:rPr>
-                <w:b w:val="0"/>
-                <w:i w:val="0"/>
-                <w:sz w:val="20"/>
-              </w:rPr>
-              <w:t>23</w:t>
+            <w:tcW w:type="dxa" w:w="624"/>
+          </w:tcPr>
+          <w:p>
+            <w:pPr>
+              <w:spacing w:after="0"/>
+              <w:jc w:val="center"/>
+            </w:pPr>
+            <w:r/>
+            <w:r>
+              <w:rPr>
+                <w:b w:val="0"/>
+                <w:i w:val="0"/>
+                <w:sz w:val="20"/>
+              </w:rPr>
+              <w:t>5</w:t>
+            </w:r>
+          </w:p>
+        </w:tc>
+        <w:tc>
+          <w:tcPr>
+            <w:tcW w:type="dxa" w:w="850"/>
+          </w:tcPr>
+          <w:p>
+            <w:pPr>
+              <w:spacing w:after="0"/>
+              <w:jc w:val="center"/>
+            </w:pPr>
+            <w:r/>
+            <w:r>
+              <w:rPr>
+                <w:b w:val="0"/>
+                <w:i w:val="0"/>
+                <w:sz w:val="20"/>
+              </w:rPr>
+              <w:t>28</w:t>
             </w:r>
           </w:p>
         </w:tc>
@@ -6471,7 +6771,7 @@
         </w:tc>
         <w:tc>
           <w:tcPr>
-            <w:tcW w:type="dxa" w:w="2948"/>
+            <w:tcW w:type="dxa" w:w="2608"/>
           </w:tcPr>
           <w:p>
             <w:pPr>
@@ -6490,7 +6790,7 @@
         </w:tc>
         <w:tc>
           <w:tcPr>
-            <w:tcW w:type="dxa" w:w="680"/>
+            <w:tcW w:type="dxa" w:w="624"/>
           </w:tcPr>
           <w:p>
             <w:pPr>
@@ -6510,7 +6810,7 @@
         </w:tc>
         <w:tc>
           <w:tcPr>
-            <w:tcW w:type="dxa" w:w="680"/>
+            <w:tcW w:type="dxa" w:w="624"/>
           </w:tcPr>
           <w:p>
             <w:pPr>
@@ -6530,7 +6830,7 @@
         </w:tc>
         <w:tc>
           <w:tcPr>
-            <w:tcW w:type="dxa" w:w="680"/>
+            <w:tcW w:type="dxa" w:w="624"/>
           </w:tcPr>
           <w:p>
             <w:pPr>
@@ -6550,7 +6850,7 @@
         </w:tc>
         <w:tc>
           <w:tcPr>
-            <w:tcW w:type="dxa" w:w="680"/>
+            <w:tcW w:type="dxa" w:w="624"/>
           </w:tcPr>
           <w:p>
             <w:pPr>
@@ -6570,7 +6870,7 @@
         </w:tc>
         <w:tc>
           <w:tcPr>
-            <w:tcW w:type="dxa" w:w="680"/>
+            <w:tcW w:type="dxa" w:w="624"/>
           </w:tcPr>
           <w:p>
             <w:pPr>
@@ -6590,21 +6890,41 @@
         </w:tc>
         <w:tc>
           <w:tcPr>
-            <w:tcW w:type="dxa" w:w="907"/>
-          </w:tcPr>
-          <w:p>
-            <w:pPr>
-              <w:spacing w:after="0"/>
-              <w:jc w:val="center"/>
-            </w:pPr>
-            <w:r/>
-            <w:r>
-              <w:rPr>
-                <w:b w:val="0"/>
-                <w:i w:val="0"/>
-                <w:sz w:val="20"/>
-              </w:rPr>
-              <w:t>24</w:t>
+            <w:tcW w:type="dxa" w:w="624"/>
+          </w:tcPr>
+          <w:p>
+            <w:pPr>
+              <w:spacing w:after="0"/>
+              <w:jc w:val="center"/>
+            </w:pPr>
+            <w:r/>
+            <w:r>
+              <w:rPr>
+                <w:b w:val="0"/>
+                <w:i w:val="0"/>
+                <w:sz w:val="20"/>
+              </w:rPr>
+              <w:t>5</w:t>
+            </w:r>
+          </w:p>
+        </w:tc>
+        <w:tc>
+          <w:tcPr>
+            <w:tcW w:type="dxa" w:w="850"/>
+          </w:tcPr>
+          <w:p>
+            <w:pPr>
+              <w:spacing w:after="0"/>
+              <w:jc w:val="center"/>
+            </w:pPr>
+            <w:r/>
+            <w:r>
+              <w:rPr>
+                <w:b w:val="0"/>
+                <w:i w:val="0"/>
+                <w:sz w:val="20"/>
+              </w:rPr>
+              <w:t>29</w:t>
             </w:r>
           </w:p>
         </w:tc>
@@ -6631,7 +6951,7 @@
         </w:tc>
         <w:tc>
           <w:tcPr>
-            <w:tcW w:type="dxa" w:w="2948"/>
+            <w:tcW w:type="dxa" w:w="2608"/>
           </w:tcPr>
           <w:p>
             <w:pPr>
@@ -6650,7 +6970,7 @@
         </w:tc>
         <w:tc>
           <w:tcPr>
-            <w:tcW w:type="dxa" w:w="680"/>
+            <w:tcW w:type="dxa" w:w="624"/>
           </w:tcPr>
           <w:p>
             <w:pPr>
@@ -6670,7 +6990,7 @@
         </w:tc>
         <w:tc>
           <w:tcPr>
-            <w:tcW w:type="dxa" w:w="680"/>
+            <w:tcW w:type="dxa" w:w="624"/>
           </w:tcPr>
           <w:p>
             <w:pPr>
@@ -6690,7 +7010,7 @@
         </w:tc>
         <w:tc>
           <w:tcPr>
-            <w:tcW w:type="dxa" w:w="680"/>
+            <w:tcW w:type="dxa" w:w="624"/>
           </w:tcPr>
           <w:p>
             <w:pPr>
@@ -6710,7 +7030,7 @@
         </w:tc>
         <w:tc>
           <w:tcPr>
-            <w:tcW w:type="dxa" w:w="680"/>
+            <w:tcW w:type="dxa" w:w="624"/>
           </w:tcPr>
           <w:p>
             <w:pPr>
@@ -6730,7 +7050,7 @@
         </w:tc>
         <w:tc>
           <w:tcPr>
-            <w:tcW w:type="dxa" w:w="680"/>
+            <w:tcW w:type="dxa" w:w="624"/>
           </w:tcPr>
           <w:p>
             <w:pPr>
@@ -6750,21 +7070,41 @@
         </w:tc>
         <w:tc>
           <w:tcPr>
-            <w:tcW w:type="dxa" w:w="907"/>
-          </w:tcPr>
-          <w:p>
-            <w:pPr>
-              <w:spacing w:after="0"/>
-              <w:jc w:val="center"/>
-            </w:pPr>
-            <w:r/>
-            <w:r>
-              <w:rPr>
-                <w:b w:val="0"/>
-                <w:i w:val="0"/>
-                <w:sz w:val="20"/>
-              </w:rPr>
-              <w:t>24</w:t>
+            <w:tcW w:type="dxa" w:w="624"/>
+          </w:tcPr>
+          <w:p>
+            <w:pPr>
+              <w:spacing w:after="0"/>
+              <w:jc w:val="center"/>
+            </w:pPr>
+            <w:r/>
+            <w:r>
+              <w:rPr>
+                <w:b w:val="0"/>
+                <w:i w:val="0"/>
+                <w:sz w:val="20"/>
+              </w:rPr>
+              <w:t>5</w:t>
+            </w:r>
+          </w:p>
+        </w:tc>
+        <w:tc>
+          <w:tcPr>
+            <w:tcW w:type="dxa" w:w="850"/>
+          </w:tcPr>
+          <w:p>
+            <w:pPr>
+              <w:spacing w:after="0"/>
+              <w:jc w:val="center"/>
+            </w:pPr>
+            <w:r/>
+            <w:r>
+              <w:rPr>
+                <w:b w:val="0"/>
+                <w:i w:val="0"/>
+                <w:sz w:val="20"/>
+              </w:rPr>
+              <w:t>29</w:t>
             </w:r>
           </w:p>
         </w:tc>
@@ -6791,7 +7131,7 @@
         </w:tc>
         <w:tc>
           <w:tcPr>
-            <w:tcW w:type="dxa" w:w="2948"/>
+            <w:tcW w:type="dxa" w:w="2608"/>
           </w:tcPr>
           <w:p>
             <w:pPr>
@@ -6810,7 +7150,7 @@
         </w:tc>
         <w:tc>
           <w:tcPr>
-            <w:tcW w:type="dxa" w:w="680"/>
+            <w:tcW w:type="dxa" w:w="624"/>
           </w:tcPr>
           <w:p>
             <w:pPr>
@@ -6830,7 +7170,7 @@
         </w:tc>
         <w:tc>
           <w:tcPr>
-            <w:tcW w:type="dxa" w:w="680"/>
+            <w:tcW w:type="dxa" w:w="624"/>
           </w:tcPr>
           <w:p>
             <w:pPr>
@@ -6850,7 +7190,7 @@
         </w:tc>
         <w:tc>
           <w:tcPr>
-            <w:tcW w:type="dxa" w:w="680"/>
+            <w:tcW w:type="dxa" w:w="624"/>
           </w:tcPr>
           <w:p>
             <w:pPr>
@@ -6870,7 +7210,7 @@
         </w:tc>
         <w:tc>
           <w:tcPr>
-            <w:tcW w:type="dxa" w:w="680"/>
+            <w:tcW w:type="dxa" w:w="624"/>
           </w:tcPr>
           <w:p>
             <w:pPr>
@@ -6890,7 +7230,7 @@
         </w:tc>
         <w:tc>
           <w:tcPr>
-            <w:tcW w:type="dxa" w:w="680"/>
+            <w:tcW w:type="dxa" w:w="624"/>
           </w:tcPr>
           <w:p>
             <w:pPr>
@@ -6910,21 +7250,41 @@
         </w:tc>
         <w:tc>
           <w:tcPr>
-            <w:tcW w:type="dxa" w:w="907"/>
-          </w:tcPr>
-          <w:p>
-            <w:pPr>
-              <w:spacing w:after="0"/>
-              <w:jc w:val="center"/>
-            </w:pPr>
-            <w:r/>
-            <w:r>
-              <w:rPr>
-                <w:b w:val="0"/>
-                <w:i w:val="0"/>
-                <w:sz w:val="20"/>
-              </w:rPr>
-              <w:t>22</w:t>
+            <w:tcW w:type="dxa" w:w="624"/>
+          </w:tcPr>
+          <w:p>
+            <w:pPr>
+              <w:spacing w:after="0"/>
+              <w:jc w:val="center"/>
+            </w:pPr>
+            <w:r/>
+            <w:r>
+              <w:rPr>
+                <w:b w:val="0"/>
+                <w:i w:val="0"/>
+                <w:sz w:val="20"/>
+              </w:rPr>
+              <w:t>4</w:t>
+            </w:r>
+          </w:p>
+        </w:tc>
+        <w:tc>
+          <w:tcPr>
+            <w:tcW w:type="dxa" w:w="850"/>
+          </w:tcPr>
+          <w:p>
+            <w:pPr>
+              <w:spacing w:after="0"/>
+              <w:jc w:val="center"/>
+            </w:pPr>
+            <w:r/>
+            <w:r>
+              <w:rPr>
+                <w:b w:val="0"/>
+                <w:i w:val="0"/>
+                <w:sz w:val="20"/>
+              </w:rPr>
+              <w:t>26</w:t>
             </w:r>
           </w:p>
         </w:tc>
@@ -6951,7 +7311,7 @@
         </w:tc>
         <w:tc>
           <w:tcPr>
-            <w:tcW w:type="dxa" w:w="2948"/>
+            <w:tcW w:type="dxa" w:w="2608"/>
           </w:tcPr>
           <w:p>
             <w:pPr>
@@ -6970,7 +7330,7 @@
         </w:tc>
         <w:tc>
           <w:tcPr>
-            <w:tcW w:type="dxa" w:w="680"/>
+            <w:tcW w:type="dxa" w:w="624"/>
           </w:tcPr>
           <w:p>
             <w:pPr>
@@ -6990,7 +7350,7 @@
         </w:tc>
         <w:tc>
           <w:tcPr>
-            <w:tcW w:type="dxa" w:w="680"/>
+            <w:tcW w:type="dxa" w:w="624"/>
           </w:tcPr>
           <w:p>
             <w:pPr>
@@ -7010,7 +7370,7 @@
         </w:tc>
         <w:tc>
           <w:tcPr>
-            <w:tcW w:type="dxa" w:w="680"/>
+            <w:tcW w:type="dxa" w:w="624"/>
           </w:tcPr>
           <w:p>
             <w:pPr>
@@ -7030,7 +7390,7 @@
         </w:tc>
         <w:tc>
           <w:tcPr>
-            <w:tcW w:type="dxa" w:w="680"/>
+            <w:tcW w:type="dxa" w:w="624"/>
           </w:tcPr>
           <w:p>
             <w:pPr>
@@ -7050,7 +7410,7 @@
         </w:tc>
         <w:tc>
           <w:tcPr>
-            <w:tcW w:type="dxa" w:w="680"/>
+            <w:tcW w:type="dxa" w:w="624"/>
           </w:tcPr>
           <w:p>
             <w:pPr>
@@ -7070,21 +7430,41 @@
         </w:tc>
         <w:tc>
           <w:tcPr>
-            <w:tcW w:type="dxa" w:w="907"/>
-          </w:tcPr>
-          <w:p>
-            <w:pPr>
-              <w:spacing w:after="0"/>
-              <w:jc w:val="center"/>
-            </w:pPr>
-            <w:r/>
-            <w:r>
-              <w:rPr>
-                <w:b w:val="0"/>
-                <w:i w:val="0"/>
-                <w:sz w:val="20"/>
-              </w:rPr>
-              <w:t>23</w:t>
+            <w:tcW w:type="dxa" w:w="624"/>
+          </w:tcPr>
+          <w:p>
+            <w:pPr>
+              <w:spacing w:after="0"/>
+              <w:jc w:val="center"/>
+            </w:pPr>
+            <w:r/>
+            <w:r>
+              <w:rPr>
+                <w:b w:val="0"/>
+                <w:i w:val="0"/>
+                <w:sz w:val="20"/>
+              </w:rPr>
+              <w:t>4</w:t>
+            </w:r>
+          </w:p>
+        </w:tc>
+        <w:tc>
+          <w:tcPr>
+            <w:tcW w:type="dxa" w:w="850"/>
+          </w:tcPr>
+          <w:p>
+            <w:pPr>
+              <w:spacing w:after="0"/>
+              <w:jc w:val="center"/>
+            </w:pPr>
+            <w:r/>
+            <w:r>
+              <w:rPr>
+                <w:b w:val="0"/>
+                <w:i w:val="0"/>
+                <w:sz w:val="20"/>
+              </w:rPr>
+              <w:t>27</w:t>
             </w:r>
           </w:p>
         </w:tc>
@@ -7111,7 +7491,7 @@
         </w:tc>
         <w:tc>
           <w:tcPr>
-            <w:tcW w:type="dxa" w:w="2948"/>
+            <w:tcW w:type="dxa" w:w="2608"/>
           </w:tcPr>
           <w:p>
             <w:pPr>
@@ -7130,7 +7510,7 @@
         </w:tc>
         <w:tc>
           <w:tcPr>
-            <w:tcW w:type="dxa" w:w="680"/>
+            <w:tcW w:type="dxa" w:w="624"/>
           </w:tcPr>
           <w:p>
             <w:pPr>
@@ -7150,7 +7530,7 @@
         </w:tc>
         <w:tc>
           <w:tcPr>
-            <w:tcW w:type="dxa" w:w="680"/>
+            <w:tcW w:type="dxa" w:w="624"/>
           </w:tcPr>
           <w:p>
             <w:pPr>
@@ -7170,7 +7550,7 @@
         </w:tc>
         <w:tc>
           <w:tcPr>
-            <w:tcW w:type="dxa" w:w="680"/>
+            <w:tcW w:type="dxa" w:w="624"/>
           </w:tcPr>
           <w:p>
             <w:pPr>
@@ -7190,7 +7570,7 @@
         </w:tc>
         <w:tc>
           <w:tcPr>
-            <w:tcW w:type="dxa" w:w="680"/>
+            <w:tcW w:type="dxa" w:w="624"/>
           </w:tcPr>
           <w:p>
             <w:pPr>
@@ -7210,7 +7590,7 @@
         </w:tc>
         <w:tc>
           <w:tcPr>
-            <w:tcW w:type="dxa" w:w="680"/>
+            <w:tcW w:type="dxa" w:w="624"/>
           </w:tcPr>
           <w:p>
             <w:pPr>
@@ -7230,21 +7610,41 @@
         </w:tc>
         <w:tc>
           <w:tcPr>
-            <w:tcW w:type="dxa" w:w="907"/>
-          </w:tcPr>
-          <w:p>
-            <w:pPr>
-              <w:spacing w:after="0"/>
-              <w:jc w:val="center"/>
-            </w:pPr>
-            <w:r/>
-            <w:r>
-              <w:rPr>
-                <w:b w:val="0"/>
-                <w:i w:val="0"/>
-                <w:sz w:val="20"/>
-              </w:rPr>
-              <w:t>25</w:t>
+            <w:tcW w:type="dxa" w:w="624"/>
+          </w:tcPr>
+          <w:p>
+            <w:pPr>
+              <w:spacing w:after="0"/>
+              <w:jc w:val="center"/>
+            </w:pPr>
+            <w:r/>
+            <w:r>
+              <w:rPr>
+                <w:b w:val="0"/>
+                <w:i w:val="0"/>
+                <w:sz w:val="20"/>
+              </w:rPr>
+              <w:t>4</w:t>
+            </w:r>
+          </w:p>
+        </w:tc>
+        <w:tc>
+          <w:tcPr>
+            <w:tcW w:type="dxa" w:w="850"/>
+          </w:tcPr>
+          <w:p>
+            <w:pPr>
+              <w:spacing w:after="0"/>
+              <w:jc w:val="center"/>
+            </w:pPr>
+            <w:r/>
+            <w:r>
+              <w:rPr>
+                <w:b w:val="0"/>
+                <w:i w:val="0"/>
+                <w:sz w:val="20"/>
+              </w:rPr>
+              <w:t>29</w:t>
             </w:r>
           </w:p>
         </w:tc>
@@ -7271,7 +7671,7 @@
         </w:tc>
         <w:tc>
           <w:tcPr>
-            <w:tcW w:type="dxa" w:w="2948"/>
+            <w:tcW w:type="dxa" w:w="2608"/>
           </w:tcPr>
           <w:p>
             <w:pPr>
@@ -7290,7 +7690,7 @@
         </w:tc>
         <w:tc>
           <w:tcPr>
-            <w:tcW w:type="dxa" w:w="680"/>
+            <w:tcW w:type="dxa" w:w="624"/>
           </w:tcPr>
           <w:p>
             <w:pPr>
@@ -7310,7 +7710,7 @@
         </w:tc>
         <w:tc>
           <w:tcPr>
-            <w:tcW w:type="dxa" w:w="680"/>
+            <w:tcW w:type="dxa" w:w="624"/>
           </w:tcPr>
           <w:p>
             <w:pPr>
@@ -7330,7 +7730,7 @@
         </w:tc>
         <w:tc>
           <w:tcPr>
-            <w:tcW w:type="dxa" w:w="680"/>
+            <w:tcW w:type="dxa" w:w="624"/>
           </w:tcPr>
           <w:p>
             <w:pPr>
@@ -7350,7 +7750,7 @@
         </w:tc>
         <w:tc>
           <w:tcPr>
-            <w:tcW w:type="dxa" w:w="680"/>
+            <w:tcW w:type="dxa" w:w="624"/>
           </w:tcPr>
           <w:p>
             <w:pPr>
@@ -7370,7 +7770,7 @@
         </w:tc>
         <w:tc>
           <w:tcPr>
-            <w:tcW w:type="dxa" w:w="680"/>
+            <w:tcW w:type="dxa" w:w="624"/>
           </w:tcPr>
           <w:p>
             <w:pPr>
@@ -7390,21 +7790,41 @@
         </w:tc>
         <w:tc>
           <w:tcPr>
-            <w:tcW w:type="dxa" w:w="907"/>
-          </w:tcPr>
-          <w:p>
-            <w:pPr>
-              <w:spacing w:after="0"/>
-              <w:jc w:val="center"/>
-            </w:pPr>
-            <w:r/>
-            <w:r>
-              <w:rPr>
-                <w:b w:val="0"/>
-                <w:i w:val="0"/>
-                <w:sz w:val="20"/>
-              </w:rPr>
-              <w:t>23</w:t>
+            <w:tcW w:type="dxa" w:w="624"/>
+          </w:tcPr>
+          <w:p>
+            <w:pPr>
+              <w:spacing w:after="0"/>
+              <w:jc w:val="center"/>
+            </w:pPr>
+            <w:r/>
+            <w:r>
+              <w:rPr>
+                <w:b w:val="0"/>
+                <w:i w:val="0"/>
+                <w:sz w:val="20"/>
+              </w:rPr>
+              <w:t>5</w:t>
+            </w:r>
+          </w:p>
+        </w:tc>
+        <w:tc>
+          <w:tcPr>
+            <w:tcW w:type="dxa" w:w="850"/>
+          </w:tcPr>
+          <w:p>
+            <w:pPr>
+              <w:spacing w:after="0"/>
+              <w:jc w:val="center"/>
+            </w:pPr>
+            <w:r/>
+            <w:r>
+              <w:rPr>
+                <w:b w:val="0"/>
+                <w:i w:val="0"/>
+                <w:sz w:val="20"/>
+              </w:rPr>
+              <w:t>28</w:t>
             </w:r>
           </w:p>
         </w:tc>
@@ -7431,7 +7851,7 @@
         </w:tc>
         <w:tc>
           <w:tcPr>
-            <w:tcW w:type="dxa" w:w="2948"/>
+            <w:tcW w:type="dxa" w:w="2608"/>
           </w:tcPr>
           <w:p>
             <w:pPr>
@@ -7450,7 +7870,7 @@
         </w:tc>
         <w:tc>
           <w:tcPr>
-            <w:tcW w:type="dxa" w:w="680"/>
+            <w:tcW w:type="dxa" w:w="624"/>
           </w:tcPr>
           <w:p>
             <w:pPr>
@@ -7470,7 +7890,7 @@
         </w:tc>
         <w:tc>
           <w:tcPr>
-            <w:tcW w:type="dxa" w:w="680"/>
+            <w:tcW w:type="dxa" w:w="624"/>
           </w:tcPr>
           <w:p>
             <w:pPr>
@@ -7490,7 +7910,7 @@
         </w:tc>
         <w:tc>
           <w:tcPr>
-            <w:tcW w:type="dxa" w:w="680"/>
+            <w:tcW w:type="dxa" w:w="624"/>
           </w:tcPr>
           <w:p>
             <w:pPr>
@@ -7510,7 +7930,7 @@
         </w:tc>
         <w:tc>
           <w:tcPr>
-            <w:tcW w:type="dxa" w:w="680"/>
+            <w:tcW w:type="dxa" w:w="624"/>
           </w:tcPr>
           <w:p>
             <w:pPr>
@@ -7530,7 +7950,7 @@
         </w:tc>
         <w:tc>
           <w:tcPr>
-            <w:tcW w:type="dxa" w:w="680"/>
+            <w:tcW w:type="dxa" w:w="624"/>
           </w:tcPr>
           <w:p>
             <w:pPr>
@@ -7550,21 +7970,41 @@
         </w:tc>
         <w:tc>
           <w:tcPr>
-            <w:tcW w:type="dxa" w:w="907"/>
-          </w:tcPr>
-          <w:p>
-            <w:pPr>
-              <w:spacing w:after="0"/>
-              <w:jc w:val="center"/>
-            </w:pPr>
-            <w:r/>
-            <w:r>
-              <w:rPr>
-                <w:b w:val="0"/>
-                <w:i w:val="0"/>
-                <w:sz w:val="20"/>
-              </w:rPr>
-              <w:t>24</w:t>
+            <w:tcW w:type="dxa" w:w="624"/>
+          </w:tcPr>
+          <w:p>
+            <w:pPr>
+              <w:spacing w:after="0"/>
+              <w:jc w:val="center"/>
+            </w:pPr>
+            <w:r/>
+            <w:r>
+              <w:rPr>
+                <w:b w:val="0"/>
+                <w:i w:val="0"/>
+                <w:sz w:val="20"/>
+              </w:rPr>
+              <w:t>5</w:t>
+            </w:r>
+          </w:p>
+        </w:tc>
+        <w:tc>
+          <w:tcPr>
+            <w:tcW w:type="dxa" w:w="850"/>
+          </w:tcPr>
+          <w:p>
+            <w:pPr>
+              <w:spacing w:after="0"/>
+              <w:jc w:val="center"/>
+            </w:pPr>
+            <w:r/>
+            <w:r>
+              <w:rPr>
+                <w:b w:val="0"/>
+                <w:i w:val="0"/>
+                <w:sz w:val="20"/>
+              </w:rPr>
+              <w:t>29</w:t>
             </w:r>
           </w:p>
         </w:tc>
@@ -7591,7 +8031,7 @@
         </w:tc>
         <w:tc>
           <w:tcPr>
-            <w:tcW w:type="dxa" w:w="2948"/>
+            <w:tcW w:type="dxa" w:w="2608"/>
           </w:tcPr>
           <w:p>
             <w:pPr>
@@ -7610,7 +8050,7 @@
         </w:tc>
         <w:tc>
           <w:tcPr>
-            <w:tcW w:type="dxa" w:w="680"/>
+            <w:tcW w:type="dxa" w:w="624"/>
           </w:tcPr>
           <w:p>
             <w:pPr>
@@ -7630,7 +8070,7 @@
         </w:tc>
         <w:tc>
           <w:tcPr>
-            <w:tcW w:type="dxa" w:w="680"/>
+            <w:tcW w:type="dxa" w:w="624"/>
           </w:tcPr>
           <w:p>
             <w:pPr>
@@ -7650,7 +8090,7 @@
         </w:tc>
         <w:tc>
           <w:tcPr>
-            <w:tcW w:type="dxa" w:w="680"/>
+            <w:tcW w:type="dxa" w:w="624"/>
           </w:tcPr>
           <w:p>
             <w:pPr>
@@ -7670,7 +8110,7 @@
         </w:tc>
         <w:tc>
           <w:tcPr>
-            <w:tcW w:type="dxa" w:w="680"/>
+            <w:tcW w:type="dxa" w:w="624"/>
           </w:tcPr>
           <w:p>
             <w:pPr>
@@ -7690,7 +8130,7 @@
         </w:tc>
         <w:tc>
           <w:tcPr>
-            <w:tcW w:type="dxa" w:w="680"/>
+            <w:tcW w:type="dxa" w:w="624"/>
           </w:tcPr>
           <w:p>
             <w:pPr>
@@ -7710,21 +8150,41 @@
         </w:tc>
         <w:tc>
           <w:tcPr>
-            <w:tcW w:type="dxa" w:w="907"/>
-          </w:tcPr>
-          <w:p>
-            <w:pPr>
-              <w:spacing w:after="0"/>
-              <w:jc w:val="center"/>
-            </w:pPr>
-            <w:r/>
-            <w:r>
-              <w:rPr>
-                <w:b w:val="0"/>
-                <w:i w:val="0"/>
-                <w:sz w:val="20"/>
-              </w:rPr>
-              <w:t>23</w:t>
+            <w:tcW w:type="dxa" w:w="624"/>
+          </w:tcPr>
+          <w:p>
+            <w:pPr>
+              <w:spacing w:after="0"/>
+              <w:jc w:val="center"/>
+            </w:pPr>
+            <w:r/>
+            <w:r>
+              <w:rPr>
+                <w:b w:val="0"/>
+                <w:i w:val="0"/>
+                <w:sz w:val="20"/>
+              </w:rPr>
+              <w:t>5</w:t>
+            </w:r>
+          </w:p>
+        </w:tc>
+        <w:tc>
+          <w:tcPr>
+            <w:tcW w:type="dxa" w:w="850"/>
+          </w:tcPr>
+          <w:p>
+            <w:pPr>
+              <w:spacing w:after="0"/>
+              <w:jc w:val="center"/>
+            </w:pPr>
+            <w:r/>
+            <w:r>
+              <w:rPr>
+                <w:b w:val="0"/>
+                <w:i w:val="0"/>
+                <w:sz w:val="20"/>
+              </w:rPr>
+              <w:t>28</w:t>
             </w:r>
           </w:p>
         </w:tc>
@@ -7751,7 +8211,7 @@
         </w:tc>
         <w:tc>
           <w:tcPr>
-            <w:tcW w:type="dxa" w:w="2948"/>
+            <w:tcW w:type="dxa" w:w="2608"/>
           </w:tcPr>
           <w:p>
             <w:pPr>
@@ -7770,7 +8230,7 @@
         </w:tc>
         <w:tc>
           <w:tcPr>
-            <w:tcW w:type="dxa" w:w="680"/>
+            <w:tcW w:type="dxa" w:w="624"/>
           </w:tcPr>
           <w:p>
             <w:pPr>
@@ -7790,7 +8250,7 @@
         </w:tc>
         <w:tc>
           <w:tcPr>
-            <w:tcW w:type="dxa" w:w="680"/>
+            <w:tcW w:type="dxa" w:w="624"/>
           </w:tcPr>
           <w:p>
             <w:pPr>
@@ -7810,7 +8270,7 @@
         </w:tc>
         <w:tc>
           <w:tcPr>
-            <w:tcW w:type="dxa" w:w="680"/>
+            <w:tcW w:type="dxa" w:w="624"/>
           </w:tcPr>
           <w:p>
             <w:pPr>
@@ -7830,7 +8290,7 @@
         </w:tc>
         <w:tc>
           <w:tcPr>
-            <w:tcW w:type="dxa" w:w="680"/>
+            <w:tcW w:type="dxa" w:w="624"/>
           </w:tcPr>
           <w:p>
             <w:pPr>
@@ -7850,7 +8310,7 @@
         </w:tc>
         <w:tc>
           <w:tcPr>
-            <w:tcW w:type="dxa" w:w="680"/>
+            <w:tcW w:type="dxa" w:w="624"/>
           </w:tcPr>
           <w:p>
             <w:pPr>
@@ -7870,21 +8330,41 @@
         </w:tc>
         <w:tc>
           <w:tcPr>
-            <w:tcW w:type="dxa" w:w="907"/>
-          </w:tcPr>
-          <w:p>
-            <w:pPr>
-              <w:spacing w:after="0"/>
-              <w:jc w:val="center"/>
-            </w:pPr>
-            <w:r/>
-            <w:r>
-              <w:rPr>
-                <w:b w:val="0"/>
-                <w:i w:val="0"/>
-                <w:sz w:val="20"/>
-              </w:rPr>
-              <w:t>24</w:t>
+            <w:tcW w:type="dxa" w:w="624"/>
+          </w:tcPr>
+          <w:p>
+            <w:pPr>
+              <w:spacing w:after="0"/>
+              <w:jc w:val="center"/>
+            </w:pPr>
+            <w:r/>
+            <w:r>
+              <w:rPr>
+                <w:b w:val="0"/>
+                <w:i w:val="0"/>
+                <w:sz w:val="20"/>
+              </w:rPr>
+              <w:t>4</w:t>
+            </w:r>
+          </w:p>
+        </w:tc>
+        <w:tc>
+          <w:tcPr>
+            <w:tcW w:type="dxa" w:w="850"/>
+          </w:tcPr>
+          <w:p>
+            <w:pPr>
+              <w:spacing w:after="0"/>
+              <w:jc w:val="center"/>
+            </w:pPr>
+            <w:r/>
+            <w:r>
+              <w:rPr>
+                <w:b w:val="0"/>
+                <w:i w:val="0"/>
+                <w:sz w:val="20"/>
+              </w:rPr>
+              <w:t>28</w:t>
             </w:r>
           </w:p>
         </w:tc>
@@ -7911,7 +8391,7 @@
         </w:tc>
         <w:tc>
           <w:tcPr>
-            <w:tcW w:type="dxa" w:w="2948"/>
+            <w:tcW w:type="dxa" w:w="2608"/>
           </w:tcPr>
           <w:p>
             <w:pPr>
@@ -7930,7 +8410,7 @@
         </w:tc>
         <w:tc>
           <w:tcPr>
-            <w:tcW w:type="dxa" w:w="680"/>
+            <w:tcW w:type="dxa" w:w="624"/>
           </w:tcPr>
           <w:p>
             <w:pPr>
@@ -7950,7 +8430,7 @@
         </w:tc>
         <w:tc>
           <w:tcPr>
-            <w:tcW w:type="dxa" w:w="680"/>
+            <w:tcW w:type="dxa" w:w="624"/>
           </w:tcPr>
           <w:p>
             <w:pPr>
@@ -7970,7 +8450,7 @@
         </w:tc>
         <w:tc>
           <w:tcPr>
-            <w:tcW w:type="dxa" w:w="680"/>
+            <w:tcW w:type="dxa" w:w="624"/>
           </w:tcPr>
           <w:p>
             <w:pPr>
@@ -7990,7 +8470,7 @@
         </w:tc>
         <w:tc>
           <w:tcPr>
-            <w:tcW w:type="dxa" w:w="680"/>
+            <w:tcW w:type="dxa" w:w="624"/>
           </w:tcPr>
           <w:p>
             <w:pPr>
@@ -8010,7 +8490,7 @@
         </w:tc>
         <w:tc>
           <w:tcPr>
-            <w:tcW w:type="dxa" w:w="680"/>
+            <w:tcW w:type="dxa" w:w="624"/>
           </w:tcPr>
           <w:p>
             <w:pPr>
@@ -8030,21 +8510,41 @@
         </w:tc>
         <w:tc>
           <w:tcPr>
-            <w:tcW w:type="dxa" w:w="907"/>
-          </w:tcPr>
-          <w:p>
-            <w:pPr>
-              <w:spacing w:after="0"/>
-              <w:jc w:val="center"/>
-            </w:pPr>
-            <w:r/>
-            <w:r>
-              <w:rPr>
-                <w:b w:val="0"/>
-                <w:i w:val="0"/>
-                <w:sz w:val="20"/>
-              </w:rPr>
-              <w:t>22</w:t>
+            <w:tcW w:type="dxa" w:w="624"/>
+          </w:tcPr>
+          <w:p>
+            <w:pPr>
+              <w:spacing w:after="0"/>
+              <w:jc w:val="center"/>
+            </w:pPr>
+            <w:r/>
+            <w:r>
+              <w:rPr>
+                <w:b w:val="0"/>
+                <w:i w:val="0"/>
+                <w:sz w:val="20"/>
+              </w:rPr>
+              <w:t>4</w:t>
+            </w:r>
+          </w:p>
+        </w:tc>
+        <w:tc>
+          <w:tcPr>
+            <w:tcW w:type="dxa" w:w="850"/>
+          </w:tcPr>
+          <w:p>
+            <w:pPr>
+              <w:spacing w:after="0"/>
+              <w:jc w:val="center"/>
+            </w:pPr>
+            <w:r/>
+            <w:r>
+              <w:rPr>
+                <w:b w:val="0"/>
+                <w:i w:val="0"/>
+                <w:sz w:val="20"/>
+              </w:rPr>
+              <w:t>26</w:t>
             </w:r>
           </w:p>
         </w:tc>
@@ -8071,7 +8571,7 @@
         </w:tc>
         <w:tc>
           <w:tcPr>
-            <w:tcW w:type="dxa" w:w="2948"/>
+            <w:tcW w:type="dxa" w:w="2608"/>
           </w:tcPr>
           <w:p>
             <w:pPr>
@@ -8090,7 +8590,7 @@
         </w:tc>
         <w:tc>
           <w:tcPr>
-            <w:tcW w:type="dxa" w:w="680"/>
+            <w:tcW w:type="dxa" w:w="624"/>
           </w:tcPr>
           <w:p>
             <w:pPr>
@@ -8110,7 +8610,7 @@
         </w:tc>
         <w:tc>
           <w:tcPr>
-            <w:tcW w:type="dxa" w:w="680"/>
+            <w:tcW w:type="dxa" w:w="624"/>
           </w:tcPr>
           <w:p>
             <w:pPr>
@@ -8130,7 +8630,7 @@
         </w:tc>
         <w:tc>
           <w:tcPr>
-            <w:tcW w:type="dxa" w:w="680"/>
+            <w:tcW w:type="dxa" w:w="624"/>
           </w:tcPr>
           <w:p>
             <w:pPr>
@@ -8150,7 +8650,7 @@
         </w:tc>
         <w:tc>
           <w:tcPr>
-            <w:tcW w:type="dxa" w:w="680"/>
+            <w:tcW w:type="dxa" w:w="624"/>
           </w:tcPr>
           <w:p>
             <w:pPr>
@@ -8170,7 +8670,7 @@
         </w:tc>
         <w:tc>
           <w:tcPr>
-            <w:tcW w:type="dxa" w:w="680"/>
+            <w:tcW w:type="dxa" w:w="624"/>
           </w:tcPr>
           <w:p>
             <w:pPr>
@@ -8190,21 +8690,41 @@
         </w:tc>
         <w:tc>
           <w:tcPr>
-            <w:tcW w:type="dxa" w:w="907"/>
-          </w:tcPr>
-          <w:p>
-            <w:pPr>
-              <w:spacing w:after="0"/>
-              <w:jc w:val="center"/>
-            </w:pPr>
-            <w:r/>
-            <w:r>
-              <w:rPr>
-                <w:b w:val="0"/>
-                <w:i w:val="0"/>
-                <w:sz w:val="20"/>
-              </w:rPr>
-              <w:t>24</w:t>
+            <w:tcW w:type="dxa" w:w="624"/>
+          </w:tcPr>
+          <w:p>
+            <w:pPr>
+              <w:spacing w:after="0"/>
+              <w:jc w:val="center"/>
+            </w:pPr>
+            <w:r/>
+            <w:r>
+              <w:rPr>
+                <w:b w:val="0"/>
+                <w:i w:val="0"/>
+                <w:sz w:val="20"/>
+              </w:rPr>
+              <w:t>5</w:t>
+            </w:r>
+          </w:p>
+        </w:tc>
+        <w:tc>
+          <w:tcPr>
+            <w:tcW w:type="dxa" w:w="850"/>
+          </w:tcPr>
+          <w:p>
+            <w:pPr>
+              <w:spacing w:after="0"/>
+              <w:jc w:val="center"/>
+            </w:pPr>
+            <w:r/>
+            <w:r>
+              <w:rPr>
+                <w:b w:val="0"/>
+                <w:i w:val="0"/>
+                <w:sz w:val="20"/>
+              </w:rPr>
+              <w:t>29</w:t>
             </w:r>
           </w:p>
         </w:tc>
@@ -8505,7 +9025,7 @@
                 <w:i w:val="0"/>
                 <w:sz w:val="20"/>
               </w:rPr>
-              <w:t>0</w:t>
+              <w:t>1</w:t>
             </w:r>
           </w:p>
         </w:tc>
@@ -8545,7 +9065,7 @@
                 <w:i w:val="0"/>
                 <w:sz w:val="20"/>
               </w:rPr>
-              <w:t>5</w:t>
+              <w:t>6</w:t>
             </w:r>
           </w:p>
         </w:tc>
@@ -8646,7 +9166,7 @@
                 <w:i w:val="0"/>
                 <w:sz w:val="20"/>
               </w:rPr>
-              <w:t>2</w:t>
+              <w:t>3</w:t>
             </w:r>
           </w:p>
         </w:tc>
@@ -8686,7 +9206,7 @@
                 <w:i w:val="0"/>
                 <w:sz w:val="20"/>
               </w:rPr>
-              <w:t>5</w:t>
+              <w:t>6</w:t>
             </w:r>
           </w:p>
         </w:tc>
@@ -8807,7 +9327,7 @@
                 <w:i w:val="0"/>
                 <w:sz w:val="20"/>
               </w:rPr>
-              <w:t>4</w:t>
+              <w:t>5</w:t>
             </w:r>
           </w:p>
         </w:tc>
@@ -8827,7 +9347,7 @@
                 <w:i w:val="0"/>
                 <w:sz w:val="20"/>
               </w:rPr>
-              <w:t>5</w:t>
+              <w:t>6</w:t>
             </w:r>
           </w:p>
         </w:tc>
@@ -8928,7 +9448,7 @@
                 <w:i w:val="0"/>
                 <w:sz w:val="20"/>
               </w:rPr>
-              <w:t>0</w:t>
+              <w:t>1</w:t>
             </w:r>
           </w:p>
         </w:tc>
@@ -8968,7 +9488,7 @@
                 <w:i w:val="0"/>
                 <w:sz w:val="20"/>
               </w:rPr>
-              <w:t>5</w:t>
+              <w:t>6</w:t>
             </w:r>
           </w:p>
         </w:tc>
@@ -9089,7 +9609,7 @@
                 <w:i w:val="0"/>
                 <w:sz w:val="20"/>
               </w:rPr>
-              <w:t>3</w:t>
+              <w:t>4</w:t>
             </w:r>
           </w:p>
         </w:tc>
@@ -9109,7 +9629,7 @@
                 <w:i w:val="0"/>
                 <w:sz w:val="20"/>
               </w:rPr>
-              <w:t>5</w:t>
+              <w:t>6</w:t>
             </w:r>
           </w:p>
         </w:tc>
@@ -9210,7 +9730,7 @@
                 <w:i w:val="0"/>
                 <w:sz w:val="20"/>
               </w:rPr>
-              <w:t>4</w:t>
+              <w:t>5</w:t>
             </w:r>
           </w:p>
         </w:tc>
@@ -9250,7 +9770,7 @@
                 <w:i w:val="0"/>
                 <w:sz w:val="20"/>
               </w:rPr>
-              <w:t>5</w:t>
+              <w:t>6</w:t>
             </w:r>
           </w:p>
         </w:tc>
@@ -9351,7 +9871,7 @@
                 <w:i w:val="0"/>
                 <w:sz w:val="20"/>
               </w:rPr>
-              <w:t>1</w:t>
+              <w:t>2</w:t>
             </w:r>
           </w:p>
         </w:tc>
@@ -9391,7 +9911,7 @@
                 <w:i w:val="0"/>
                 <w:sz w:val="20"/>
               </w:rPr>
-              <w:t>5</w:t>
+              <w:t>6</w:t>
             </w:r>
           </w:p>
         </w:tc>
@@ -9492,7 +10012,7 @@
                 <w:i w:val="0"/>
                 <w:sz w:val="20"/>
               </w:rPr>
-              <w:t>3</w:t>
+              <w:t>4</w:t>
             </w:r>
           </w:p>
         </w:tc>
@@ -9532,7 +10052,7 @@
                 <w:i w:val="0"/>
                 <w:sz w:val="20"/>
               </w:rPr>
-              <w:t>5</w:t>
+              <w:t>6</w:t>
             </w:r>
           </w:p>
         </w:tc>
@@ -9653,7 +10173,7 @@
                 <w:i w:val="0"/>
                 <w:sz w:val="20"/>
               </w:rPr>
-              <w:t>3</w:t>
+              <w:t>4</w:t>
             </w:r>
           </w:p>
         </w:tc>
@@ -9673,7 +10193,7 @@
                 <w:i w:val="0"/>
                 <w:sz w:val="20"/>
               </w:rPr>
-              <w:t>5</w:t>
+              <w:t>6</w:t>
             </w:r>
           </w:p>
         </w:tc>
@@ -9794,7 +10314,7 @@
                 <w:i w:val="0"/>
                 <w:sz w:val="20"/>
               </w:rPr>
-              <w:t>4</w:t>
+              <w:t>5</w:t>
             </w:r>
           </w:p>
         </w:tc>
@@ -9814,7 +10334,7 @@
                 <w:i w:val="0"/>
                 <w:sz w:val="20"/>
               </w:rPr>
-              <w:t>5</w:t>
+              <w:t>6</w:t>
             </w:r>
           </w:p>
         </w:tc>
@@ -9935,7 +10455,7 @@
                 <w:i w:val="0"/>
                 <w:sz w:val="20"/>
               </w:rPr>
-              <w:t>4</w:t>
+              <w:t>5</w:t>
             </w:r>
           </w:p>
         </w:tc>
@@ -9955,7 +10475,7 @@
                 <w:i w:val="0"/>
                 <w:sz w:val="20"/>
               </w:rPr>
-              <w:t>5</w:t>
+              <w:t>6</w:t>
             </w:r>
           </w:p>
         </w:tc>
@@ -10056,7 +10576,7 @@
                 <w:i w:val="0"/>
                 <w:sz w:val="20"/>
               </w:rPr>
-              <w:t>3</w:t>
+              <w:t>4</w:t>
             </w:r>
           </w:p>
         </w:tc>
@@ -10096,7 +10616,7 @@
                 <w:i w:val="0"/>
                 <w:sz w:val="20"/>
               </w:rPr>
-              <w:t>5</w:t>
+              <w:t>6</w:t>
             </w:r>
           </w:p>
         </w:tc>
@@ -10197,7 +10717,7 @@
                 <w:i w:val="0"/>
                 <w:sz w:val="20"/>
               </w:rPr>
-              <w:t>2</w:t>
+              <w:t>3</w:t>
             </w:r>
           </w:p>
         </w:tc>
@@ -10237,7 +10757,7 @@
                 <w:i w:val="0"/>
                 <w:sz w:val="20"/>
               </w:rPr>
-              <w:t>5</w:t>
+              <w:t>6</w:t>
             </w:r>
           </w:p>
         </w:tc>
@@ -10338,7 +10858,7 @@
                 <w:i w:val="0"/>
                 <w:sz w:val="20"/>
               </w:rPr>
-              <w:t>0</w:t>
+              <w:t>1</w:t>
             </w:r>
           </w:p>
         </w:tc>
@@ -10378,7 +10898,7 @@
                 <w:i w:val="0"/>
                 <w:sz w:val="20"/>
               </w:rPr>
-              <w:t>5</w:t>
+              <w:t>6</w:t>
             </w:r>
           </w:p>
         </w:tc>
@@ -10499,7 +11019,7 @@
                 <w:i w:val="0"/>
                 <w:sz w:val="20"/>
               </w:rPr>
-              <w:t>3</w:t>
+              <w:t>4</w:t>
             </w:r>
           </w:p>
         </w:tc>
@@ -10519,7 +11039,7 @@
                 <w:i w:val="0"/>
                 <w:sz w:val="20"/>
               </w:rPr>
-              <w:t>5</w:t>
+              <w:t>6</w:t>
             </w:r>
           </w:p>
         </w:tc>
@@ -10640,7 +11160,7 @@
                 <w:i w:val="0"/>
                 <w:sz w:val="20"/>
               </w:rPr>
-              <w:t>4</w:t>
+              <w:t>5</w:t>
             </w:r>
           </w:p>
         </w:tc>
@@ -10660,7 +11180,7 @@
                 <w:i w:val="0"/>
                 <w:sz w:val="20"/>
               </w:rPr>
-              <w:t>5</w:t>
+              <w:t>6</w:t>
             </w:r>
           </w:p>
         </w:tc>
@@ -10781,7 +11301,7 @@
                 <w:i w:val="0"/>
                 <w:sz w:val="20"/>
               </w:rPr>
-              <w:t>3</w:t>
+              <w:t>4</w:t>
             </w:r>
           </w:p>
         </w:tc>
@@ -10801,7 +11321,7 @@
                 <w:i w:val="0"/>
                 <w:sz w:val="20"/>
               </w:rPr>
-              <w:t>5</w:t>
+              <w:t>6</w:t>
             </w:r>
           </w:p>
         </w:tc>
@@ -10902,7 +11422,7 @@
                 <w:i w:val="0"/>
                 <w:sz w:val="20"/>
               </w:rPr>
-              <w:t>1</w:t>
+              <w:t>2</w:t>
             </w:r>
           </w:p>
         </w:tc>
@@ -10942,7 +11462,7 @@
                 <w:i w:val="0"/>
                 <w:sz w:val="20"/>
               </w:rPr>
-              <w:t>5</w:t>
+              <w:t>6</w:t>
             </w:r>
           </w:p>
         </w:tc>
@@ -11043,7 +11563,7 @@
                 <w:i w:val="0"/>
                 <w:sz w:val="20"/>
               </w:rPr>
-              <w:t>3</w:t>
+              <w:t>4</w:t>
             </w:r>
           </w:p>
         </w:tc>
@@ -11083,7 +11603,7 @@
                 <w:i w:val="0"/>
                 <w:sz w:val="20"/>
               </w:rPr>
-              <w:t>5</w:t>
+              <w:t>6</w:t>
             </w:r>
           </w:p>
         </w:tc>
@@ -11204,7 +11724,7 @@
                 <w:i w:val="0"/>
                 <w:sz w:val="20"/>
               </w:rPr>
-              <w:t>4</w:t>
+              <w:t>5</w:t>
             </w:r>
           </w:p>
         </w:tc>
@@ -11224,7 +11744,7 @@
                 <w:i w:val="0"/>
                 <w:sz w:val="20"/>
               </w:rPr>
-              <w:t>5</w:t>
+              <w:t>6</w:t>
             </w:r>
           </w:p>
         </w:tc>
@@ -11325,7 +11845,7 @@
                 <w:i w:val="0"/>
                 <w:sz w:val="20"/>
               </w:rPr>
-              <w:t>32</w:t>
+              <w:t>43</w:t>
             </w:r>
           </w:p>
         </w:tc>
@@ -11345,7 +11865,7 @@
                 <w:i w:val="0"/>
                 <w:sz w:val="20"/>
               </w:rPr>
-              <w:t>68</w:t>
+              <w:t>77</w:t>
             </w:r>
           </w:p>
         </w:tc>
@@ -11365,7 +11885,7 @@
                 <w:i w:val="0"/>
                 <w:sz w:val="20"/>
               </w:rPr>
-              <w:t>100</w:t>
+              <w:t>120</w:t>
             </w:r>
           </w:p>
         </w:tc>
@@ -11396,7 +11916,7 @@
           <w:b w:val="0"/>
           <w:i w:val="0"/>
         </w:rPr>
-        <w:t>Dari 100 penilaian (20 KPI × 5 pakar), sebanyak 68 penilaian bernilai 5 (Sangat Sesuai) dan 32 penilaian bernilai 4 (Sesuai); tidak ada KPI yang dinilai 1–3. Pengolahan data ini untuk menetapkan KPI final diuraikan pada Bab V. KPI final selanjutnya disusun dalam struktur hierarki untuk dibobot dengan Analytical Hierarchy Process (AHP), yaitu metode pengambilan keputusan melalui perbandingan berpasangan antarkriteria (Saaty, 1980, 2008).</w:t>
+        <w:t>Dari 120 penilaian (20 KPI × 6 pakar), sebanyak 77 penilaian bernilai 5 (Sangat Sesuai) dan 43 penilaian bernilai 4 (Sesuai); tidak ada KPI yang dinilai 1–3. Pengolahan data ini untuk menetapkan KPI final diuraikan pada Bab V. KPI final selanjutnya disusun dalam struktur hierarki untuk dibobot dengan Analytical Hierarchy Process (AHP), yaitu metode pengambilan keputusan melalui perbandingan berpasangan antarkriteria (Saaty, 1980, 2008).</w:t>
       </w:r>
     </w:p>
     <w:p>
@@ -27009,7 +27529,7 @@
                 <w:i w:val="0"/>
                 <w:sz w:val="20"/>
               </w:rPr>
-              <w:t>Kuesioner validasi KPI (5 pakar × 20 KPI)</w:t>
+              <w:t>Kuesioner validasi KPI (6 pakar × 20 KPI)</w:t>
             </w:r>
           </w:p>
         </w:tc>

</xml_diff>

<commit_message>
Bab IV songkok: add company history and organisation chart
Co-Authored-By: Claude Opus 5.5 <noreply@anthropic.com>
Claude-Session: https://claude.ai/code/session_01Lq2itNFduhRUYgLXz2GTxG
</commit_message>
<xml_diff>
--- a/skripsi/BAB-IV-Pengumpulan-Data-Songkok.docx
+++ b/skripsi/BAB-IV-Pengumpulan-Data-Songkok.docx
@@ -109,15 +109,35 @@
           <w:b w:val="0"/>
           <w:i w:val="0"/>
         </w:rPr>
-        <w:t xml:space="preserve">CV Putra Pondok Indah merupakan UMKM produsen songkok yang berlokasi di Bungah, Kabupaten Gresik, Jawa Timur. Perusahaan memproduksi 24 varian songkok yang terdiri atas 8 varian polos (Non-AC, AC, Full AC, dan susun) dan 16 varian bermotif bordir. Penjualan dilakukan dalam satuan kodi (1 kodi = 20 pcs) dengan harga Rp760.000–Rp1.100.000 per kodi. </w:t>
+        <w:t>CV Putra Pondok Indah merupakan usaha konveksi di bidang industri tekstil yang memproduksi songkok dengan merek Pondok Indah dan berlokasi di Bungah, Kabupaten Gresik, Jawa Timur. Usaha ini didirikan pada tahun 1991 oleh H. Khusnul Ma’arif bin Abdullah, kemudian diteruskan oleh putranya, Dr. M. Jamaluddin, M.Pd., yang saat ini menjadi pemilik perusahaan. Pada awal berdirinya, usaha ini hanya menjual songkok jadi yang dibeli dari pengrajin atau pemasok lain. Usaha tersebut kemudian berkembang hingga mampu memproduksi songkok secara mandiri dan menerima pesanan khusus (custom) dengan label Pondok Indah.</w:t>
       </w:r>
+    </w:p>
+    <w:p>
+      <w:pPr>
+        <w:spacing w:line="360" w:lineRule="auto" w:after="120"/>
+        <w:ind w:firstLine="709"/>
+        <w:jc w:val="both"/>
+      </w:pPr>
       <w:r>
         <w:rPr>
           <w:b w:val="0"/>
           <w:i w:val="0"/>
-          <w:highlight w:val="yellow"/>
         </w:rPr>
-        <w:t>[Lengkapi: tahun berdiri, sejarah singkat, jumlah tenaga kerja tetap dan borongan, kapasitas produksi normal, wilayah pemasaran.]</w:t>
+        <w:t>Seiring perkembangannya, usaha yang semula belum berbadan usaha berubah menjadi Usaha Dagang (UD) pada tahun 2001, kemudian menjadi persekutuan komanditer (CV) pada tahun 2023. Pada tahun 2025 perusahaan memperoleh sertifikat halal. Perusahaan berkomitmen menghasilkan songkok berkualitas yang memadukan unsur tradisional dan modern. Produk dipasarkan melalui 11 reseller/toko yang tersebar di dua provinsi, yaitu 4 di Jawa Timur dan 7 di Jawa Tengah.</w:t>
+      </w:r>
+    </w:p>
+    <w:p>
+      <w:pPr>
+        <w:spacing w:line="360" w:lineRule="auto" w:after="120"/>
+        <w:ind w:firstLine="709"/>
+        <w:jc w:val="both"/>
+      </w:pPr>
+      <w:r>
+        <w:rPr>
+          <w:b w:val="0"/>
+          <w:i w:val="0"/>
+        </w:rPr>
+        <w:t>Perusahaan memproduksi 24 varian songkok yang terdiri atas 8 varian polos (Non-AC, AC, Full AC, dan susun) dan 16 varian bermotif bordir. Penjualan dilakukan dalam satuan kodi (1 kodi = 20 pcs) dengan harga Rp760.000–Rp1.100.000 per kodi.</w:t>
       </w:r>
     </w:p>
     <w:p>
@@ -149,16 +169,42 @@
     </w:p>
     <w:p>
       <w:pPr>
-        <w:spacing w:line="360" w:lineRule="auto" w:after="120"/>
+        <w:spacing w:after="40"/>
         <w:jc w:val="center"/>
       </w:pPr>
       <w:r>
-        <w:rPr>
-          <w:b w:val="0"/>
-          <w:i w:val="0"/>
-          <w:highlight w:val="yellow"/>
-        </w:rPr>
-        <w:t>[Sisipkan bagan struktur organisasi: pemilik, bagian produksi, bagian gudang dan logistik, bagian penjahitan, bagian finishing dan packaging, pengrajin]</w:t>
+        <w:drawing>
+          <wp:inline xmlns:a="http://schemas.openxmlformats.org/drawingml/2006/main" xmlns:pic="http://schemas.openxmlformats.org/drawingml/2006/picture">
+            <wp:extent cx="5220000" cy="4027234"/>
+            <wp:docPr id="1" name="Picture 1"/>
+            <wp:cNvGraphicFramePr>
+              <a:graphicFrameLocks noChangeAspect="1"/>
+            </wp:cNvGraphicFramePr>
+            <a:graphic>
+              <a:graphicData uri="http://schemas.openxmlformats.org/drawingml/2006/picture">
+                <pic:pic>
+                  <pic:nvPicPr>
+                    <pic:cNvPr id="0" name="struktur.png"/>
+                    <pic:cNvPicPr/>
+                  </pic:nvPicPr>
+                  <pic:blipFill>
+                    <a:blip r:embed="rId9"/>
+                    <a:stretch>
+                      <a:fillRect/>
+                    </a:stretch>
+                  </pic:blipFill>
+                  <pic:spPr>
+                    <a:xfrm>
+                      <a:off x="0" y="0"/>
+                      <a:ext cx="5220000" cy="4027234"/>
+                    </a:xfrm>
+                    <a:prstGeom prst="rect"/>
+                  </pic:spPr>
+                </pic:pic>
+              </a:graphicData>
+            </a:graphic>
+          </wp:inline>
+        </w:drawing>
       </w:r>
     </w:p>
     <w:p>
@@ -185,7 +231,36 @@
           <w:i w:val="0"/>
           <w:sz w:val="20"/>
         </w:rPr>
-        <w:t>Sumber: CV Putra Pondok Indah</w:t>
+        <w:t>Sumber: CV Putra Pondok Indah, 2025</w:t>
+      </w:r>
+    </w:p>
+    <w:p>
+      <w:pPr>
+        <w:spacing w:line="360" w:lineRule="auto" w:after="120"/>
+        <w:ind w:firstLine="709"/>
+        <w:jc w:val="both"/>
+      </w:pPr>
+      <w:r>
+        <w:rPr>
+          <w:b w:val="0"/>
+          <w:i w:val="0"/>
+        </w:rPr>
+        <w:t xml:space="preserve">Berdasarkan Gambar 4.1, pemilik berada pada posisi tertinggi dan membawahi bagian produksi yang dipimpin oleh seorang kepala produksi. Bagian produksi membawahi tiga bagian, yaitu bagian gudang/persediaan (2 orang), bagian penjahitan (10 orang), dan bagian packaging (4 orang), sehingga jumlah tenaga kerja tetap di luar pemilik adalah 17 orang. Pada musim puncak, perusahaan menambah tenaga borongan </w:t>
+      </w:r>
+      <w:r>
+        <w:rPr>
+          <w:b w:val="0"/>
+          <w:i w:val="0"/>
+          <w:highlight w:val="yellow"/>
+        </w:rPr>
+        <w:t>[jumlah tenaga borongan pada musim puncak 2025]</w:t>
+      </w:r>
+      <w:r>
+        <w:rPr>
+          <w:b w:val="0"/>
+          <w:i w:val="0"/>
+        </w:rPr>
+        <w:t>. Struktur organisasi yang sederhana dengan pemilik yang terlibat langsung dalam pengambilan keputusan ini merupakan karakteristik umum UMKM (Garengo, Biazzo, &amp; Bititci, 2005).</w:t>
       </w:r>
     </w:p>
     <w:p>
@@ -1371,7 +1446,7 @@
           <w:b w:val="0"/>
           <w:i w:val="0"/>
         </w:rPr>
-        <w:t>Temuan pertama dan kedua menunjukkan pola musiman, yaitu pola permintaan yang meningkat pada periode tertentu dan berulang setiap tahun (Hyndman &amp; Athanasopoulos, 2021); pada data 2025 lonjakan terjadi pada periode Ramadan–Idulfitri. Ketika kapasitas produksi tidak disesuaikan dengan pola tersebut, perusahaan menghadapi kekurangan barang pada musim puncak dan kelebihan persediaan di luar musim puncak (Heizer, Render, &amp; Munson, 2020). Temuan keempat sejalan dengan karakteristik UMKM yang umumnya belum memiliki sistem pengukuran kinerja formal karena struktur organisasi yang informal dan keterbatasan sumber daya (Garengo, Biazzo, &amp; Bititci, 2005).</w:t>
+        <w:t>Temuan pertama dan kedua menunjukkan pola musiman, yaitu pola permintaan yang meningkat pada periode tertentu dan berulang setiap tahun (Hyndman &amp; Athanasopoulos, 2021); pada data 2025 lonjakan terjadi pada periode Ramadan–Idulfitri. Ketika kapasitas produksi tidak disesuaikan dengan pola tersebut, perusahaan menghadapi kekurangan barang pada musim puncak dan kelebihan persediaan di luar musim puncak (Heizer, Render, &amp; Munson, 2020). Temuan keempat sejalan dengan karakteristik UMKM yang umumnya belum memiliki sistem pengukuran kinerja formal karena struktur organisasi yang informal dan keterbatasan sumber daya (Garengo et al., 2005).</w:t>
       </w:r>
     </w:p>
     <w:p>
@@ -4132,7 +4207,7 @@
           <w:b w:val="0"/>
           <w:i w:val="0"/>
         </w:rPr>
-        <w:t>. Identitas pakar disajikan pada Tabel 4.7; nama pakar tidak dicantumkan dan diganti dengan kode E1–E6.</w:t>
+        <w:t>. Identitas pakar disajikan pada Tabel 4.7; nama pakar diganti dengan kode E1–E6. Pemetaan berdasarkan fungsi aktual terlihat pada E5: dalam struktur organisasi (Gambar 4.1) E5 tercatat pada bagian packaging, tetapi dalam praktik berperan sebagai pengrajin senior/tenaga kerja ahli, sehingga E5 mewakili fungsi pengrajin senior, sedangkan E6 mewakili fungsi finishing dan packaging.</w:t>
       </w:r>
     </w:p>
     <w:p>
@@ -17226,7 +17301,7 @@
         <w:drawing>
           <wp:inline xmlns:a="http://schemas.openxmlformats.org/drawingml/2006/main" xmlns:pic="http://schemas.openxmlformats.org/drawingml/2006/picture">
             <wp:extent cx="5400000" cy="2700000"/>
-            <wp:docPr id="1" name="Picture 1"/>
+            <wp:docPr id="2" name="Picture 2"/>
             <wp:cNvGraphicFramePr>
               <a:graphicFrameLocks noChangeAspect="1"/>
             </wp:cNvGraphicFramePr>
@@ -17238,7 +17313,7 @@
                     <pic:cNvPicPr/>
                   </pic:nvPicPr>
                   <pic:blipFill>
-                    <a:blip r:embed="rId9"/>
+                    <a:blip r:embed="rId10"/>
                     <a:stretch>
                       <a:fillRect/>
                     </a:stretch>
@@ -25610,9 +25685,17 @@
                 <w:b w:val="0"/>
                 <w:i w:val="0"/>
                 <w:sz w:val="20"/>
+              </w:rPr>
+              <w:t xml:space="preserve">17 orang / </w:t>
+            </w:r>
+            <w:r>
+              <w:rPr>
+                <w:b w:val="0"/>
+                <w:i w:val="0"/>
+                <w:sz w:val="20"/>
                 <w:highlight w:val="yellow"/>
               </w:rPr>
-              <w:t>[… / … orang]</w:t>
+              <w:t>[… orang pada musim puncak]</w:t>
             </w:r>
           </w:p>
         </w:tc>
@@ -25631,7 +25714,7 @@
                 <w:i w:val="0"/>
                 <w:sz w:val="20"/>
               </w:rPr>
-              <w:t>Wawancara pemilik</w:t>
+              <w:t>Gambar 4.1; wawancara pemilik</w:t>
             </w:r>
           </w:p>
         </w:tc>

</xml_diff>

<commit_message>
Bab IV songkok: describe one-tailor-per-package production and add process flow diagram
Co-Authored-By: Claude Opus 5.5 <noreply@anthropic.com>
Claude-Session: https://claude.ai/code/session_01Lq2itNFduhRUYgLXz2GTxG
</commit_message>
<xml_diff>
--- a/skripsi/BAB-IV-Pengumpulan-Data-Songkok.docx
+++ b/skripsi/BAB-IV-Pengumpulan-Data-Songkok.docx
@@ -287,21 +287,69 @@
           <w:b w:val="0"/>
           <w:i w:val="0"/>
         </w:rPr>
-        <w:t>Proses produksi songkok dimulai dari pemotongan kain beludru, penjahitan, pemasangan bos-bosan (lapisan dalam), pemasangan label, finishing, hingga pengemasan. Bahan baku utama terdiri atas kain beludru (yard), bos-bosan (kodi), dan label (lusin). Diagram alir proses produksi disajikan pada Gambar 4.2.</w:t>
+        <w:t xml:space="preserve">Proses produksi songkok di CV Putra Pondok Indah menggunakan sistem satu paket, yaitu setiap penjahit mengerjakan songkok secara utuh mulai dari pemotongan pola kain beludru, penjahitan badan dan tutup songkok, pemasangan bos-bosan (lapisan dalam), hingga pemasangan label atau motif bordir. Pekerjaan tidak dibagi per tahapan kepada pekerja yang berbeda seperti pada lini perakitan. Songkok yang telah selesai diserahkan kepada bagian packaging untuk diperiksa, dirapikan (finishing), dan dikemas per kodi, kemudian disimpan di gudang sebelum dikirim kepada reseller. </w:t>
       </w:r>
-    </w:p>
-    <w:p>
-      <w:pPr>
-        <w:spacing w:line="360" w:lineRule="auto" w:after="120"/>
-        <w:jc w:val="center"/>
-      </w:pPr>
       <w:r>
         <w:rPr>
           <w:b w:val="0"/>
           <w:i w:val="0"/>
           <w:highlight w:val="yellow"/>
         </w:rPr>
-        <w:t>[Sisipkan diagram alir proses produksi songkok sesuai hasil observasi]</w:t>
+        <w:t>[Konfirmasi: apakah pemotongan pola juga dilakukan oleh penjahit, dan apakah pemeriksaan kualitas dilakukan di bagian packaging.]</w:t>
+      </w:r>
+    </w:p>
+    <w:p>
+      <w:pPr>
+        <w:spacing w:line="360" w:lineRule="auto" w:after="120"/>
+        <w:ind w:firstLine="709"/>
+        <w:jc w:val="both"/>
+      </w:pPr>
+      <w:r>
+        <w:rPr>
+          <w:b w:val="0"/>
+          <w:i w:val="0"/>
+        </w:rPr>
+        <w:t>Sistem satu paket tersebut merupakan ciri produksi kerajinan (craft production), yaitu produksi yang mengandalkan pekerja terampil yang menguasai seluruh proses pembuatan produk dengan peralatan sederhana (Womack, Jones, &amp; Roos, 1990). Konsekuensinya, kapasitas produksi sangat bergantung pada jumlah dan keterampilan penjahit, sedangkan kualitas setiap songkok bergantung pada keahlian penjahit yang membuatnya. Kondisi ini menjadi dasar dimasukkannya dimensi Craft Workforce Capability dan indikator konsistensi kualitas dalam arsitektur KPI. Bahan baku utama terdiri atas kain beludru (yard), bos-bosan (kodi), dan label (lusin). Diagram alir proses produksi disajikan pada Gambar 4.2.</w:t>
+      </w:r>
+    </w:p>
+    <w:p>
+      <w:pPr>
+        <w:spacing w:after="40"/>
+        <w:jc w:val="center"/>
+      </w:pPr>
+      <w:r>
+        <w:drawing>
+          <wp:inline xmlns:a="http://schemas.openxmlformats.org/drawingml/2006/main" xmlns:pic="http://schemas.openxmlformats.org/drawingml/2006/picture">
+            <wp:extent cx="4500000" cy="4571053"/>
+            <wp:docPr id="2" name="Picture 2"/>
+            <wp:cNvGraphicFramePr>
+              <a:graphicFrameLocks noChangeAspect="1"/>
+            </wp:cNvGraphicFramePr>
+            <a:graphic>
+              <a:graphicData uri="http://schemas.openxmlformats.org/drawingml/2006/picture">
+                <pic:pic>
+                  <pic:nvPicPr>
+                    <pic:cNvPr id="0" name="alur.png"/>
+                    <pic:cNvPicPr/>
+                  </pic:nvPicPr>
+                  <pic:blipFill>
+                    <a:blip r:embed="rId10"/>
+                    <a:stretch>
+                      <a:fillRect/>
+                    </a:stretch>
+                  </pic:blipFill>
+                  <pic:spPr>
+                    <a:xfrm>
+                      <a:off x="0" y="0"/>
+                      <a:ext cx="4500000" cy="4571053"/>
+                    </a:xfrm>
+                    <a:prstGeom prst="rect"/>
+                  </pic:spPr>
+                </pic:pic>
+              </a:graphicData>
+            </a:graphic>
+          </wp:inline>
+        </w:drawing>
       </w:r>
     </w:p>
     <w:p>
@@ -328,7 +376,7 @@
           <w:i w:val="0"/>
           <w:sz w:val="20"/>
         </w:rPr>
-        <w:t>Sumber: Hasil observasi</w:t>
+        <w:t>Sumber: Hasil observasi dan wawancara, 2025</w:t>
       </w:r>
     </w:p>
     <w:p>
@@ -17301,7 +17349,7 @@
         <w:drawing>
           <wp:inline xmlns:a="http://schemas.openxmlformats.org/drawingml/2006/main" xmlns:pic="http://schemas.openxmlformats.org/drawingml/2006/picture">
             <wp:extent cx="5400000" cy="2700000"/>
-            <wp:docPr id="2" name="Picture 2"/>
+            <wp:docPr id="3" name="Picture 3"/>
             <wp:cNvGraphicFramePr>
               <a:graphicFrameLocks noChangeAspect="1"/>
             </wp:cNvGraphicFramePr>
@@ -17313,7 +17361,7 @@
                     <pic:cNvPicPr/>
                   </pic:nvPicPr>
                   <pic:blipFill>
-                    <a:blip r:embed="rId10"/>
+                    <a:blip r:embed="rId11"/>
                     <a:stretch>
                       <a:fillRect/>
                     </a:stretch>
@@ -26783,6 +26831,34 @@
           <w:i w:val="0"/>
         </w:rPr>
         <w:t>(7), 509–533.</w:t>
+      </w:r>
+    </w:p>
+    <w:p>
+      <w:pPr>
+        <w:spacing w:line="360" w:lineRule="auto" w:after="120"/>
+        <w:ind w:left="709" w:hanging="709"/>
+        <w:jc w:val="left"/>
+      </w:pPr>
+      <w:r>
+        <w:rPr>
+          <w:b w:val="0"/>
+          <w:i w:val="0"/>
+        </w:rPr>
+        <w:t xml:space="preserve">Womack, J. P., Jones, D. T., &amp; Roos, D. (1990). </w:t>
+      </w:r>
+      <w:r>
+        <w:rPr>
+          <w:b w:val="0"/>
+          <w:i/>
+        </w:rPr>
+        <w:t>The machine that changed the world</w:t>
+      </w:r>
+      <w:r>
+        <w:rPr>
+          <w:b w:val="0"/>
+          <w:i w:val="0"/>
+        </w:rPr>
+        <w:t>. Rawson Associates.</w:t>
       </w:r>
     </w:p>
     <w:sectPr>

</xml_diff>

<commit_message>
Bab IV songkok: record field observation of many piece-rate workers
Co-Authored-By: Claude Opus 5.5 <noreply@anthropic.com>
Claude-Session: https://claude.ai/code/session_01Lq2itNFduhRUYgLXz2GTxG
</commit_message>
<xml_diff>
--- a/skripsi/BAB-IV-Pengumpulan-Data-Songkok.docx
+++ b/skripsi/BAB-IV-Pengumpulan-Data-Songkok.docx
@@ -245,7 +245,7 @@
           <w:b w:val="0"/>
           <w:i w:val="0"/>
         </w:rPr>
-        <w:t xml:space="preserve">Berdasarkan Gambar 4.1, pemilik berada pada posisi tertinggi dan membawahi bagian produksi yang dipimpin oleh seorang kepala produksi. Bagian produksi membawahi tiga bagian, yaitu bagian gudang/persediaan (2 orang), bagian penjahitan (10 orang), dan bagian packaging (4 orang), sehingga jumlah tenaga kerja tetap di luar pemilik adalah 17 orang. Pada musim puncak, perusahaan menambah tenaga borongan </w:t>
+        <w:t xml:space="preserve">Berdasarkan Gambar 4.1, pemilik berada pada posisi tertinggi dan membawahi bagian produksi yang dipimpin oleh seorang kepala produksi. Bagian produksi membawahi tiga bagian, yaitu bagian gudang/persediaan (2 orang), bagian penjahitan (10 orang), dan bagian packaging (4 orang), sehingga jumlah tenaga kerja tetap di luar pemilik adalah 17 orang. Di luar tenaga kerja tetap tersebut, hasil observasi menunjukkan bahwa perusahaan mempekerjakan tenaga kerja borongan dalam jumlah banyak, yaitu pekerja yang dibayar berdasarkan jumlah hasil kerja </w:t>
       </w:r>
       <w:r>
         <w:rPr>
@@ -253,14 +253,14 @@
           <w:i w:val="0"/>
           <w:highlight w:val="yellow"/>
         </w:rPr>
-        <w:t>[jumlah tenaga borongan pada musim puncak 2025]</w:t>
+        <w:t>[jumlah tenaga borongan pada musim puncak dan di luar musim puncak 2025; sistem upah, misalnya per kodi; dikerjakan di tempat perusahaan atau di rumah]</w:t>
       </w:r>
       <w:r>
         <w:rPr>
           <w:b w:val="0"/>
           <w:i w:val="0"/>
         </w:rPr>
-        <w:t>. Struktur organisasi yang sederhana dengan pemilik yang terlibat langsung dalam pengambilan keputusan ini merupakan karakteristik umum UMKM (Garengo, Biazzo, &amp; Bititci, 2005).</w:t>
+        <w:t>. Tenaga borongan tidak tercantum dalam struktur organisasi karena bukan pekerja tetap. Struktur organisasi yang sederhana dengan pemilik yang terlibat langsung dalam pengambilan keputusan ini merupakan karakteristik umum UMKM (Garengo, Biazzo, &amp; Bititci, 2005).</w:t>
       </w:r>
     </w:p>
     <w:p>
@@ -1453,17 +1453,8 @@
                 <w:b w:val="0"/>
                 <w:i w:val="0"/>
                 <w:sz w:val="20"/>
-                <w:highlight w:val="yellow"/>
-              </w:rPr>
-              <w:t>[Konfirmasi]</w:t>
-            </w:r>
-            <w:r>
-              <w:rPr>
-                <w:b w:val="0"/>
-                <w:i w:val="0"/>
-                <w:sz w:val="20"/>
-              </w:rPr>
-              <w:t xml:space="preserve"> Peningkatan kapasitas saat musim puncak bergantung pada tenaga borongan musiman dan pengrajin terampil.</w:t>
+              </w:rPr>
+              <w:t>Perusahaan mempekerjakan tenaga borongan dalam jumlah banyak di luar 17 tenaga kerja tetap, sehingga kapasitas produksi, terutama pada musim puncak, bergantung pada ketersediaan tenaga borongan.</w:t>
             </w:r>
           </w:p>
         </w:tc>
@@ -1664,9 +1655,17 @@
                 <w:b w:val="0"/>
                 <w:i w:val="0"/>
                 <w:sz w:val="20"/>
+              </w:rPr>
+              <w:t xml:space="preserve">Produksi menggunakan sistem satu paket: setiap penjahit mengerjakan satu songkok secara utuh, kemudian hasilnya diserahkan ke bagian packaging (Gambar 4.2). </w:t>
+            </w:r>
+            <w:r>
+              <w:rPr>
+                <w:b w:val="0"/>
+                <w:i w:val="0"/>
+                <w:sz w:val="20"/>
                 <w:highlight w:val="yellow"/>
               </w:rPr>
-              <w:t>[tahapan, jumlah pengrajin per tahapan, waktu proses]</w:t>
+              <w:t>[waktu pengerjaan per songkok/per kodi]</w:t>
             </w:r>
           </w:p>
         </w:tc>
@@ -1706,7 +1705,7 @@
                 <w:i w:val="0"/>
                 <w:sz w:val="20"/>
               </w:rPr>
-              <w:t>Pencatatan persediaan</w:t>
+              <w:t>Tenaga kerja</w:t>
             </w:r>
           </w:p>
         </w:tc>
@@ -1724,9 +1723,17 @@
                 <w:b w:val="0"/>
                 <w:i w:val="0"/>
                 <w:sz w:val="20"/>
+              </w:rPr>
+              <w:t xml:space="preserve">Selain 17 tenaga kerja tetap, terdapat banyak tenaga kerja borongan yang terlibat dalam produksi. </w:t>
+            </w:r>
+            <w:r>
+              <w:rPr>
+                <w:b w:val="0"/>
+                <w:i w:val="0"/>
+                <w:sz w:val="20"/>
                 <w:highlight w:val="yellow"/>
               </w:rPr>
-              <w:t>[cara pencatatan stok barang jadi dan bahan baku]</w:t>
+              <w:t>[jumlah, bagian yang dikerjakan, lokasi kerja]</w:t>
             </w:r>
           </w:p>
         </w:tc>
@@ -1766,7 +1773,7 @@
                 <w:i w:val="0"/>
                 <w:sz w:val="20"/>
               </w:rPr>
-              <w:t>Pemenuhan pesanan</w:t>
+              <w:t>Pencatatan persediaan</w:t>
             </w:r>
           </w:p>
         </w:tc>
@@ -1786,7 +1793,7 @@
                 <w:sz w:val="20"/>
                 <w:highlight w:val="yellow"/>
               </w:rPr>
-              <w:t>[alur pesanan masuk hingga pengiriman]</w:t>
+              <w:t>[cara pencatatan stok barang jadi dan bahan baku]</w:t>
             </w:r>
           </w:p>
         </w:tc>
@@ -1808,6 +1815,66 @@
                 <w:sz w:val="20"/>
               </w:rPr>
               <w:t>4</w:t>
+            </w:r>
+          </w:p>
+        </w:tc>
+        <w:tc>
+          <w:tcPr>
+            <w:tcW w:type="dxa" w:w="2551"/>
+          </w:tcPr>
+          <w:p>
+            <w:pPr>
+              <w:spacing w:after="0"/>
+            </w:pPr>
+            <w:r/>
+            <w:r>
+              <w:rPr>
+                <w:b w:val="0"/>
+                <w:i w:val="0"/>
+                <w:sz w:val="20"/>
+              </w:rPr>
+              <w:t>Pemenuhan pesanan</w:t>
+            </w:r>
+          </w:p>
+        </w:tc>
+        <w:tc>
+          <w:tcPr>
+            <w:tcW w:type="dxa" w:w="5102"/>
+          </w:tcPr>
+          <w:p>
+            <w:pPr>
+              <w:spacing w:after="0"/>
+            </w:pPr>
+            <w:r/>
+            <w:r>
+              <w:rPr>
+                <w:b w:val="0"/>
+                <w:i w:val="0"/>
+                <w:sz w:val="20"/>
+                <w:highlight w:val="yellow"/>
+              </w:rPr>
+              <w:t>[alur pesanan masuk hingga pengiriman]</w:t>
+            </w:r>
+          </w:p>
+        </w:tc>
+      </w:tr>
+      <w:tr>
+        <w:tc>
+          <w:tcPr>
+            <w:tcW w:type="dxa" w:w="567"/>
+          </w:tcPr>
+          <w:p>
+            <w:pPr>
+              <w:spacing w:after="0"/>
+            </w:pPr>
+            <w:r/>
+            <w:r>
+              <w:rPr>
+                <w:b w:val="0"/>
+                <w:i w:val="0"/>
+                <w:sz w:val="20"/>
+              </w:rPr>
+              <w:t>5</w:t>
             </w:r>
           </w:p>
         </w:tc>
@@ -25734,7 +25801,7 @@
                 <w:i w:val="0"/>
                 <w:sz w:val="20"/>
               </w:rPr>
-              <w:t xml:space="preserve">17 orang / </w:t>
+              <w:t xml:space="preserve">17 orang / banyak </w:t>
             </w:r>
             <w:r>
               <w:rPr>
@@ -25743,7 +25810,7 @@
                 <w:sz w:val="20"/>
                 <w:highlight w:val="yellow"/>
               </w:rPr>
-              <w:t>[… orang pada musim puncak]</w:t>
+              <w:t>[… orang pada musim puncak; … orang di luar musim puncak]</w:t>
             </w:r>
           </w:p>
         </w:tc>
@@ -25762,7 +25829,7 @@
                 <w:i w:val="0"/>
                 <w:sz w:val="20"/>
               </w:rPr>
-              <w:t>Gambar 4.1; wawancara pemilik</w:t>
+              <w:t>Gambar 4.1; observasi; wawancara pemilik</w:t>
             </w:r>
           </w:p>
         </w:tc>

</xml_diff>

<commit_message>
Bab IV songkok: describe home-based piece-rate workers and add their path to the process flow
Co-Authored-By: Claude Opus 5.5 <noreply@anthropic.com>
Claude-Session: https://claude.ai/code/session_01Lq2itNFduhRUYgLXz2GTxG
</commit_message>
<xml_diff>
--- a/skripsi/BAB-IV-Pengumpulan-Data-Songkok.docx
+++ b/skripsi/BAB-IV-Pengumpulan-Data-Songkok.docx
@@ -245,7 +245,7 @@
           <w:b w:val="0"/>
           <w:i w:val="0"/>
         </w:rPr>
-        <w:t xml:space="preserve">Berdasarkan Gambar 4.1, pemilik berada pada posisi tertinggi dan membawahi bagian produksi yang dipimpin oleh seorang kepala produksi. Bagian produksi membawahi tiga bagian, yaitu bagian gudang/persediaan (2 orang), bagian penjahitan (10 orang), dan bagian packaging (4 orang), sehingga jumlah tenaga kerja tetap di luar pemilik adalah 17 orang. Di luar tenaga kerja tetap tersebut, hasil observasi menunjukkan bahwa perusahaan mempekerjakan tenaga kerja borongan dalam jumlah banyak, yaitu pekerja yang dibayar berdasarkan jumlah hasil kerja </w:t>
+        <w:t xml:space="preserve">Berdasarkan Gambar 4.1, pemilik berada pada posisi tertinggi dan membawahi bagian produksi yang dipimpin oleh seorang kepala produksi. Bagian produksi membawahi tiga bagian, yaitu bagian gudang/persediaan (2 orang), bagian penjahitan (10 orang), dan bagian packaging (4 orang), sehingga jumlah tenaga kerja tetap di luar pemilik adalah 17 orang. Di luar tenaga kerja tetap tersebut, hasil observasi menunjukkan bahwa perusahaan mempekerjakan tenaga kerja borongan dalam jumlah banyak, yaitu pekerja yang bekerja di rumah masing-masing dan dibayar setelah mencapai target hasil kerja </w:t>
       </w:r>
       <w:r>
         <w:rPr>
@@ -253,14 +253,14 @@
           <w:i w:val="0"/>
           <w:highlight w:val="yellow"/>
         </w:rPr>
-        <w:t>[jumlah tenaga borongan pada musim puncak dan di luar musim puncak 2025; sistem upah, misalnya per kodi; dikerjakan di tempat perusahaan atau di rumah]</w:t>
+        <w:t>[jumlah tenaga borongan pada musim puncak dan di luar musim puncak 2025]</w:t>
       </w:r>
       <w:r>
         <w:rPr>
           <w:b w:val="0"/>
           <w:i w:val="0"/>
         </w:rPr>
-        <w:t>. Tenaga borongan tidak tercantum dalam struktur organisasi karena bukan pekerja tetap. Struktur organisasi yang sederhana dengan pemilik yang terlibat langsung dalam pengambilan keputusan ini merupakan karakteristik umum UMKM (Garengo, Biazzo, &amp; Bititci, 2005).</w:t>
+        <w:t>. Tenaga borongan tidak tercantum dalam struktur organisasi karena bukan pekerja tetap. Sistem kerja tenaga borongan dijelaskan pada subbab 4.1.3. Struktur organisasi yang sederhana dengan pemilik yang terlibat langsung dalam pengambilan keputusan ini merupakan karakteristik umum UMKM (Garengo, Biazzo, &amp; Bititci, 2005).</w:t>
       </w:r>
     </w:p>
     <w:p>
@@ -314,13 +314,71 @@
     </w:p>
     <w:p>
       <w:pPr>
+        <w:spacing w:line="360" w:lineRule="auto" w:after="120"/>
+        <w:ind w:firstLine="709"/>
+        <w:jc w:val="both"/>
+      </w:pPr>
+      <w:r>
+        <w:rPr>
+          <w:b w:val="0"/>
+          <w:i w:val="0"/>
+        </w:rPr>
+        <w:t xml:space="preserve">Selain penjahit tetap, produksi juga dikerjakan oleh tenaga kerja borongan dengan sistem kerja di rumah. Tenaga borongan datang ke perusahaan untuk mengambil bahan baku, kemudian mengerjakan songkok di rumah masing-masing. Setiap tenaga borongan memiliki target jumlah songkok yang harus diselesaikan, dan upah baru dibayarkan setelah hasil kerja disetorkan dan target tersebut tercapai </w:t>
+      </w:r>
+      <w:r>
+        <w:rPr>
+          <w:b w:val="0"/>
+          <w:i w:val="0"/>
+          <w:highlight w:val="yellow"/>
+        </w:rPr>
+        <w:t>[target per orang, misalnya … kodi per minggu; besaran upah per kodi; apakah tenaga borongan juga mengerjakan songkok secara satu paket]</w:t>
+      </w:r>
+      <w:r>
+        <w:rPr>
+          <w:b w:val="0"/>
+          <w:i w:val="0"/>
+        </w:rPr>
+        <w:t xml:space="preserve">. Sistem ini termasuk kategori kerja rumahan (home work), yaitu pekerjaan yang dilakukan seseorang di rumahnya atas pesanan pemberi kerja untuk menghasilkan produk sesuai spesifikasi pemberi kerja dengan imbalan upah, siapa pun yang menyediakan bahan bakunya (International Labour Organization </w:t>
+      </w:r>
+      <w:r>
+        <w:rPr>
+          <w:b w:val="0"/>
+          <w:i w:val="0"/>
+          <w:highlight w:val="yellow"/>
+        </w:rPr>
+        <w:t>[ILO]</w:t>
+      </w:r>
+      <w:r>
+        <w:rPr>
+          <w:b w:val="0"/>
+          <w:i w:val="0"/>
+        </w:rPr>
+        <w:t>, 1996).</w:t>
+      </w:r>
+    </w:p>
+    <w:p>
+      <w:pPr>
+        <w:spacing w:line="360" w:lineRule="auto" w:after="120"/>
+        <w:ind w:firstLine="709"/>
+        <w:jc w:val="both"/>
+      </w:pPr>
+      <w:r>
+        <w:rPr>
+          <w:b w:val="0"/>
+          <w:i w:val="0"/>
+        </w:rPr>
+        <w:t>Sistem kerja rumahan memungkinkan perusahaan menambah kapasitas produksi tanpa menambah pekerja tetap maupun ruang produksi, terutama pada musim puncak. Namun, karena pekerjaan dilakukan di luar pengawasan langsung perusahaan, mutu songkok hanya dapat dikendalikan pada saat hasil kerja disetorkan, dan waktu penyelesaian bergantung pada masing-masing pekerja. Oleh karena itu, pemeriksaan jumlah dan kualitas hasil setoran menjadi titik kendali penting dalam proses produksi (Gambar 4.2). Kondisi ini berkaitan langsung dengan KPI fleksibilitas kapasitas musim puncak (A3), produktivitas tenaga kerja (H3), transfer pengetahuan pengrajin (H4), serta KPI kualitas (Q1–Q3).</w:t>
+      </w:r>
+    </w:p>
+    <w:p>
+      <w:pPr>
         <w:spacing w:after="40"/>
         <w:jc w:val="center"/>
       </w:pPr>
       <w:r>
         <w:drawing>
           <wp:inline xmlns:a="http://schemas.openxmlformats.org/drawingml/2006/main" xmlns:pic="http://schemas.openxmlformats.org/drawingml/2006/picture">
-            <wp:extent cx="4500000" cy="4571053"/>
+            <wp:extent cx="4500000" cy="3547059"/>
             <wp:docPr id="2" name="Picture 2"/>
             <wp:cNvGraphicFramePr>
               <a:graphicFrameLocks noChangeAspect="1"/>
@@ -341,7 +399,7 @@
                   <pic:spPr>
                     <a:xfrm>
                       <a:off x="0" y="0"/>
-                      <a:ext cx="4500000" cy="4571053"/>
+                      <a:ext cx="4500000" cy="3547059"/>
                     </a:xfrm>
                     <a:prstGeom prst="rect"/>
                   </pic:spPr>
@@ -1454,7 +1512,7 @@
                 <w:i w:val="0"/>
                 <w:sz w:val="20"/>
               </w:rPr>
-              <w:t>Perusahaan mempekerjakan tenaga borongan dalam jumlah banyak di luar 17 tenaga kerja tetap, sehingga kapasitas produksi, terutama pada musim puncak, bergantung pada ketersediaan tenaga borongan.</w:t>
+              <w:t>Perusahaan mempekerjakan tenaga borongan dalam jumlah banyak di luar 17 tenaga kerja tetap, dengan sistem kerja di rumah dan upah berbasis target, sehingga kapasitas produksi, terutama pada musim puncak, bergantung pada ketersediaan dan kedisiplinan tenaga borongan.</w:t>
             </w:r>
           </w:p>
         </w:tc>
@@ -1724,7 +1782,7 @@
                 <w:i w:val="0"/>
                 <w:sz w:val="20"/>
               </w:rPr>
-              <w:t xml:space="preserve">Selain 17 tenaga kerja tetap, terdapat banyak tenaga kerja borongan yang terlibat dalam produksi. </w:t>
+              <w:t xml:space="preserve">Selain 17 tenaga kerja tetap, terdapat banyak tenaga kerja borongan. Tenaga borongan mengambil bahan baku di perusahaan, mengerjakan songkok di rumah masing-masing, lalu menyetorkan hasilnya; upah dibayar setelah target tercapai. </w:t>
             </w:r>
             <w:r>
               <w:rPr>
@@ -1733,7 +1791,7 @@
                 <w:sz w:val="20"/>
                 <w:highlight w:val="yellow"/>
               </w:rPr>
-              <w:t>[jumlah, bagian yang dikerjakan, lokasi kerja]</w:t>
+              <w:t>[jumlah tenaga borongan; target per orang]</w:t>
             </w:r>
           </w:p>
         </w:tc>
@@ -25834,6 +25892,66 @@
           </w:p>
         </w:tc>
       </w:tr>
+      <w:tr>
+        <w:tc>
+          <w:tcPr>
+            <w:tcW w:type="dxa" w:w="3118"/>
+          </w:tcPr>
+          <w:p>
+            <w:pPr>
+              <w:spacing w:after="0"/>
+            </w:pPr>
+            <w:r/>
+            <w:r>
+              <w:rPr>
+                <w:b w:val="0"/>
+                <w:i w:val="0"/>
+                <w:sz w:val="20"/>
+              </w:rPr>
+              <w:t>Target dan upah tenaga borongan</w:t>
+            </w:r>
+          </w:p>
+        </w:tc>
+        <w:tc>
+          <w:tcPr>
+            <w:tcW w:type="dxa" w:w="2835"/>
+          </w:tcPr>
+          <w:p>
+            <w:pPr>
+              <w:spacing w:after="0"/>
+            </w:pPr>
+            <w:r/>
+            <w:r>
+              <w:rPr>
+                <w:b w:val="0"/>
+                <w:i w:val="0"/>
+                <w:sz w:val="20"/>
+                <w:highlight w:val="yellow"/>
+              </w:rPr>
+              <w:t>[… kodi per orang per periode; Rp… per kodi]</w:t>
+            </w:r>
+          </w:p>
+        </w:tc>
+        <w:tc>
+          <w:tcPr>
+            <w:tcW w:type="dxa" w:w="2268"/>
+          </w:tcPr>
+          <w:p>
+            <w:pPr>
+              <w:spacing w:after="0"/>
+            </w:pPr>
+            <w:r/>
+            <w:r>
+              <w:rPr>
+                <w:b w:val="0"/>
+                <w:i w:val="0"/>
+                <w:sz w:val="20"/>
+              </w:rPr>
+              <w:t>Wawancara pemilik</w:t>
+            </w:r>
+          </w:p>
+        </w:tc>
+      </w:tr>
     </w:tbl>
     <w:p>
       <w:pPr>
@@ -26618,6 +26736,34 @@
           <w:i w:val="0"/>
         </w:rPr>
         <w:t xml:space="preserve"> (3rd ed.). OTexts.</w:t>
+      </w:r>
+    </w:p>
+    <w:p>
+      <w:pPr>
+        <w:spacing w:line="360" w:lineRule="auto" w:after="120"/>
+        <w:ind w:left="709" w:hanging="709"/>
+        <w:jc w:val="left"/>
+      </w:pPr>
+      <w:r>
+        <w:rPr>
+          <w:b w:val="0"/>
+          <w:i w:val="0"/>
+        </w:rPr>
+        <w:t xml:space="preserve">International Labour Organization. (1996). </w:t>
+      </w:r>
+      <w:r>
+        <w:rPr>
+          <w:b w:val="0"/>
+          <w:i/>
+        </w:rPr>
+        <w:t>Home Work Convention, 1996 (No. 177)</w:t>
+      </w:r>
+      <w:r>
+        <w:rPr>
+          <w:b w:val="0"/>
+          <w:i w:val="0"/>
+        </w:rPr>
+        <w:t>. International Labour Organization.</w:t>
       </w:r>
     </w:p>
     <w:p>

</xml_diff>

<commit_message>
Bab IV songkok: owner inspection with rework loop, per-kodi work packages
Co-Authored-By: Claude Opus 5.5 <noreply@anthropic.com>
Claude-Session: https://claude.ai/code/session_01Lq2itNFduhRUYgLXz2GTxG
</commit_message>
<xml_diff>
--- a/skripsi/BAB-IV-Pengumpulan-Data-Songkok.docx
+++ b/skripsi/BAB-IV-Pengumpulan-Data-Songkok.docx
@@ -287,7 +287,7 @@
           <w:b w:val="0"/>
           <w:i w:val="0"/>
         </w:rPr>
-        <w:t xml:space="preserve">Proses produksi songkok di CV Putra Pondok Indah menggunakan sistem satu paket, yaitu setiap penjahit mengerjakan songkok secara utuh mulai dari pemotongan pola kain beludru, penjahitan badan dan tutup songkok, pemasangan bos-bosan (lapisan dalam), hingga pemasangan label atau motif bordir. Pekerjaan tidak dibagi per tahapan kepada pekerja yang berbeda seperti pada lini perakitan. Songkok yang telah selesai diserahkan kepada bagian packaging untuk diperiksa, dirapikan (finishing), dan dikemas per kodi, kemudian disimpan di gudang sebelum dikirim kepada reseller. </w:t>
+        <w:t xml:space="preserve">Proses produksi songkok di CV Putra Pondok Indah menggunakan sistem kerja per paket. Satu paket berisi bahan untuk 1 kodi (20 pcs) songkok, dan setiap pekerja mengerjakan paketnya secara utuh, mulai dari pemotongan pola kain beludru, penjahitan badan dan tutup songkok, pemasangan bos-bosan (lapisan dalam), hingga pemasangan label atau motif bordir. Pekerjaan tidak dibagi per tahapan kepada pekerja yang berbeda seperti pada lini perakitan. </w:t>
       </w:r>
       <w:r>
         <w:rPr>
@@ -295,7 +295,7 @@
           <w:i w:val="0"/>
           <w:highlight w:val="yellow"/>
         </w:rPr>
-        <w:t>[Konfirmasi: apakah pemotongan pola juga dilakukan oleh penjahit, dan apakah pemeriksaan kualitas dilakukan di bagian packaging.]</w:t>
+        <w:t>[Konfirmasi: apakah pemotongan pola juga dilakukan oleh penjahit.]</w:t>
       </w:r>
     </w:p>
     <w:p>
@@ -309,21 +309,7 @@
           <w:b w:val="0"/>
           <w:i w:val="0"/>
         </w:rPr>
-        <w:t>Sistem satu paket tersebut merupakan ciri produksi kerajinan (craft production), yaitu produksi yang mengandalkan pekerja terampil yang menguasai seluruh proses pembuatan produk dengan peralatan sederhana (Womack, Jones, &amp; Roos, 1990). Konsekuensinya, kapasitas produksi sangat bergantung pada jumlah dan keterampilan penjahit, sedangkan kualitas setiap songkok bergantung pada keahlian penjahit yang membuatnya. Kondisi ini menjadi dasar dimasukkannya dimensi Craft Workforce Capability dan indikator konsistensi kualitas dalam arsitektur KPI. Bahan baku utama terdiri atas kain beludru (yard), bos-bosan (kodi), dan label (lusin). Diagram alir proses produksi disajikan pada Gambar 4.2.</w:t>
-      </w:r>
-    </w:p>
-    <w:p>
-      <w:pPr>
-        <w:spacing w:line="360" w:lineRule="auto" w:after="120"/>
-        <w:ind w:firstLine="709"/>
-        <w:jc w:val="both"/>
-      </w:pPr>
-      <w:r>
-        <w:rPr>
-          <w:b w:val="0"/>
-          <w:i w:val="0"/>
-        </w:rPr>
-        <w:t xml:space="preserve">Selain penjahit tetap, produksi juga dikerjakan oleh tenaga kerja borongan dengan sistem kerja di rumah. Tenaga borongan datang ke perusahaan untuk mengambil bahan baku, kemudian mengerjakan songkok di rumah masing-masing. Setiap tenaga borongan memiliki target jumlah songkok yang harus diselesaikan, dan upah baru dibayarkan setelah hasil kerja disetorkan dan target tersebut tercapai </w:t>
+        <w:t xml:space="preserve">Pekerjaan tersebut dilakukan oleh dua kelompok pekerja. Kelompok pertama adalah penjahit tetap yang bekerja di perusahaan. Kelompok kedua adalah tenaga kerja borongan yang datang ke perusahaan untuk mengambil paket bahan baku, kemudian mengerjakannya di rumah masing-masing. Setiap tenaga borongan memiliki target jumlah paket yang harus diselesaikan, dan upah baru dibayarkan setelah target tersebut tercapai </w:t>
       </w:r>
       <w:r>
         <w:rPr>
@@ -331,7 +317,7 @@
           <w:i w:val="0"/>
           <w:highlight w:val="yellow"/>
         </w:rPr>
-        <w:t>[target per orang, misalnya … kodi per minggu; besaran upah per kodi; apakah tenaga borongan juga mengerjakan songkok secara satu paket]</w:t>
+        <w:t>[target per orang, misalnya … kodi per minggu; besaran upah per kodi]</w:t>
       </w:r>
       <w:r>
         <w:rPr>
@@ -367,7 +353,36 @@
           <w:b w:val="0"/>
           <w:i w:val="0"/>
         </w:rPr>
-        <w:t>Sistem kerja rumahan memungkinkan perusahaan menambah kapasitas produksi tanpa menambah pekerja tetap maupun ruang produksi, terutama pada musim puncak. Namun, karena pekerjaan dilakukan di luar pengawasan langsung perusahaan, mutu songkok hanya dapat dikendalikan pada saat hasil kerja disetorkan, dan waktu penyelesaian bergantung pada masing-masing pekerja. Oleh karena itu, pemeriksaan jumlah dan kualitas hasil setoran menjadi titik kendali penting dalam proses produksi (Gambar 4.2). Kondisi ini berkaitan langsung dengan KPI fleksibilitas kapasitas musim puncak (A3), produktivitas tenaga kerja (H3), transfer pengetahuan pengrajin (H4), serta KPI kualitas (Q1–Q3).</w:t>
+        <w:t xml:space="preserve">Setelah paket selesai, hasil jahitan disetorkan dan diperiksa langsung oleh pemilik untuk memastikan jahitannya rapi. Paket yang jahitannya tidak rapi dikembalikan kepada pekerja untuk dibongkar dan dijahit ulang, kemudian diperiksa kembali. Paket yang jahitannya rapi langsung dikirim ke bagian gudang untuk disimpan, kemudian dikemas per kodi oleh bagian packaging sebelum dikirim kepada reseller </w:t>
+      </w:r>
+      <w:r>
+        <w:rPr>
+          <w:b w:val="0"/>
+          <w:i w:val="0"/>
+          <w:highlight w:val="yellow"/>
+        </w:rPr>
+        <w:t>[konfirmasi urutan gudang dan packaging]</w:t>
+      </w:r>
+      <w:r>
+        <w:rPr>
+          <w:b w:val="0"/>
+          <w:i w:val="0"/>
+        </w:rPr>
+        <w:t>. Bahan baku utama terdiri atas kain beludru (yard), bos-bosan (kodi), dan label (lusin). Diagram alir proses produksi disajikan pada Gambar 4.2.</w:t>
+      </w:r>
+    </w:p>
+    <w:p>
+      <w:pPr>
+        <w:spacing w:line="360" w:lineRule="auto" w:after="120"/>
+        <w:ind w:firstLine="709"/>
+        <w:jc w:val="both"/>
+      </w:pPr>
+      <w:r>
+        <w:rPr>
+          <w:b w:val="0"/>
+          <w:i w:val="0"/>
+        </w:rPr>
+        <w:t>Sistem kerja per paket oleh pekerja terampil merupakan ciri produksi kerajinan (craft production), yaitu produksi yang mengandalkan pekerja terampil yang menguasai seluruh proses pembuatan produk dengan peralatan sederhana (Womack, Jones, &amp; Roos, 1990). Konsekuensinya, kapasitas produksi bergantung pada jumlah dan keterampilan penjahit, termasuk tenaga borongan, sedangkan kualitas setiap songkok bergantung pada keahlian pekerja yang membuatnya. Karena sebagian pekerjaan dilakukan di rumah tenaga borongan, mutu songkok baru dapat dikendalikan pada saat pemeriksaan oleh pemilik, dan setiap jahitan yang tidak rapi menambah waktu dan tenaga untuk pengerjaan ulang. Pemeriksaan yang dilakukan sendiri oleh pemilik juga menunjukkan pengambilan keputusan yang berpusat pada pemilik, yang merupakan karakteristik UMKM (Garengo et al., 2005). Kondisi tersebut menjadi dasar dimasukkannya dimensi Craft Workforce Capability (H1–H4), fleksibilitas kapasitas musim puncak (A3), dan KPI kualitas (Q1–Q3) dalam arsitektur KPI.</w:t>
       </w:r>
     </w:p>
     <w:p>
@@ -378,7 +393,7 @@
       <w:r>
         <w:drawing>
           <wp:inline xmlns:a="http://schemas.openxmlformats.org/drawingml/2006/main" xmlns:pic="http://schemas.openxmlformats.org/drawingml/2006/picture">
-            <wp:extent cx="4500000" cy="3547059"/>
+            <wp:extent cx="4500000" cy="3888000"/>
             <wp:docPr id="2" name="Picture 2"/>
             <wp:cNvGraphicFramePr>
               <a:graphicFrameLocks noChangeAspect="1"/>
@@ -399,7 +414,7 @@
                   <pic:spPr>
                     <a:xfrm>
                       <a:off x="0" y="0"/>
-                      <a:ext cx="4500000" cy="3547059"/>
+                      <a:ext cx="4500000" cy="3888000"/>
                     </a:xfrm>
                     <a:prstGeom prst="rect"/>
                   </pic:spPr>
@@ -1969,9 +1984,17 @@
                 <w:b w:val="0"/>
                 <w:i w:val="0"/>
                 <w:sz w:val="20"/>
+              </w:rPr>
+              <w:t xml:space="preserve">Setiap paket (1 kodi) yang selesai diperiksa langsung oleh pemilik. Jahitan yang tidak rapi dibongkar dan dijahit ulang oleh pekerja; yang rapi langsung dikirim ke gudang. </w:t>
+            </w:r>
+            <w:r>
+              <w:rPr>
+                <w:b w:val="0"/>
+                <w:i w:val="0"/>
+                <w:sz w:val="20"/>
                 <w:highlight w:val="yellow"/>
               </w:rPr>
-              <w:t>[inspeksi produk dan jenis cacat yang ditemukan]</w:t>
+              <w:t>[jumlah paket yang dijahit ulang per bulan, jika dicatat]</w:t>
             </w:r>
           </w:p>
         </w:tc>

</xml_diff>

<commit_message>
Bab IV songkok: piece-rate workers are year-round, not seasonal
Co-Authored-By: Claude Opus 5.5 <noreply@anthropic.com>
Claude-Session: https://claude.ai/code/session_01Lq2itNFduhRUYgLXz2GTxG
</commit_message>
<xml_diff>
--- a/skripsi/BAB-IV-Pengumpulan-Data-Songkok.docx
+++ b/skripsi/BAB-IV-Pengumpulan-Data-Songkok.docx
@@ -253,14 +253,14 @@
           <w:i w:val="0"/>
           <w:highlight w:val="yellow"/>
         </w:rPr>
-        <w:t>[jumlah tenaga borongan pada musim puncak dan di luar musim puncak 2025]</w:t>
+        <w:t>[jumlah tenaga borongan pada tahun 2025]</w:t>
       </w:r>
       <w:r>
         <w:rPr>
           <w:b w:val="0"/>
           <w:i w:val="0"/>
         </w:rPr>
-        <w:t>. Tenaga borongan tidak tercantum dalam struktur organisasi karena bukan pekerja tetap. Sistem kerja tenaga borongan dijelaskan pada subbab 4.1.3. Struktur organisasi yang sederhana dengan pemilik yang terlibat langsung dalam pengambilan keputusan ini merupakan karakteristik umum UMKM (Garengo, Biazzo, &amp; Bititci, 2005).</w:t>
+        <w:t>. Tenaga borongan tersebut bukan pekerja musiman: orangnya tetap sama dan bekerja sepanjang tahun. Perbedaannya dengan tenaga kerja tetap terletak pada tempat kerja dan sistem upahnya, sehingga tenaga borongan tidak tercantum dalam struktur organisasi. Dalam tesis ini, istilah tenaga kerja tetap merujuk pada pekerja yang bekerja di lokasi perusahaan sebagaimana tercantum pada Gambar 4.1. Sistem kerja tenaga borongan dijelaskan pada subbab 4.1.3. Struktur organisasi yang sederhana dengan pemilik yang terlibat langsung dalam pengambilan keputusan ini merupakan karakteristik umum UMKM (Garengo, Biazzo, &amp; Bititci, 2005).</w:t>
       </w:r>
     </w:p>
     <w:p>
@@ -309,7 +309,7 @@
           <w:b w:val="0"/>
           <w:i w:val="0"/>
         </w:rPr>
-        <w:t xml:space="preserve">Pekerjaan tersebut dilakukan oleh dua kelompok pekerja. Kelompok pertama adalah penjahit tetap yang bekerja di perusahaan. Kelompok kedua adalah tenaga kerja borongan yang datang ke perusahaan untuk mengambil paket bahan baku, kemudian mengerjakannya di rumah masing-masing. Setiap tenaga borongan memiliki target jumlah paket yang harus diselesaikan, dan upah baru dibayarkan setelah target tersebut tercapai </w:t>
+        <w:t xml:space="preserve">Pekerjaan tersebut dilakukan oleh dua kelompok pekerja. Kelompok pertama adalah penjahit tetap yang bekerja di perusahaan. Kelompok kedua adalah tenaga kerja borongan yang datang ke perusahaan untuk mengambil paket bahan baku, kemudian mengerjakannya di rumah masing-masing. Tenaga borongan bekerja sepanjang tahun dan terdiri atas orang-orang yang sama, bukan pekerja yang hanya didatangkan pada musim tertentu. Setiap tenaga borongan memiliki target jumlah paket yang harus diselesaikan, dan upah baru dibayarkan setelah target tersebut tercapai </w:t>
       </w:r>
       <w:r>
         <w:rPr>
@@ -317,7 +317,7 @@
           <w:i w:val="0"/>
           <w:highlight w:val="yellow"/>
         </w:rPr>
-        <w:t>[target per orang, misalnya … kodi per minggu; besaran upah per kodi]</w:t>
+        <w:t>[target per orang, misalnya … kodi per minggu; besaran upah per kodi; pada musim puncak, apakah kapasitas ditambah dengan menaikkan target per orang atau dengan cara lain]</w:t>
       </w:r>
       <w:r>
         <w:rPr>
@@ -1527,7 +1527,7 @@
                 <w:i w:val="0"/>
                 <w:sz w:val="20"/>
               </w:rPr>
-              <w:t>Perusahaan mempekerjakan tenaga borongan dalam jumlah banyak di luar 17 tenaga kerja tetap, dengan sistem kerja di rumah dan upah berbasis target, sehingga kapasitas produksi, terutama pada musim puncak, bergantung pada ketersediaan dan kedisiplinan tenaga borongan.</w:t>
+              <w:t>Perusahaan mempekerjakan tenaga borongan dalam jumlah banyak di luar 17 tenaga kerja tetap, dengan sistem kerja di rumah dan upah berbasis target. Tenaga borongan bekerja sepanjang tahun (bukan pekerja musiman), sehingga kapasitas produksi, termasuk pada musim puncak, bergantung pada jumlah, target, dan kedisiplinan tenaga borongan.</w:t>
             </w:r>
           </w:p>
         </w:tc>
@@ -25882,7 +25882,7 @@
                 <w:i w:val="0"/>
                 <w:sz w:val="20"/>
               </w:rPr>
-              <w:t xml:space="preserve">17 orang / banyak </w:t>
+              <w:t xml:space="preserve">17 orang / banyak, orang yang sama sepanjang tahun </w:t>
             </w:r>
             <w:r>
               <w:rPr>
@@ -25891,7 +25891,7 @@
                 <w:sz w:val="20"/>
                 <w:highlight w:val="yellow"/>
               </w:rPr>
-              <w:t>[… orang pada musim puncak; … orang di luar musim puncak]</w:t>
+              <w:t>[… orang]</w:t>
             </w:r>
           </w:p>
         </w:tc>

</xml_diff>

<commit_message>
Bab IV songkok: 25 piece-rate workers, 42 workers in total
Co-Authored-By: Claude Opus 5.5 <noreply@anthropic.com>
Claude-Session: https://claude.ai/code/session_01Lq2itNFduhRUYgLXz2GTxG
</commit_message>
<xml_diff>
--- a/skripsi/BAB-IV-Pengumpulan-Data-Songkok.docx
+++ b/skripsi/BAB-IV-Pengumpulan-Data-Songkok.docx
@@ -245,22 +245,7 @@
           <w:b w:val="0"/>
           <w:i w:val="0"/>
         </w:rPr>
-        <w:t xml:space="preserve">Berdasarkan Gambar 4.1, pemilik berada pada posisi tertinggi dan membawahi bagian produksi yang dipimpin oleh seorang kepala produksi. Bagian produksi membawahi tiga bagian, yaitu bagian gudang/persediaan (2 orang), bagian penjahitan (10 orang), dan bagian packaging (4 orang), sehingga jumlah tenaga kerja tetap di luar pemilik adalah 17 orang. Di luar tenaga kerja tetap tersebut, hasil observasi menunjukkan bahwa perusahaan mempekerjakan tenaga kerja borongan dalam jumlah banyak, yaitu pekerja yang bekerja di rumah masing-masing dan dibayar setelah mencapai target hasil kerja </w:t>
-      </w:r>
-      <w:r>
-        <w:rPr>
-          <w:b w:val="0"/>
-          <w:i w:val="0"/>
-          <w:highlight w:val="yellow"/>
-        </w:rPr>
-        <w:t>[jumlah tenaga borongan pada tahun 2025]</w:t>
-      </w:r>
-      <w:r>
-        <w:rPr>
-          <w:b w:val="0"/>
-          <w:i w:val="0"/>
-        </w:rPr>
-        <w:t>. Tenaga borongan tersebut bukan pekerja musiman: orangnya tetap sama dan bekerja sepanjang tahun. Perbedaannya dengan tenaga kerja tetap terletak pada tempat kerja dan sistem upahnya, sehingga tenaga borongan tidak tercantum dalam struktur organisasi. Dalam tesis ini, istilah tenaga kerja tetap merujuk pada pekerja yang bekerja di lokasi perusahaan sebagaimana tercantum pada Gambar 4.1. Sistem kerja tenaga borongan dijelaskan pada subbab 4.1.3. Struktur organisasi yang sederhana dengan pemilik yang terlibat langsung dalam pengambilan keputusan ini merupakan karakteristik umum UMKM (Garengo, Biazzo, &amp; Bititci, 2005).</w:t>
+        <w:t>Berdasarkan Gambar 4.1, pemilik berada pada posisi tertinggi dan membawahi bagian produksi yang dipimpin oleh seorang kepala produksi. Bagian produksi membawahi tiga bagian, yaitu bagian gudang/persediaan (2 orang), bagian penjahitan (10 orang), dan bagian packaging (4 orang), sehingga jumlah tenaga kerja tetap di luar pemilik adalah 17 orang. Di luar tenaga kerja tetap tersebut, perusahaan mempekerjakan 25 orang tenaga kerja borongan, yaitu pekerja yang bekerja di rumah masing-masing dan dibayar setelah mencapai target hasil kerja. Dengan demikian, jumlah seluruh tenaga kerja CV Putra Pondok Indah pada tahun 2025 adalah 42 orang, terdiri atas 17 tenaga kerja tetap yang bekerja di lokasi perusahaan dan 25 tenaga kerja borongan yang bekerja di rumah. Pekerja yang mengerjakan paket songkok berjumlah 35 orang, yaitu 10 penjahit tetap dan 25 tenaga borongan. Tenaga borongan tersebut bukan pekerja musiman: orangnya tetap sama dan bekerja sepanjang tahun. Perbedaannya dengan tenaga kerja tetap terletak pada tempat kerja dan sistem upahnya, sehingga tenaga borongan tidak tercantum dalam struktur organisasi. Dalam tesis ini, istilah tenaga kerja tetap merujuk pada pekerja yang bekerja di lokasi perusahaan sebagaimana tercantum pada Gambar 4.1. Sistem kerja tenaga borongan dijelaskan pada subbab 4.1.3. Struktur organisasi yang sederhana dengan pemilik yang terlibat langsung dalam pengambilan keputusan ini merupakan karakteristik umum UMKM (Garengo, Biazzo, &amp; Bititci, 2005).</w:t>
       </w:r>
     </w:p>
     <w:p>
@@ -1527,7 +1512,7 @@
                 <w:i w:val="0"/>
                 <w:sz w:val="20"/>
               </w:rPr>
-              <w:t>Perusahaan mempekerjakan tenaga borongan dalam jumlah banyak di luar 17 tenaga kerja tetap, dengan sistem kerja di rumah dan upah berbasis target. Tenaga borongan bekerja sepanjang tahun (bukan pekerja musiman), sehingga kapasitas produksi, termasuk pada musim puncak, bergantung pada jumlah, target, dan kedisiplinan tenaga borongan.</w:t>
+              <w:t>Perusahaan mempekerjakan 25 tenaga borongan di samping 17 tenaga kerja tetap (total 42 orang), dengan sistem kerja di rumah dan upah berbasis target. Tenaga borongan bekerja sepanjang tahun (bukan pekerja musiman), sehingga kapasitas produksi, termasuk pada musim puncak, bergantung pada jumlah, target, dan kedisiplinan tenaga borongan.</w:t>
             </w:r>
           </w:p>
         </w:tc>
@@ -1797,7 +1782,7 @@
                 <w:i w:val="0"/>
                 <w:sz w:val="20"/>
               </w:rPr>
-              <w:t xml:space="preserve">Selain 17 tenaga kerja tetap, terdapat banyak tenaga kerja borongan. Tenaga borongan mengambil bahan baku di perusahaan, mengerjakan songkok di rumah masing-masing, lalu menyetorkan hasilnya; upah dibayar setelah target tercapai. </w:t>
+              <w:t xml:space="preserve">Selain 17 tenaga kerja tetap, terdapat 25 tenaga kerja borongan (total 42 orang). Tenaga borongan mengambil bahan baku di perusahaan, mengerjakan songkok di rumah masing-masing, lalu menyetorkan hasilnya; upah dibayar setelah target tercapai. </w:t>
             </w:r>
             <w:r>
               <w:rPr>
@@ -1806,7 +1791,7 @@
                 <w:sz w:val="20"/>
                 <w:highlight w:val="yellow"/>
               </w:rPr>
-              <w:t>[jumlah tenaga borongan; target per orang]</w:t>
+              <w:t>[target per orang]</w:t>
             </w:r>
           </w:p>
         </w:tc>
@@ -25882,16 +25867,7 @@
                 <w:i w:val="0"/>
                 <w:sz w:val="20"/>
               </w:rPr>
-              <w:t xml:space="preserve">17 orang / banyak, orang yang sama sepanjang tahun </w:t>
-            </w:r>
-            <w:r>
-              <w:rPr>
-                <w:b w:val="0"/>
-                <w:i w:val="0"/>
-                <w:sz w:val="20"/>
-                <w:highlight w:val="yellow"/>
-              </w:rPr>
-              <w:t>[… orang]</w:t>
+              <w:t>17 orang / 25 orang (total 42 orang; orang yang sama sepanjang tahun)</w:t>
             </w:r>
           </w:p>
         </w:tc>
@@ -25910,7 +25886,7 @@
                 <w:i w:val="0"/>
                 <w:sz w:val="20"/>
               </w:rPr>
-              <w:t>Gambar 4.1; observasi; wawancara pemilik</w:t>
+              <w:t>Gambar 4.1; observasi; wawancara</w:t>
             </w:r>
           </w:p>
         </w:tc>

</xml_diff>